<commit_message>
define authentication routes and payload schemas
</commit_message>
<xml_diff>
--- a/doc/API Endpoint Plan.docx
+++ b/doc/API Endpoint Plan.docx
@@ -2,6 +2,544 @@
 <file path=word/document.xml><?xml version="1.0" encoding="utf-8"?>
 <w:document xmlns:wpc="http://schemas.microsoft.com/office/word/2010/wordprocessingCanvas" xmlns:cx="http://schemas.microsoft.com/office/drawing/2014/chartex" xmlns:cx1="http://schemas.microsoft.com/office/drawing/2015/9/8/chartex" xmlns:cx2="http://schemas.microsoft.com/office/drawing/2015/10/21/chartex" xmlns:cx3="http://schemas.microsoft.com/office/drawing/2016/5/9/chartex" xmlns:cx4="http://schemas.microsoft.com/office/drawing/2016/5/10/chartex" xmlns:cx5="http://schemas.microsoft.com/office/drawing/2016/5/11/chartex" xmlns:cx6="http://schemas.microsoft.com/office/drawing/2016/5/12/chartex" xmlns:cx7="http://schemas.microsoft.com/office/drawing/2016/5/13/chartex" xmlns:cx8="http://schemas.microsoft.com/office/drawing/2016/5/14/chartex" xmlns:mc="http://schemas.openxmlformats.org/markup-compatibility/2006" xmlns:aink="http://schemas.microsoft.com/office/drawing/2016/ink" xmlns:am3d="http://schemas.microsoft.com/office/drawing/2017/model3d" xmlns:o="urn:schemas-microsoft-com:office:office" xmlns:oel="http://schemas.microsoft.com/office/2019/extlst" xmlns:r="http://schemas.openxmlformats.org/officeDocument/2006/relationships" xmlns:m="http://schemas.openxmlformats.org/officeDocument/2006/math" xmlns:v="urn:schemas-microsoft-com:vml" xmlns:wp14="http://schemas.microsoft.com/office/word/2010/wordprocessingDrawing" xmlns:wp="http://schemas.openxmlformats.org/drawingml/2006/wordprocessingDrawing" xmlns:w10="urn:schemas-microsoft-com:office:word" xmlns:w="http://schemas.openxmlformats.org/wordprocessingml/2006/main" xmlns:w14="http://schemas.microsoft.com/office/word/2010/wordml" xmlns:w15="http://schemas.microsoft.com/office/word/2012/wordml" xmlns:w16cex="http://schemas.microsoft.com/office/word/2018/wordml/cex" xmlns:w16cid="http://schemas.microsoft.com/office/word/2016/wordml/cid" xmlns:w16="http://schemas.microsoft.com/office/word/2018/wordml" xmlns:w16du="http://schemas.microsoft.com/office/word/2023/wordml/word16du" xmlns:w16sdtdh="http://schemas.microsoft.com/office/word/2020/wordml/sdtdatahash" xmlns:w16sdtfl="http://schemas.microsoft.com/office/word/2024/wordml/sdtformatlock" xmlns:w16se="http://schemas.microsoft.com/office/word/2015/wordml/symex" xmlns:wpg="http://schemas.microsoft.com/office/word/2010/wordprocessingGroup" xmlns:wpi="http://schemas.microsoft.com/office/word/2010/wordprocessingInk" xmlns:wne="http://schemas.microsoft.com/office/word/2006/wordml" xmlns:wps="http://schemas.microsoft.com/office/word/2010/wordprocessingShape" mc:Ignorable="w14 w15 w16se w16cid w16 w16cex w16sdtdh w16sdtfl w16du wp14">
   <w:body>
+    <w:tbl>
+      <w:tblPr>
+        <w:tblW w:w="0" w:type="auto"/>
+        <w:tblCellSpacing w:w="15" w:type="dxa"/>
+        <w:tblCellMar>
+          <w:top w:w="15" w:type="dxa"/>
+          <w:left w:w="15" w:type="dxa"/>
+          <w:bottom w:w="15" w:type="dxa"/>
+          <w:right w:w="15" w:type="dxa"/>
+        </w:tblCellMar>
+        <w:tblLook w:val="04A0" w:firstRow="1" w:lastRow="0" w:firstColumn="1" w:lastColumn="0" w:noHBand="0" w:noVBand="1"/>
+      </w:tblPr>
+      <w:tblGrid>
+        <w:gridCol w:w="1169"/>
+        <w:gridCol w:w="1985"/>
+        <w:gridCol w:w="1594"/>
+        <w:gridCol w:w="1293"/>
+        <w:gridCol w:w="1634"/>
+        <w:gridCol w:w="1669"/>
+      </w:tblGrid>
+      <w:tr>
+        <w:trPr>
+          <w:tblHeader/>
+          <w:tblCellSpacing w:w="15" w:type="dxa"/>
+        </w:trPr>
+        <w:tc>
+          <w:tcPr>
+            <w:tcW w:w="0" w:type="auto"/>
+            <w:tcBorders>
+              <w:top w:val="single" w:sz="6" w:space="0" w:color="C4C7C5"/>
+              <w:left w:val="single" w:sz="6" w:space="0" w:color="C4C7C5"/>
+              <w:bottom w:val="single" w:sz="6" w:space="0" w:color="C4C7C5"/>
+              <w:right w:val="single" w:sz="6" w:space="0" w:color="C4C7C5"/>
+            </w:tcBorders>
+            <w:tcMar>
+              <w:top w:w="120" w:type="dxa"/>
+              <w:left w:w="180" w:type="dxa"/>
+              <w:bottom w:w="120" w:type="dxa"/>
+              <w:right w:w="180" w:type="dxa"/>
+            </w:tcMar>
+            <w:vAlign w:val="center"/>
+            <w:hideMark/>
+          </w:tcPr>
+          <w:p>
+            <w:r>
+              <w:rPr>
+                <w:b/>
+                <w:bCs/>
+              </w:rPr>
+              <w:t>HTTP Method</w:t>
+            </w:r>
+          </w:p>
+        </w:tc>
+        <w:tc>
+          <w:tcPr>
+            <w:tcW w:w="0" w:type="auto"/>
+            <w:tcBorders>
+              <w:top w:val="single" w:sz="6" w:space="0" w:color="C4C7C5"/>
+              <w:left w:val="single" w:sz="6" w:space="0" w:color="C4C7C5"/>
+              <w:bottom w:val="single" w:sz="6" w:space="0" w:color="C4C7C5"/>
+              <w:right w:val="single" w:sz="6" w:space="0" w:color="C4C7C5"/>
+            </w:tcBorders>
+            <w:tcMar>
+              <w:top w:w="120" w:type="dxa"/>
+              <w:left w:w="180" w:type="dxa"/>
+              <w:bottom w:w="120" w:type="dxa"/>
+              <w:right w:w="180" w:type="dxa"/>
+            </w:tcMar>
+            <w:vAlign w:val="center"/>
+            <w:hideMark/>
+          </w:tcPr>
+          <w:p>
+            <w:r>
+              <w:rPr>
+                <w:b/>
+                <w:bCs/>
+              </w:rPr>
+              <w:t>Route</w:t>
+            </w:r>
+          </w:p>
+        </w:tc>
+        <w:tc>
+          <w:tcPr>
+            <w:tcW w:w="0" w:type="auto"/>
+            <w:tcBorders>
+              <w:top w:val="single" w:sz="6" w:space="0" w:color="C4C7C5"/>
+              <w:left w:val="single" w:sz="6" w:space="0" w:color="C4C7C5"/>
+              <w:bottom w:val="single" w:sz="6" w:space="0" w:color="C4C7C5"/>
+              <w:right w:val="single" w:sz="6" w:space="0" w:color="C4C7C5"/>
+            </w:tcBorders>
+            <w:tcMar>
+              <w:top w:w="120" w:type="dxa"/>
+              <w:left w:w="180" w:type="dxa"/>
+              <w:bottom w:w="120" w:type="dxa"/>
+              <w:right w:w="180" w:type="dxa"/>
+            </w:tcMar>
+            <w:vAlign w:val="center"/>
+            <w:hideMark/>
+          </w:tcPr>
+          <w:p>
+            <w:r>
+              <w:rPr>
+                <w:b/>
+                <w:bCs/>
+              </w:rPr>
+              <w:t>Description</w:t>
+            </w:r>
+          </w:p>
+        </w:tc>
+        <w:tc>
+          <w:tcPr>
+            <w:tcW w:w="0" w:type="auto"/>
+            <w:tcBorders>
+              <w:top w:val="single" w:sz="6" w:space="0" w:color="C4C7C5"/>
+              <w:left w:val="single" w:sz="6" w:space="0" w:color="C4C7C5"/>
+              <w:bottom w:val="single" w:sz="6" w:space="0" w:color="C4C7C5"/>
+              <w:right w:val="single" w:sz="6" w:space="0" w:color="C4C7C5"/>
+            </w:tcBorders>
+            <w:tcMar>
+              <w:top w:w="120" w:type="dxa"/>
+              <w:left w:w="180" w:type="dxa"/>
+              <w:bottom w:w="120" w:type="dxa"/>
+              <w:right w:w="180" w:type="dxa"/>
+            </w:tcMar>
+            <w:vAlign w:val="center"/>
+            <w:hideMark/>
+          </w:tcPr>
+          <w:p>
+            <w:r>
+              <w:rPr>
+                <w:b/>
+                <w:bCs/>
+              </w:rPr>
+              <w:t>Role Required</w:t>
+            </w:r>
+          </w:p>
+        </w:tc>
+        <w:tc>
+          <w:tcPr>
+            <w:tcW w:w="0" w:type="auto"/>
+            <w:tcBorders>
+              <w:top w:val="single" w:sz="6" w:space="0" w:color="C4C7C5"/>
+              <w:left w:val="single" w:sz="6" w:space="0" w:color="C4C7C5"/>
+              <w:bottom w:val="single" w:sz="6" w:space="0" w:color="C4C7C5"/>
+              <w:right w:val="single" w:sz="6" w:space="0" w:color="C4C7C5"/>
+            </w:tcBorders>
+            <w:tcMar>
+              <w:top w:w="120" w:type="dxa"/>
+              <w:left w:w="180" w:type="dxa"/>
+              <w:bottom w:w="120" w:type="dxa"/>
+              <w:right w:w="180" w:type="dxa"/>
+            </w:tcMar>
+            <w:vAlign w:val="center"/>
+            <w:hideMark/>
+          </w:tcPr>
+          <w:p>
+            <w:r>
+              <w:rPr>
+                <w:b/>
+                <w:bCs/>
+              </w:rPr>
+              <w:t>Request Body (JSON)</w:t>
+            </w:r>
+          </w:p>
+        </w:tc>
+        <w:tc>
+          <w:tcPr>
+            <w:tcW w:w="0" w:type="auto"/>
+            <w:tcBorders>
+              <w:top w:val="single" w:sz="6" w:space="0" w:color="C4C7C5"/>
+              <w:left w:val="single" w:sz="6" w:space="0" w:color="C4C7C5"/>
+              <w:bottom w:val="single" w:sz="6" w:space="0" w:color="C4C7C5"/>
+              <w:right w:val="single" w:sz="6" w:space="0" w:color="C4C7C5"/>
+            </w:tcBorders>
+            <w:tcMar>
+              <w:top w:w="120" w:type="dxa"/>
+              <w:left w:w="180" w:type="dxa"/>
+              <w:bottom w:w="120" w:type="dxa"/>
+              <w:right w:w="180" w:type="dxa"/>
+            </w:tcMar>
+            <w:vAlign w:val="center"/>
+            <w:hideMark/>
+          </w:tcPr>
+          <w:p>
+            <w:r>
+              <w:rPr>
+                <w:b/>
+                <w:bCs/>
+              </w:rPr>
+              <w:t>Expected Response</w:t>
+            </w:r>
+          </w:p>
+        </w:tc>
+      </w:tr>
+      <w:tr>
+        <w:trPr>
+          <w:tblCellSpacing w:w="15" w:type="dxa"/>
+        </w:trPr>
+        <w:tc>
+          <w:tcPr>
+            <w:tcW w:w="0" w:type="auto"/>
+            <w:tcBorders>
+              <w:top w:val="single" w:sz="6" w:space="0" w:color="C4C7C5"/>
+              <w:left w:val="single" w:sz="6" w:space="0" w:color="C4C7C5"/>
+              <w:bottom w:val="single" w:sz="6" w:space="0" w:color="C4C7C5"/>
+              <w:right w:val="single" w:sz="6" w:space="0" w:color="C4C7C5"/>
+            </w:tcBorders>
+            <w:tcMar>
+              <w:top w:w="120" w:type="dxa"/>
+              <w:left w:w="180" w:type="dxa"/>
+              <w:bottom w:w="120" w:type="dxa"/>
+              <w:right w:w="180" w:type="dxa"/>
+            </w:tcMar>
+            <w:vAlign w:val="center"/>
+            <w:hideMark/>
+          </w:tcPr>
+          <w:p>
+            <w:r>
+              <w:rPr>
+                <w:b/>
+                <w:bCs/>
+              </w:rPr>
+              <w:t>POST</w:t>
+            </w:r>
+          </w:p>
+        </w:tc>
+        <w:tc>
+          <w:tcPr>
+            <w:tcW w:w="0" w:type="auto"/>
+            <w:tcBorders>
+              <w:top w:val="single" w:sz="6" w:space="0" w:color="C4C7C5"/>
+              <w:left w:val="single" w:sz="6" w:space="0" w:color="C4C7C5"/>
+              <w:bottom w:val="single" w:sz="6" w:space="0" w:color="C4C7C5"/>
+              <w:right w:val="single" w:sz="6" w:space="0" w:color="C4C7C5"/>
+            </w:tcBorders>
+            <w:tcMar>
+              <w:top w:w="120" w:type="dxa"/>
+              <w:left w:w="180" w:type="dxa"/>
+              <w:bottom w:w="120" w:type="dxa"/>
+              <w:right w:w="180" w:type="dxa"/>
+            </w:tcMar>
+            <w:vAlign w:val="center"/>
+            <w:hideMark/>
+          </w:tcPr>
+          <w:p>
+            <w:r>
+              <w:t>/</w:t>
+            </w:r>
+            <w:proofErr w:type="spellStart"/>
+            <w:r>
+              <w:t>api</w:t>
+            </w:r>
+            <w:proofErr w:type="spellEnd"/>
+            <w:r>
+              <w:t>/auth/register</w:t>
+            </w:r>
+          </w:p>
+        </w:tc>
+        <w:tc>
+          <w:tcPr>
+            <w:tcW w:w="0" w:type="auto"/>
+            <w:tcBorders>
+              <w:top w:val="single" w:sz="6" w:space="0" w:color="C4C7C5"/>
+              <w:left w:val="single" w:sz="6" w:space="0" w:color="C4C7C5"/>
+              <w:bottom w:val="single" w:sz="6" w:space="0" w:color="C4C7C5"/>
+              <w:right w:val="single" w:sz="6" w:space="0" w:color="C4C7C5"/>
+            </w:tcBorders>
+            <w:tcMar>
+              <w:top w:w="120" w:type="dxa"/>
+              <w:left w:w="180" w:type="dxa"/>
+              <w:bottom w:w="120" w:type="dxa"/>
+              <w:right w:w="180" w:type="dxa"/>
+            </w:tcMar>
+            <w:vAlign w:val="center"/>
+            <w:hideMark/>
+          </w:tcPr>
+          <w:p>
+            <w:proofErr w:type="gramStart"/>
+            <w:r>
+              <w:t>Register</w:t>
+            </w:r>
+            <w:proofErr w:type="gramEnd"/>
+            <w:r>
+              <w:t xml:space="preserve"> a new user account</w:t>
+            </w:r>
+          </w:p>
+        </w:tc>
+        <w:tc>
+          <w:tcPr>
+            <w:tcW w:w="0" w:type="auto"/>
+            <w:tcBorders>
+              <w:top w:val="single" w:sz="6" w:space="0" w:color="C4C7C5"/>
+              <w:left w:val="single" w:sz="6" w:space="0" w:color="C4C7C5"/>
+              <w:bottom w:val="single" w:sz="6" w:space="0" w:color="C4C7C5"/>
+              <w:right w:val="single" w:sz="6" w:space="0" w:color="C4C7C5"/>
+            </w:tcBorders>
+            <w:tcMar>
+              <w:top w:w="120" w:type="dxa"/>
+              <w:left w:w="180" w:type="dxa"/>
+              <w:bottom w:w="120" w:type="dxa"/>
+              <w:right w:w="180" w:type="dxa"/>
+            </w:tcMar>
+            <w:vAlign w:val="center"/>
+            <w:hideMark/>
+          </w:tcPr>
+          <w:p>
+            <w:r>
+              <w:t>None (Public)</w:t>
+            </w:r>
+          </w:p>
+        </w:tc>
+        <w:tc>
+          <w:tcPr>
+            <w:tcW w:w="0" w:type="auto"/>
+            <w:tcBorders>
+              <w:top w:val="single" w:sz="6" w:space="0" w:color="C4C7C5"/>
+              <w:left w:val="single" w:sz="6" w:space="0" w:color="C4C7C5"/>
+              <w:bottom w:val="single" w:sz="6" w:space="0" w:color="C4C7C5"/>
+              <w:right w:val="single" w:sz="6" w:space="0" w:color="C4C7C5"/>
+            </w:tcBorders>
+            <w:tcMar>
+              <w:top w:w="120" w:type="dxa"/>
+              <w:left w:w="180" w:type="dxa"/>
+              <w:bottom w:w="120" w:type="dxa"/>
+              <w:right w:w="180" w:type="dxa"/>
+            </w:tcMar>
+            <w:vAlign w:val="center"/>
+            <w:hideMark/>
+          </w:tcPr>
+          <w:p>
+            <w:r>
+              <w:t>{"</w:t>
+            </w:r>
+            <w:proofErr w:type="spellStart"/>
+            <w:r>
+              <w:t>fullName</w:t>
+            </w:r>
+            <w:proofErr w:type="spellEnd"/>
+            <w:r>
+              <w:t>": "...", "email": "...", "password": "...", "</w:t>
+            </w:r>
+            <w:proofErr w:type="spellStart"/>
+            <w:r>
+              <w:t>idNumber</w:t>
+            </w:r>
+            <w:proofErr w:type="spellEnd"/>
+            <w:r>
+              <w:t>": "...", "role": "Participant"}</w:t>
+            </w:r>
+          </w:p>
+        </w:tc>
+        <w:tc>
+          <w:tcPr>
+            <w:tcW w:w="0" w:type="auto"/>
+            <w:tcBorders>
+              <w:top w:val="single" w:sz="6" w:space="0" w:color="C4C7C5"/>
+              <w:left w:val="single" w:sz="6" w:space="0" w:color="C4C7C5"/>
+              <w:bottom w:val="single" w:sz="6" w:space="0" w:color="C4C7C5"/>
+              <w:right w:val="single" w:sz="6" w:space="0" w:color="C4C7C5"/>
+            </w:tcBorders>
+            <w:tcMar>
+              <w:top w:w="120" w:type="dxa"/>
+              <w:left w:w="180" w:type="dxa"/>
+              <w:bottom w:w="120" w:type="dxa"/>
+              <w:right w:w="180" w:type="dxa"/>
+            </w:tcMar>
+            <w:vAlign w:val="center"/>
+            <w:hideMark/>
+          </w:tcPr>
+          <w:p>
+            <w:r>
+              <w:t>201 Created - User record created with token</w:t>
+            </w:r>
+          </w:p>
+        </w:tc>
+      </w:tr>
+      <w:tr>
+        <w:trPr>
+          <w:tblCellSpacing w:w="15" w:type="dxa"/>
+        </w:trPr>
+        <w:tc>
+          <w:tcPr>
+            <w:tcW w:w="0" w:type="auto"/>
+            <w:tcBorders>
+              <w:top w:val="single" w:sz="6" w:space="0" w:color="C4C7C5"/>
+              <w:left w:val="single" w:sz="6" w:space="0" w:color="C4C7C5"/>
+              <w:bottom w:val="single" w:sz="6" w:space="0" w:color="C4C7C5"/>
+              <w:right w:val="single" w:sz="6" w:space="0" w:color="C4C7C5"/>
+            </w:tcBorders>
+            <w:tcMar>
+              <w:top w:w="120" w:type="dxa"/>
+              <w:left w:w="180" w:type="dxa"/>
+              <w:bottom w:w="120" w:type="dxa"/>
+              <w:right w:w="180" w:type="dxa"/>
+            </w:tcMar>
+            <w:vAlign w:val="center"/>
+            <w:hideMark/>
+          </w:tcPr>
+          <w:p>
+            <w:r>
+              <w:rPr>
+                <w:b/>
+                <w:bCs/>
+              </w:rPr>
+              <w:t>POST</w:t>
+            </w:r>
+          </w:p>
+        </w:tc>
+        <w:tc>
+          <w:tcPr>
+            <w:tcW w:w="0" w:type="auto"/>
+            <w:tcBorders>
+              <w:top w:val="single" w:sz="6" w:space="0" w:color="C4C7C5"/>
+              <w:left w:val="single" w:sz="6" w:space="0" w:color="C4C7C5"/>
+              <w:bottom w:val="single" w:sz="6" w:space="0" w:color="C4C7C5"/>
+              <w:right w:val="single" w:sz="6" w:space="0" w:color="C4C7C5"/>
+            </w:tcBorders>
+            <w:tcMar>
+              <w:top w:w="120" w:type="dxa"/>
+              <w:left w:w="180" w:type="dxa"/>
+              <w:bottom w:w="120" w:type="dxa"/>
+              <w:right w:w="180" w:type="dxa"/>
+            </w:tcMar>
+            <w:vAlign w:val="center"/>
+            <w:hideMark/>
+          </w:tcPr>
+          <w:p>
+            <w:r>
+              <w:t>/</w:t>
+            </w:r>
+            <w:proofErr w:type="spellStart"/>
+            <w:r>
+              <w:t>api</w:t>
+            </w:r>
+            <w:proofErr w:type="spellEnd"/>
+            <w:r>
+              <w:t>/auth/login</w:t>
+            </w:r>
+          </w:p>
+        </w:tc>
+        <w:tc>
+          <w:tcPr>
+            <w:tcW w:w="0" w:type="auto"/>
+            <w:tcBorders>
+              <w:top w:val="single" w:sz="6" w:space="0" w:color="C4C7C5"/>
+              <w:left w:val="single" w:sz="6" w:space="0" w:color="C4C7C5"/>
+              <w:bottom w:val="single" w:sz="6" w:space="0" w:color="C4C7C5"/>
+              <w:right w:val="single" w:sz="6" w:space="0" w:color="C4C7C5"/>
+            </w:tcBorders>
+            <w:tcMar>
+              <w:top w:w="120" w:type="dxa"/>
+              <w:left w:w="180" w:type="dxa"/>
+              <w:bottom w:w="120" w:type="dxa"/>
+              <w:right w:w="180" w:type="dxa"/>
+            </w:tcMar>
+            <w:vAlign w:val="center"/>
+            <w:hideMark/>
+          </w:tcPr>
+          <w:p>
+            <w:r>
+              <w:t>Authenticate user and issue JWT</w:t>
+            </w:r>
+          </w:p>
+        </w:tc>
+        <w:tc>
+          <w:tcPr>
+            <w:tcW w:w="0" w:type="auto"/>
+            <w:tcBorders>
+              <w:top w:val="single" w:sz="6" w:space="0" w:color="C4C7C5"/>
+              <w:left w:val="single" w:sz="6" w:space="0" w:color="C4C7C5"/>
+              <w:bottom w:val="single" w:sz="6" w:space="0" w:color="C4C7C5"/>
+              <w:right w:val="single" w:sz="6" w:space="0" w:color="C4C7C5"/>
+            </w:tcBorders>
+            <w:tcMar>
+              <w:top w:w="120" w:type="dxa"/>
+              <w:left w:w="180" w:type="dxa"/>
+              <w:bottom w:w="120" w:type="dxa"/>
+              <w:right w:w="180" w:type="dxa"/>
+            </w:tcMar>
+            <w:vAlign w:val="center"/>
+            <w:hideMark/>
+          </w:tcPr>
+          <w:p>
+            <w:r>
+              <w:t>None (Public)</w:t>
+            </w:r>
+          </w:p>
+        </w:tc>
+        <w:tc>
+          <w:tcPr>
+            <w:tcW w:w="0" w:type="auto"/>
+            <w:tcBorders>
+              <w:top w:val="single" w:sz="6" w:space="0" w:color="C4C7C5"/>
+              <w:left w:val="single" w:sz="6" w:space="0" w:color="C4C7C5"/>
+              <w:bottom w:val="single" w:sz="6" w:space="0" w:color="C4C7C5"/>
+              <w:right w:val="single" w:sz="6" w:space="0" w:color="C4C7C5"/>
+            </w:tcBorders>
+            <w:tcMar>
+              <w:top w:w="120" w:type="dxa"/>
+              <w:left w:w="180" w:type="dxa"/>
+              <w:bottom w:w="120" w:type="dxa"/>
+              <w:right w:w="180" w:type="dxa"/>
+            </w:tcMar>
+            <w:vAlign w:val="center"/>
+            <w:hideMark/>
+          </w:tcPr>
+          <w:p>
+            <w:r>
+              <w:t>{"email": "...", "password": "..."}</w:t>
+            </w:r>
+          </w:p>
+        </w:tc>
+        <w:tc>
+          <w:tcPr>
+            <w:tcW w:w="0" w:type="auto"/>
+            <w:tcBorders>
+              <w:top w:val="single" w:sz="6" w:space="0" w:color="C4C7C5"/>
+              <w:left w:val="single" w:sz="6" w:space="0" w:color="C4C7C5"/>
+              <w:bottom w:val="single" w:sz="6" w:space="0" w:color="C4C7C5"/>
+              <w:right w:val="single" w:sz="6" w:space="0" w:color="C4C7C5"/>
+            </w:tcBorders>
+            <w:tcMar>
+              <w:top w:w="120" w:type="dxa"/>
+              <w:left w:w="180" w:type="dxa"/>
+              <w:bottom w:w="120" w:type="dxa"/>
+              <w:right w:w="180" w:type="dxa"/>
+            </w:tcMar>
+            <w:vAlign w:val="center"/>
+            <w:hideMark/>
+          </w:tcPr>
+          <w:p>
+            <w:r>
+              <w:t>200 OK - JWT token &amp; user role info; 401 Unauthorized</w:t>
+            </w:r>
+          </w:p>
+        </w:tc>
+      </w:tr>
+    </w:tbl>
     <w:p/>
     <w:sectPr>
       <w:pgSz w:w="12240" w:h="15840"/>
@@ -616,7 +1154,6 @@
   <w:style w:type="character" w:default="1" w:styleId="DefaultParagraphFont">
     <w:name w:val="Default Paragraph Font"/>
     <w:uiPriority w:val="1"/>
-    <w:semiHidden/>
     <w:unhideWhenUsed/>
   </w:style>
   <w:style w:type="table" w:default="1" w:styleId="TableNormal">

</xml_diff>

<commit_message>
User profile retrieval and update endpoints
</commit_message>
<xml_diff>
--- a/doc/API Endpoint Plan.docx
+++ b/doc/API Endpoint Plan.docx
@@ -15,12 +15,12 @@
         <w:tblLook w:val="04A0" w:firstRow="1" w:lastRow="0" w:firstColumn="1" w:lastColumn="0" w:noHBand="0" w:noVBand="1"/>
       </w:tblPr>
       <w:tblGrid>
-        <w:gridCol w:w="1169"/>
-        <w:gridCol w:w="1985"/>
-        <w:gridCol w:w="1594"/>
-        <w:gridCol w:w="1293"/>
-        <w:gridCol w:w="1634"/>
-        <w:gridCol w:w="1669"/>
+        <w:gridCol w:w="1054"/>
+        <w:gridCol w:w="1739"/>
+        <w:gridCol w:w="1498"/>
+        <w:gridCol w:w="1508"/>
+        <w:gridCol w:w="2071"/>
+        <w:gridCol w:w="1474"/>
       </w:tblGrid>
       <w:tr>
         <w:trPr>
@@ -535,6 +535,336 @@
           <w:p>
             <w:r>
               <w:t>200 OK - JWT token &amp; user role info; 401 Unauthorized</w:t>
+            </w:r>
+          </w:p>
+        </w:tc>
+      </w:tr>
+      <w:tr>
+        <w:trPr>
+          <w:tblCellSpacing w:w="15" w:type="dxa"/>
+        </w:trPr>
+        <w:tc>
+          <w:tcPr>
+            <w:tcW w:w="0" w:type="auto"/>
+            <w:tcBorders>
+              <w:top w:val="single" w:sz="6" w:space="0" w:color="C4C7C5"/>
+              <w:left w:val="single" w:sz="6" w:space="0" w:color="C4C7C5"/>
+              <w:bottom w:val="single" w:sz="6" w:space="0" w:color="C4C7C5"/>
+              <w:right w:val="single" w:sz="6" w:space="0" w:color="C4C7C5"/>
+            </w:tcBorders>
+            <w:tcMar>
+              <w:top w:w="120" w:type="dxa"/>
+              <w:left w:w="180" w:type="dxa"/>
+              <w:bottom w:w="120" w:type="dxa"/>
+              <w:right w:w="180" w:type="dxa"/>
+            </w:tcMar>
+            <w:vAlign w:val="center"/>
+            <w:hideMark/>
+          </w:tcPr>
+          <w:p>
+            <w:r>
+              <w:rPr>
+                <w:b/>
+                <w:bCs/>
+              </w:rPr>
+              <w:t>GET</w:t>
+            </w:r>
+          </w:p>
+        </w:tc>
+        <w:tc>
+          <w:tcPr>
+            <w:tcW w:w="0" w:type="auto"/>
+            <w:tcBorders>
+              <w:top w:val="single" w:sz="6" w:space="0" w:color="C4C7C5"/>
+              <w:left w:val="single" w:sz="6" w:space="0" w:color="C4C7C5"/>
+              <w:bottom w:val="single" w:sz="6" w:space="0" w:color="C4C7C5"/>
+              <w:right w:val="single" w:sz="6" w:space="0" w:color="C4C7C5"/>
+            </w:tcBorders>
+            <w:tcMar>
+              <w:top w:w="120" w:type="dxa"/>
+              <w:left w:w="180" w:type="dxa"/>
+              <w:bottom w:w="120" w:type="dxa"/>
+              <w:right w:w="180" w:type="dxa"/>
+            </w:tcMar>
+            <w:vAlign w:val="center"/>
+            <w:hideMark/>
+          </w:tcPr>
+          <w:p>
+            <w:r>
+              <w:t>/</w:t>
+            </w:r>
+            <w:proofErr w:type="spellStart"/>
+            <w:r>
+              <w:t>api</w:t>
+            </w:r>
+            <w:proofErr w:type="spellEnd"/>
+            <w:r>
+              <w:t>/users/profile</w:t>
+            </w:r>
+          </w:p>
+        </w:tc>
+        <w:tc>
+          <w:tcPr>
+            <w:tcW w:w="0" w:type="auto"/>
+            <w:tcBorders>
+              <w:top w:val="single" w:sz="6" w:space="0" w:color="C4C7C5"/>
+              <w:left w:val="single" w:sz="6" w:space="0" w:color="C4C7C5"/>
+              <w:bottom w:val="single" w:sz="6" w:space="0" w:color="C4C7C5"/>
+              <w:right w:val="single" w:sz="6" w:space="0" w:color="C4C7C5"/>
+            </w:tcBorders>
+            <w:tcMar>
+              <w:top w:w="120" w:type="dxa"/>
+              <w:left w:w="180" w:type="dxa"/>
+              <w:bottom w:w="120" w:type="dxa"/>
+              <w:right w:w="180" w:type="dxa"/>
+            </w:tcMar>
+            <w:vAlign w:val="center"/>
+            <w:hideMark/>
+          </w:tcPr>
+          <w:p>
+            <w:r>
+              <w:t>Retrieve the authenticated user profile</w:t>
+            </w:r>
+          </w:p>
+        </w:tc>
+        <w:tc>
+          <w:tcPr>
+            <w:tcW w:w="0" w:type="auto"/>
+            <w:tcBorders>
+              <w:top w:val="single" w:sz="6" w:space="0" w:color="C4C7C5"/>
+              <w:left w:val="single" w:sz="6" w:space="0" w:color="C4C7C5"/>
+              <w:bottom w:val="single" w:sz="6" w:space="0" w:color="C4C7C5"/>
+              <w:right w:val="single" w:sz="6" w:space="0" w:color="C4C7C5"/>
+            </w:tcBorders>
+            <w:tcMar>
+              <w:top w:w="120" w:type="dxa"/>
+              <w:left w:w="180" w:type="dxa"/>
+              <w:bottom w:w="120" w:type="dxa"/>
+              <w:right w:w="180" w:type="dxa"/>
+            </w:tcMar>
+            <w:vAlign w:val="center"/>
+            <w:hideMark/>
+          </w:tcPr>
+          <w:p>
+            <w:r>
+              <w:t>Authenticated</w:t>
+            </w:r>
+          </w:p>
+        </w:tc>
+        <w:tc>
+          <w:tcPr>
+            <w:tcW w:w="0" w:type="auto"/>
+            <w:tcBorders>
+              <w:top w:val="single" w:sz="6" w:space="0" w:color="C4C7C5"/>
+              <w:left w:val="single" w:sz="6" w:space="0" w:color="C4C7C5"/>
+              <w:bottom w:val="single" w:sz="6" w:space="0" w:color="C4C7C5"/>
+              <w:right w:val="single" w:sz="6" w:space="0" w:color="C4C7C5"/>
+            </w:tcBorders>
+            <w:tcMar>
+              <w:top w:w="120" w:type="dxa"/>
+              <w:left w:w="180" w:type="dxa"/>
+              <w:bottom w:w="120" w:type="dxa"/>
+              <w:right w:w="180" w:type="dxa"/>
+            </w:tcMar>
+            <w:vAlign w:val="center"/>
+            <w:hideMark/>
+          </w:tcPr>
+          <w:p>
+            <w:r>
+              <w:t>None</w:t>
+            </w:r>
+          </w:p>
+        </w:tc>
+        <w:tc>
+          <w:tcPr>
+            <w:tcW w:w="0" w:type="auto"/>
+            <w:tcBorders>
+              <w:top w:val="single" w:sz="6" w:space="0" w:color="C4C7C5"/>
+              <w:left w:val="single" w:sz="6" w:space="0" w:color="C4C7C5"/>
+              <w:bottom w:val="single" w:sz="6" w:space="0" w:color="C4C7C5"/>
+              <w:right w:val="single" w:sz="6" w:space="0" w:color="C4C7C5"/>
+            </w:tcBorders>
+            <w:tcMar>
+              <w:top w:w="120" w:type="dxa"/>
+              <w:left w:w="180" w:type="dxa"/>
+              <w:bottom w:w="120" w:type="dxa"/>
+              <w:right w:w="180" w:type="dxa"/>
+            </w:tcMar>
+            <w:vAlign w:val="center"/>
+            <w:hideMark/>
+          </w:tcPr>
+          <w:p>
+            <w:r>
+              <w:t>200 OK - User profile object; 404 Not Found</w:t>
+            </w:r>
+          </w:p>
+        </w:tc>
+      </w:tr>
+      <w:tr>
+        <w:trPr>
+          <w:tblCellSpacing w:w="15" w:type="dxa"/>
+        </w:trPr>
+        <w:tc>
+          <w:tcPr>
+            <w:tcW w:w="0" w:type="auto"/>
+            <w:tcBorders>
+              <w:top w:val="single" w:sz="6" w:space="0" w:color="C4C7C5"/>
+              <w:left w:val="single" w:sz="6" w:space="0" w:color="C4C7C5"/>
+              <w:bottom w:val="single" w:sz="6" w:space="0" w:color="C4C7C5"/>
+              <w:right w:val="single" w:sz="6" w:space="0" w:color="C4C7C5"/>
+            </w:tcBorders>
+            <w:tcMar>
+              <w:top w:w="120" w:type="dxa"/>
+              <w:left w:w="180" w:type="dxa"/>
+              <w:bottom w:w="120" w:type="dxa"/>
+              <w:right w:w="180" w:type="dxa"/>
+            </w:tcMar>
+            <w:vAlign w:val="center"/>
+            <w:hideMark/>
+          </w:tcPr>
+          <w:p>
+            <w:r>
+              <w:rPr>
+                <w:b/>
+                <w:bCs/>
+              </w:rPr>
+              <w:t>PUT</w:t>
+            </w:r>
+          </w:p>
+        </w:tc>
+        <w:tc>
+          <w:tcPr>
+            <w:tcW w:w="0" w:type="auto"/>
+            <w:tcBorders>
+              <w:top w:val="single" w:sz="6" w:space="0" w:color="C4C7C5"/>
+              <w:left w:val="single" w:sz="6" w:space="0" w:color="C4C7C5"/>
+              <w:bottom w:val="single" w:sz="6" w:space="0" w:color="C4C7C5"/>
+              <w:right w:val="single" w:sz="6" w:space="0" w:color="C4C7C5"/>
+            </w:tcBorders>
+            <w:tcMar>
+              <w:top w:w="120" w:type="dxa"/>
+              <w:left w:w="180" w:type="dxa"/>
+              <w:bottom w:w="120" w:type="dxa"/>
+              <w:right w:w="180" w:type="dxa"/>
+            </w:tcMar>
+            <w:vAlign w:val="center"/>
+            <w:hideMark/>
+          </w:tcPr>
+          <w:p>
+            <w:r>
+              <w:t>/</w:t>
+            </w:r>
+            <w:proofErr w:type="spellStart"/>
+            <w:r>
+              <w:t>api</w:t>
+            </w:r>
+            <w:proofErr w:type="spellEnd"/>
+            <w:r>
+              <w:t>/users/profile</w:t>
+            </w:r>
+          </w:p>
+        </w:tc>
+        <w:tc>
+          <w:tcPr>
+            <w:tcW w:w="0" w:type="auto"/>
+            <w:tcBorders>
+              <w:top w:val="single" w:sz="6" w:space="0" w:color="C4C7C5"/>
+              <w:left w:val="single" w:sz="6" w:space="0" w:color="C4C7C5"/>
+              <w:bottom w:val="single" w:sz="6" w:space="0" w:color="C4C7C5"/>
+              <w:right w:val="single" w:sz="6" w:space="0" w:color="C4C7C5"/>
+            </w:tcBorders>
+            <w:tcMar>
+              <w:top w:w="120" w:type="dxa"/>
+              <w:left w:w="180" w:type="dxa"/>
+              <w:bottom w:w="120" w:type="dxa"/>
+              <w:right w:w="180" w:type="dxa"/>
+            </w:tcMar>
+            <w:vAlign w:val="center"/>
+            <w:hideMark/>
+          </w:tcPr>
+          <w:p>
+            <w:r>
+              <w:t>Update contact &amp; medical details</w:t>
+            </w:r>
+          </w:p>
+        </w:tc>
+        <w:tc>
+          <w:tcPr>
+            <w:tcW w:w="0" w:type="auto"/>
+            <w:tcBorders>
+              <w:top w:val="single" w:sz="6" w:space="0" w:color="C4C7C5"/>
+              <w:left w:val="single" w:sz="6" w:space="0" w:color="C4C7C5"/>
+              <w:bottom w:val="single" w:sz="6" w:space="0" w:color="C4C7C5"/>
+              <w:right w:val="single" w:sz="6" w:space="0" w:color="C4C7C5"/>
+            </w:tcBorders>
+            <w:tcMar>
+              <w:top w:w="120" w:type="dxa"/>
+              <w:left w:w="180" w:type="dxa"/>
+              <w:bottom w:w="120" w:type="dxa"/>
+              <w:right w:w="180" w:type="dxa"/>
+            </w:tcMar>
+            <w:vAlign w:val="center"/>
+            <w:hideMark/>
+          </w:tcPr>
+          <w:p>
+            <w:r>
+              <w:t>Authenticated</w:t>
+            </w:r>
+          </w:p>
+        </w:tc>
+        <w:tc>
+          <w:tcPr>
+            <w:tcW w:w="0" w:type="auto"/>
+            <w:tcBorders>
+              <w:top w:val="single" w:sz="6" w:space="0" w:color="C4C7C5"/>
+              <w:left w:val="single" w:sz="6" w:space="0" w:color="C4C7C5"/>
+              <w:bottom w:val="single" w:sz="6" w:space="0" w:color="C4C7C5"/>
+              <w:right w:val="single" w:sz="6" w:space="0" w:color="C4C7C5"/>
+            </w:tcBorders>
+            <w:tcMar>
+              <w:top w:w="120" w:type="dxa"/>
+              <w:left w:w="180" w:type="dxa"/>
+              <w:bottom w:w="120" w:type="dxa"/>
+              <w:right w:w="180" w:type="dxa"/>
+            </w:tcMar>
+            <w:vAlign w:val="center"/>
+            <w:hideMark/>
+          </w:tcPr>
+          <w:p>
+            <w:r>
+              <w:t>{"phone": "...", "</w:t>
+            </w:r>
+            <w:proofErr w:type="spellStart"/>
+            <w:r>
+              <w:t>emergencyContact</w:t>
+            </w:r>
+            <w:proofErr w:type="spellEnd"/>
+            <w:r>
+              <w:t>": "..."}</w:t>
+            </w:r>
+          </w:p>
+        </w:tc>
+        <w:tc>
+          <w:tcPr>
+            <w:tcW w:w="0" w:type="auto"/>
+            <w:tcBorders>
+              <w:top w:val="single" w:sz="6" w:space="0" w:color="C4C7C5"/>
+              <w:left w:val="single" w:sz="6" w:space="0" w:color="C4C7C5"/>
+              <w:bottom w:val="single" w:sz="6" w:space="0" w:color="C4C7C5"/>
+              <w:right w:val="single" w:sz="6" w:space="0" w:color="C4C7C5"/>
+            </w:tcBorders>
+            <w:tcMar>
+              <w:top w:w="120" w:type="dxa"/>
+              <w:left w:w="180" w:type="dxa"/>
+              <w:bottom w:w="120" w:type="dxa"/>
+              <w:right w:w="180" w:type="dxa"/>
+            </w:tcMar>
+            <w:vAlign w:val="center"/>
+            <w:hideMark/>
+          </w:tcPr>
+          <w:p>
+            <w:r>
+              <w:t>200 OK - Updated user object</w:t>
             </w:r>
           </w:p>
         </w:tc>
@@ -1467,6 +1797,19 @@
       <w:spacing w:val="5"/>
     </w:rPr>
   </w:style>
+  <w:style w:type="character" w:styleId="HTMLCode">
+    <w:name w:val="HTML Code"/>
+    <w:basedOn w:val="DefaultParagraphFont"/>
+    <w:uiPriority w:val="99"/>
+    <w:semiHidden/>
+    <w:unhideWhenUsed/>
+    <w:rsid w:val="0053214F"/>
+    <w:rPr>
+      <w:rFonts w:ascii="Courier New" w:eastAsia="Times New Roman" w:hAnsi="Courier New" w:cs="Courier New"/>
+      <w:sz w:val="20"/>
+      <w:szCs w:val="20"/>
+    </w:rPr>
+  </w:style>
 </w:styles>
 </file>
 

</xml_diff>

<commit_message>
specify event creation and listing routes
</commit_message>
<xml_diff>
--- a/doc/API Endpoint Plan.docx
+++ b/doc/API Endpoint Plan.docx
@@ -865,6 +865,356 @@
           <w:p>
             <w:r>
               <w:t>200 OK - Updated user object</w:t>
+            </w:r>
+          </w:p>
+        </w:tc>
+      </w:tr>
+      <w:tr>
+        <w:trPr>
+          <w:tblCellSpacing w:w="15" w:type="dxa"/>
+        </w:trPr>
+        <w:tc>
+          <w:tcPr>
+            <w:tcW w:w="0" w:type="auto"/>
+            <w:tcBorders>
+              <w:top w:val="single" w:sz="6" w:space="0" w:color="C4C7C5"/>
+              <w:left w:val="single" w:sz="6" w:space="0" w:color="C4C7C5"/>
+              <w:bottom w:val="single" w:sz="6" w:space="0" w:color="C4C7C5"/>
+              <w:right w:val="single" w:sz="6" w:space="0" w:color="C4C7C5"/>
+            </w:tcBorders>
+            <w:tcMar>
+              <w:top w:w="120" w:type="dxa"/>
+              <w:left w:w="180" w:type="dxa"/>
+              <w:bottom w:w="120" w:type="dxa"/>
+              <w:right w:w="180" w:type="dxa"/>
+            </w:tcMar>
+            <w:vAlign w:val="center"/>
+            <w:hideMark/>
+          </w:tcPr>
+          <w:p>
+            <w:r>
+              <w:rPr>
+                <w:b/>
+                <w:bCs/>
+              </w:rPr>
+              <w:t>GET</w:t>
+            </w:r>
+          </w:p>
+        </w:tc>
+        <w:tc>
+          <w:tcPr>
+            <w:tcW w:w="0" w:type="auto"/>
+            <w:tcBorders>
+              <w:top w:val="single" w:sz="6" w:space="0" w:color="C4C7C5"/>
+              <w:left w:val="single" w:sz="6" w:space="0" w:color="C4C7C5"/>
+              <w:bottom w:val="single" w:sz="6" w:space="0" w:color="C4C7C5"/>
+              <w:right w:val="single" w:sz="6" w:space="0" w:color="C4C7C5"/>
+            </w:tcBorders>
+            <w:tcMar>
+              <w:top w:w="120" w:type="dxa"/>
+              <w:left w:w="180" w:type="dxa"/>
+              <w:bottom w:w="120" w:type="dxa"/>
+              <w:right w:w="180" w:type="dxa"/>
+            </w:tcMar>
+            <w:vAlign w:val="center"/>
+            <w:hideMark/>
+          </w:tcPr>
+          <w:p>
+            <w:r>
+              <w:t>/</w:t>
+            </w:r>
+            <w:proofErr w:type="spellStart"/>
+            <w:r>
+              <w:t>api</w:t>
+            </w:r>
+            <w:proofErr w:type="spellEnd"/>
+            <w:r>
+              <w:t>/events</w:t>
+            </w:r>
+          </w:p>
+        </w:tc>
+        <w:tc>
+          <w:tcPr>
+            <w:tcW w:w="0" w:type="auto"/>
+            <w:tcBorders>
+              <w:top w:val="single" w:sz="6" w:space="0" w:color="C4C7C5"/>
+              <w:left w:val="single" w:sz="6" w:space="0" w:color="C4C7C5"/>
+              <w:bottom w:val="single" w:sz="6" w:space="0" w:color="C4C7C5"/>
+              <w:right w:val="single" w:sz="6" w:space="0" w:color="C4C7C5"/>
+            </w:tcBorders>
+            <w:tcMar>
+              <w:top w:w="120" w:type="dxa"/>
+              <w:left w:w="180" w:type="dxa"/>
+              <w:bottom w:w="120" w:type="dxa"/>
+              <w:right w:w="180" w:type="dxa"/>
+            </w:tcMar>
+            <w:vAlign w:val="center"/>
+            <w:hideMark/>
+          </w:tcPr>
+          <w:p>
+            <w:r>
+              <w:t xml:space="preserve">List all upcoming events </w:t>
+            </w:r>
+            <w:r>
+              <w:lastRenderedPageBreak/>
+              <w:t>with filter options</w:t>
+            </w:r>
+          </w:p>
+        </w:tc>
+        <w:tc>
+          <w:tcPr>
+            <w:tcW w:w="0" w:type="auto"/>
+            <w:tcBorders>
+              <w:top w:val="single" w:sz="6" w:space="0" w:color="C4C7C5"/>
+              <w:left w:val="single" w:sz="6" w:space="0" w:color="C4C7C5"/>
+              <w:bottom w:val="single" w:sz="6" w:space="0" w:color="C4C7C5"/>
+              <w:right w:val="single" w:sz="6" w:space="0" w:color="C4C7C5"/>
+            </w:tcBorders>
+            <w:tcMar>
+              <w:top w:w="120" w:type="dxa"/>
+              <w:left w:w="180" w:type="dxa"/>
+              <w:bottom w:w="120" w:type="dxa"/>
+              <w:right w:w="180" w:type="dxa"/>
+            </w:tcMar>
+            <w:vAlign w:val="center"/>
+            <w:hideMark/>
+          </w:tcPr>
+          <w:p>
+            <w:r>
+              <w:lastRenderedPageBreak/>
+              <w:t>None (Public)</w:t>
+            </w:r>
+          </w:p>
+        </w:tc>
+        <w:tc>
+          <w:tcPr>
+            <w:tcW w:w="0" w:type="auto"/>
+            <w:tcBorders>
+              <w:top w:val="single" w:sz="6" w:space="0" w:color="C4C7C5"/>
+              <w:left w:val="single" w:sz="6" w:space="0" w:color="C4C7C5"/>
+              <w:bottom w:val="single" w:sz="6" w:space="0" w:color="C4C7C5"/>
+              <w:right w:val="single" w:sz="6" w:space="0" w:color="C4C7C5"/>
+            </w:tcBorders>
+            <w:tcMar>
+              <w:top w:w="120" w:type="dxa"/>
+              <w:left w:w="180" w:type="dxa"/>
+              <w:bottom w:w="120" w:type="dxa"/>
+              <w:right w:w="180" w:type="dxa"/>
+            </w:tcMar>
+            <w:vAlign w:val="center"/>
+            <w:hideMark/>
+          </w:tcPr>
+          <w:p>
+            <w:r>
+              <w:t>None</w:t>
+            </w:r>
+          </w:p>
+        </w:tc>
+        <w:tc>
+          <w:tcPr>
+            <w:tcW w:w="0" w:type="auto"/>
+            <w:tcBorders>
+              <w:top w:val="single" w:sz="6" w:space="0" w:color="C4C7C5"/>
+              <w:left w:val="single" w:sz="6" w:space="0" w:color="C4C7C5"/>
+              <w:bottom w:val="single" w:sz="6" w:space="0" w:color="C4C7C5"/>
+              <w:right w:val="single" w:sz="6" w:space="0" w:color="C4C7C5"/>
+            </w:tcBorders>
+            <w:tcMar>
+              <w:top w:w="120" w:type="dxa"/>
+              <w:left w:w="180" w:type="dxa"/>
+              <w:bottom w:w="120" w:type="dxa"/>
+              <w:right w:w="180" w:type="dxa"/>
+            </w:tcMar>
+            <w:vAlign w:val="center"/>
+            <w:hideMark/>
+          </w:tcPr>
+          <w:p>
+            <w:r>
+              <w:t xml:space="preserve">200 OK - Array of active </w:t>
+            </w:r>
+            <w:r>
+              <w:lastRenderedPageBreak/>
+              <w:t>Event objects</w:t>
+            </w:r>
+          </w:p>
+        </w:tc>
+      </w:tr>
+      <w:tr>
+        <w:trPr>
+          <w:tblCellSpacing w:w="15" w:type="dxa"/>
+        </w:trPr>
+        <w:tc>
+          <w:tcPr>
+            <w:tcW w:w="0" w:type="auto"/>
+            <w:tcBorders>
+              <w:top w:val="single" w:sz="6" w:space="0" w:color="C4C7C5"/>
+              <w:left w:val="single" w:sz="6" w:space="0" w:color="C4C7C5"/>
+              <w:bottom w:val="single" w:sz="6" w:space="0" w:color="C4C7C5"/>
+              <w:right w:val="single" w:sz="6" w:space="0" w:color="C4C7C5"/>
+            </w:tcBorders>
+            <w:tcMar>
+              <w:top w:w="120" w:type="dxa"/>
+              <w:left w:w="180" w:type="dxa"/>
+              <w:bottom w:w="120" w:type="dxa"/>
+              <w:right w:w="180" w:type="dxa"/>
+            </w:tcMar>
+            <w:vAlign w:val="center"/>
+            <w:hideMark/>
+          </w:tcPr>
+          <w:p>
+            <w:r>
+              <w:rPr>
+                <w:b/>
+                <w:bCs/>
+              </w:rPr>
+              <w:lastRenderedPageBreak/>
+              <w:t>POST</w:t>
+            </w:r>
+          </w:p>
+        </w:tc>
+        <w:tc>
+          <w:tcPr>
+            <w:tcW w:w="0" w:type="auto"/>
+            <w:tcBorders>
+              <w:top w:val="single" w:sz="6" w:space="0" w:color="C4C7C5"/>
+              <w:left w:val="single" w:sz="6" w:space="0" w:color="C4C7C5"/>
+              <w:bottom w:val="single" w:sz="6" w:space="0" w:color="C4C7C5"/>
+              <w:right w:val="single" w:sz="6" w:space="0" w:color="C4C7C5"/>
+            </w:tcBorders>
+            <w:tcMar>
+              <w:top w:w="120" w:type="dxa"/>
+              <w:left w:w="180" w:type="dxa"/>
+              <w:bottom w:w="120" w:type="dxa"/>
+              <w:right w:w="180" w:type="dxa"/>
+            </w:tcMar>
+            <w:vAlign w:val="center"/>
+            <w:hideMark/>
+          </w:tcPr>
+          <w:p>
+            <w:r>
+              <w:t>/</w:t>
+            </w:r>
+            <w:proofErr w:type="spellStart"/>
+            <w:r>
+              <w:t>api</w:t>
+            </w:r>
+            <w:proofErr w:type="spellEnd"/>
+            <w:r>
+              <w:t>/events</w:t>
+            </w:r>
+          </w:p>
+        </w:tc>
+        <w:tc>
+          <w:tcPr>
+            <w:tcW w:w="0" w:type="auto"/>
+            <w:tcBorders>
+              <w:top w:val="single" w:sz="6" w:space="0" w:color="C4C7C5"/>
+              <w:left w:val="single" w:sz="6" w:space="0" w:color="C4C7C5"/>
+              <w:bottom w:val="single" w:sz="6" w:space="0" w:color="C4C7C5"/>
+              <w:right w:val="single" w:sz="6" w:space="0" w:color="C4C7C5"/>
+            </w:tcBorders>
+            <w:tcMar>
+              <w:top w:w="120" w:type="dxa"/>
+              <w:left w:w="180" w:type="dxa"/>
+              <w:bottom w:w="120" w:type="dxa"/>
+              <w:right w:w="180" w:type="dxa"/>
+            </w:tcMar>
+            <w:vAlign w:val="center"/>
+            <w:hideMark/>
+          </w:tcPr>
+          <w:p>
+            <w:r>
+              <w:t>Create a new race event</w:t>
+            </w:r>
+          </w:p>
+        </w:tc>
+        <w:tc>
+          <w:tcPr>
+            <w:tcW w:w="0" w:type="auto"/>
+            <w:tcBorders>
+              <w:top w:val="single" w:sz="6" w:space="0" w:color="C4C7C5"/>
+              <w:left w:val="single" w:sz="6" w:space="0" w:color="C4C7C5"/>
+              <w:bottom w:val="single" w:sz="6" w:space="0" w:color="C4C7C5"/>
+              <w:right w:val="single" w:sz="6" w:space="0" w:color="C4C7C5"/>
+            </w:tcBorders>
+            <w:tcMar>
+              <w:top w:w="120" w:type="dxa"/>
+              <w:left w:w="180" w:type="dxa"/>
+              <w:bottom w:w="120" w:type="dxa"/>
+              <w:right w:w="180" w:type="dxa"/>
+            </w:tcMar>
+            <w:vAlign w:val="center"/>
+            <w:hideMark/>
+          </w:tcPr>
+          <w:p>
+            <w:proofErr w:type="spellStart"/>
+            <w:r>
+              <w:t>Organiser</w:t>
+            </w:r>
+            <w:proofErr w:type="spellEnd"/>
+          </w:p>
+        </w:tc>
+        <w:tc>
+          <w:tcPr>
+            <w:tcW w:w="0" w:type="auto"/>
+            <w:tcBorders>
+              <w:top w:val="single" w:sz="6" w:space="0" w:color="C4C7C5"/>
+              <w:left w:val="single" w:sz="6" w:space="0" w:color="C4C7C5"/>
+              <w:bottom w:val="single" w:sz="6" w:space="0" w:color="C4C7C5"/>
+              <w:right w:val="single" w:sz="6" w:space="0" w:color="C4C7C5"/>
+            </w:tcBorders>
+            <w:tcMar>
+              <w:top w:w="120" w:type="dxa"/>
+              <w:left w:w="180" w:type="dxa"/>
+              <w:bottom w:w="120" w:type="dxa"/>
+              <w:right w:w="180" w:type="dxa"/>
+            </w:tcMar>
+            <w:vAlign w:val="center"/>
+            <w:hideMark/>
+          </w:tcPr>
+          <w:p>
+            <w:r>
+              <w:t>{"title": "...", "</w:t>
+            </w:r>
+            <w:proofErr w:type="spellStart"/>
+            <w:r>
+              <w:t>eventType</w:t>
+            </w:r>
+            <w:proofErr w:type="spellEnd"/>
+            <w:r>
+              <w:t>": "Running", "location": "...", "</w:t>
+            </w:r>
+            <w:proofErr w:type="spellStart"/>
+            <w:r>
+              <w:t>eventDate</w:t>
+            </w:r>
+            <w:proofErr w:type="spellEnd"/>
+            <w:r>
+              <w:t>": "2026-10-15"}</w:t>
+            </w:r>
+          </w:p>
+        </w:tc>
+        <w:tc>
+          <w:tcPr>
+            <w:tcW w:w="0" w:type="auto"/>
+            <w:tcBorders>
+              <w:top w:val="single" w:sz="6" w:space="0" w:color="C4C7C5"/>
+              <w:left w:val="single" w:sz="6" w:space="0" w:color="C4C7C5"/>
+              <w:bottom w:val="single" w:sz="6" w:space="0" w:color="C4C7C5"/>
+              <w:right w:val="single" w:sz="6" w:space="0" w:color="C4C7C5"/>
+            </w:tcBorders>
+            <w:tcMar>
+              <w:top w:w="120" w:type="dxa"/>
+              <w:left w:w="180" w:type="dxa"/>
+              <w:bottom w:w="120" w:type="dxa"/>
+              <w:right w:w="180" w:type="dxa"/>
+            </w:tcMar>
+            <w:vAlign w:val="center"/>
+            <w:hideMark/>
+          </w:tcPr>
+          <w:p>
+            <w:r>
+              <w:t>201 Created - Created Event details; 403 Forbidden</w:t>
             </w:r>
           </w:p>
         </w:tc>

</xml_diff>

<commit_message>
Add race categories and pricing endpoint specifications
</commit_message>
<xml_diff>
--- a/doc/API Endpoint Plan.docx
+++ b/doc/API Endpoint Plan.docx
@@ -15,12 +15,12 @@
         <w:tblLook w:val="04A0" w:firstRow="1" w:lastRow="0" w:firstColumn="1" w:lastColumn="0" w:noHBand="0" w:noVBand="1"/>
       </w:tblPr>
       <w:tblGrid>
-        <w:gridCol w:w="1054"/>
-        <w:gridCol w:w="1739"/>
-        <w:gridCol w:w="1498"/>
-        <w:gridCol w:w="1508"/>
-        <w:gridCol w:w="2071"/>
-        <w:gridCol w:w="1474"/>
+        <w:gridCol w:w="998"/>
+        <w:gridCol w:w="2239"/>
+        <w:gridCol w:w="1399"/>
+        <w:gridCol w:w="1409"/>
+        <w:gridCol w:w="1920"/>
+        <w:gridCol w:w="1379"/>
       </w:tblGrid>
       <w:tr>
         <w:trPr>
@@ -248,44 +248,31 @@
           </w:tcPr>
           <w:p>
             <w:r>
-              <w:t>/</w:t>
-            </w:r>
-            <w:proofErr w:type="spellStart"/>
-            <w:r>
-              <w:t>api</w:t>
-            </w:r>
-            <w:proofErr w:type="spellEnd"/>
-            <w:r>
-              <w:t>/auth/register</w:t>
-            </w:r>
-          </w:p>
-        </w:tc>
-        <w:tc>
-          <w:tcPr>
-            <w:tcW w:w="0" w:type="auto"/>
-            <w:tcBorders>
-              <w:top w:val="single" w:sz="6" w:space="0" w:color="C4C7C5"/>
-              <w:left w:val="single" w:sz="6" w:space="0" w:color="C4C7C5"/>
-              <w:bottom w:val="single" w:sz="6" w:space="0" w:color="C4C7C5"/>
-              <w:right w:val="single" w:sz="6" w:space="0" w:color="C4C7C5"/>
-            </w:tcBorders>
-            <w:tcMar>
-              <w:top w:w="120" w:type="dxa"/>
-              <w:left w:w="180" w:type="dxa"/>
-              <w:bottom w:w="120" w:type="dxa"/>
-              <w:right w:w="180" w:type="dxa"/>
-            </w:tcMar>
-            <w:vAlign w:val="center"/>
-            <w:hideMark/>
-          </w:tcPr>
-          <w:p>
-            <w:proofErr w:type="gramStart"/>
-            <w:r>
-              <w:t>Register</w:t>
-            </w:r>
-            <w:proofErr w:type="gramEnd"/>
-            <w:r>
-              <w:t xml:space="preserve"> a new user account</w:t>
+              <w:t>/api/auth/register</w:t>
+            </w:r>
+          </w:p>
+        </w:tc>
+        <w:tc>
+          <w:tcPr>
+            <w:tcW w:w="0" w:type="auto"/>
+            <w:tcBorders>
+              <w:top w:val="single" w:sz="6" w:space="0" w:color="C4C7C5"/>
+              <w:left w:val="single" w:sz="6" w:space="0" w:color="C4C7C5"/>
+              <w:bottom w:val="single" w:sz="6" w:space="0" w:color="C4C7C5"/>
+              <w:right w:val="single" w:sz="6" w:space="0" w:color="C4C7C5"/>
+            </w:tcBorders>
+            <w:tcMar>
+              <w:top w:w="120" w:type="dxa"/>
+              <w:left w:w="180" w:type="dxa"/>
+              <w:bottom w:w="120" w:type="dxa"/>
+              <w:right w:w="180" w:type="dxa"/>
+            </w:tcMar>
+            <w:vAlign w:val="center"/>
+            <w:hideMark/>
+          </w:tcPr>
+          <w:p>
+            <w:r>
+              <w:t>Register a new user account</w:t>
             </w:r>
           </w:p>
         </w:tc>
@@ -333,23 +320,7 @@
           </w:tcPr>
           <w:p>
             <w:r>
-              <w:t>{"</w:t>
-            </w:r>
-            <w:proofErr w:type="spellStart"/>
-            <w:r>
-              <w:t>fullName</w:t>
-            </w:r>
-            <w:proofErr w:type="spellEnd"/>
-            <w:r>
-              <w:t>": "...", "email": "...", "password": "...", "</w:t>
-            </w:r>
-            <w:proofErr w:type="spellStart"/>
-            <w:r>
-              <w:t>idNumber</w:t>
-            </w:r>
-            <w:proofErr w:type="spellEnd"/>
-            <w:r>
-              <w:t>": "...", "role": "Participant"}</w:t>
+              <w:t>{"fullName": "...", "email": "...", "password": "...", "idNumber": "...", "role": "Participant"}</w:t>
             </w:r>
           </w:p>
         </w:tc>
@@ -430,15 +401,7 @@
           </w:tcPr>
           <w:p>
             <w:r>
-              <w:t>/</w:t>
-            </w:r>
-            <w:proofErr w:type="spellStart"/>
-            <w:r>
-              <w:t>api</w:t>
-            </w:r>
-            <w:proofErr w:type="spellEnd"/>
-            <w:r>
-              <w:t>/auth/login</w:t>
+              <w:t>/api/auth/login</w:t>
             </w:r>
           </w:p>
         </w:tc>
@@ -591,15 +554,7 @@
           </w:tcPr>
           <w:p>
             <w:r>
-              <w:t>/</w:t>
-            </w:r>
-            <w:proofErr w:type="spellStart"/>
-            <w:r>
-              <w:t>api</w:t>
-            </w:r>
-            <w:proofErr w:type="spellEnd"/>
-            <w:r>
-              <w:t>/users/profile</w:t>
+              <w:t>/api/users/profile</w:t>
             </w:r>
           </w:p>
         </w:tc>
@@ -752,15 +707,7 @@
           </w:tcPr>
           <w:p>
             <w:r>
-              <w:t>/</w:t>
-            </w:r>
-            <w:proofErr w:type="spellStart"/>
-            <w:r>
-              <w:t>api</w:t>
-            </w:r>
-            <w:proofErr w:type="spellEnd"/>
-            <w:r>
-              <w:t>/users/profile</w:t>
+              <w:t>/api/users/profile</w:t>
             </w:r>
           </w:p>
         </w:tc>
@@ -832,15 +779,7 @@
           </w:tcPr>
           <w:p>
             <w:r>
-              <w:t>{"phone": "...", "</w:t>
-            </w:r>
-            <w:proofErr w:type="spellStart"/>
-            <w:r>
-              <w:t>emergencyContact</w:t>
-            </w:r>
-            <w:proofErr w:type="spellEnd"/>
-            <w:r>
-              <w:t>": "..."}</w:t>
+              <w:t>{"phone": "...", "emergencyContact": "..."}</w:t>
             </w:r>
           </w:p>
         </w:tc>
@@ -897,6 +836,7 @@
                 <w:b/>
                 <w:bCs/>
               </w:rPr>
+              <w:lastRenderedPageBreak/>
               <w:t>GET</w:t>
             </w:r>
           </w:p>
@@ -921,67 +861,54 @@
           </w:tcPr>
           <w:p>
             <w:r>
-              <w:t>/</w:t>
-            </w:r>
-            <w:proofErr w:type="spellStart"/>
-            <w:r>
-              <w:t>api</w:t>
-            </w:r>
-            <w:proofErr w:type="spellEnd"/>
-            <w:r>
-              <w:t>/events</w:t>
-            </w:r>
-          </w:p>
-        </w:tc>
-        <w:tc>
-          <w:tcPr>
-            <w:tcW w:w="0" w:type="auto"/>
-            <w:tcBorders>
-              <w:top w:val="single" w:sz="6" w:space="0" w:color="C4C7C5"/>
-              <w:left w:val="single" w:sz="6" w:space="0" w:color="C4C7C5"/>
-              <w:bottom w:val="single" w:sz="6" w:space="0" w:color="C4C7C5"/>
-              <w:right w:val="single" w:sz="6" w:space="0" w:color="C4C7C5"/>
-            </w:tcBorders>
-            <w:tcMar>
-              <w:top w:w="120" w:type="dxa"/>
-              <w:left w:w="180" w:type="dxa"/>
-              <w:bottom w:w="120" w:type="dxa"/>
-              <w:right w:w="180" w:type="dxa"/>
-            </w:tcMar>
-            <w:vAlign w:val="center"/>
-            <w:hideMark/>
-          </w:tcPr>
-          <w:p>
-            <w:r>
-              <w:t xml:space="preserve">List all upcoming events </w:t>
-            </w:r>
-            <w:r>
-              <w:lastRenderedPageBreak/>
-              <w:t>with filter options</w:t>
-            </w:r>
-          </w:p>
-        </w:tc>
-        <w:tc>
-          <w:tcPr>
-            <w:tcW w:w="0" w:type="auto"/>
-            <w:tcBorders>
-              <w:top w:val="single" w:sz="6" w:space="0" w:color="C4C7C5"/>
-              <w:left w:val="single" w:sz="6" w:space="0" w:color="C4C7C5"/>
-              <w:bottom w:val="single" w:sz="6" w:space="0" w:color="C4C7C5"/>
-              <w:right w:val="single" w:sz="6" w:space="0" w:color="C4C7C5"/>
-            </w:tcBorders>
-            <w:tcMar>
-              <w:top w:w="120" w:type="dxa"/>
-              <w:left w:w="180" w:type="dxa"/>
-              <w:bottom w:w="120" w:type="dxa"/>
-              <w:right w:w="180" w:type="dxa"/>
-            </w:tcMar>
-            <w:vAlign w:val="center"/>
-            <w:hideMark/>
-          </w:tcPr>
-          <w:p>
-            <w:r>
-              <w:lastRenderedPageBreak/>
+              <w:t>/api/events</w:t>
+            </w:r>
+          </w:p>
+        </w:tc>
+        <w:tc>
+          <w:tcPr>
+            <w:tcW w:w="0" w:type="auto"/>
+            <w:tcBorders>
+              <w:top w:val="single" w:sz="6" w:space="0" w:color="C4C7C5"/>
+              <w:left w:val="single" w:sz="6" w:space="0" w:color="C4C7C5"/>
+              <w:bottom w:val="single" w:sz="6" w:space="0" w:color="C4C7C5"/>
+              <w:right w:val="single" w:sz="6" w:space="0" w:color="C4C7C5"/>
+            </w:tcBorders>
+            <w:tcMar>
+              <w:top w:w="120" w:type="dxa"/>
+              <w:left w:w="180" w:type="dxa"/>
+              <w:bottom w:w="120" w:type="dxa"/>
+              <w:right w:w="180" w:type="dxa"/>
+            </w:tcMar>
+            <w:vAlign w:val="center"/>
+            <w:hideMark/>
+          </w:tcPr>
+          <w:p>
+            <w:r>
+              <w:t>List all upcoming events with filter options</w:t>
+            </w:r>
+          </w:p>
+        </w:tc>
+        <w:tc>
+          <w:tcPr>
+            <w:tcW w:w="0" w:type="auto"/>
+            <w:tcBorders>
+              <w:top w:val="single" w:sz="6" w:space="0" w:color="C4C7C5"/>
+              <w:left w:val="single" w:sz="6" w:space="0" w:color="C4C7C5"/>
+              <w:bottom w:val="single" w:sz="6" w:space="0" w:color="C4C7C5"/>
+              <w:right w:val="single" w:sz="6" w:space="0" w:color="C4C7C5"/>
+            </w:tcBorders>
+            <w:tcMar>
+              <w:top w:w="120" w:type="dxa"/>
+              <w:left w:w="180" w:type="dxa"/>
+              <w:bottom w:w="120" w:type="dxa"/>
+              <w:right w:w="180" w:type="dxa"/>
+            </w:tcMar>
+            <w:vAlign w:val="center"/>
+            <w:hideMark/>
+          </w:tcPr>
+          <w:p>
+            <w:r>
               <w:t>None (Public)</w:t>
             </w:r>
           </w:p>
@@ -1030,11 +957,7 @@
           </w:tcPr>
           <w:p>
             <w:r>
-              <w:t xml:space="preserve">200 OK - Array of active </w:t>
-            </w:r>
-            <w:r>
-              <w:lastRenderedPageBreak/>
-              <w:t>Event objects</w:t>
+              <w:t>200 OK - Array of active Event objects</w:t>
             </w:r>
           </w:p>
         </w:tc>
@@ -1067,7 +990,655 @@
                 <w:b/>
                 <w:bCs/>
               </w:rPr>
+              <w:t>POST</w:t>
+            </w:r>
+          </w:p>
+        </w:tc>
+        <w:tc>
+          <w:tcPr>
+            <w:tcW w:w="0" w:type="auto"/>
+            <w:tcBorders>
+              <w:top w:val="single" w:sz="6" w:space="0" w:color="C4C7C5"/>
+              <w:left w:val="single" w:sz="6" w:space="0" w:color="C4C7C5"/>
+              <w:bottom w:val="single" w:sz="6" w:space="0" w:color="C4C7C5"/>
+              <w:right w:val="single" w:sz="6" w:space="0" w:color="C4C7C5"/>
+            </w:tcBorders>
+            <w:tcMar>
+              <w:top w:w="120" w:type="dxa"/>
+              <w:left w:w="180" w:type="dxa"/>
+              <w:bottom w:w="120" w:type="dxa"/>
+              <w:right w:w="180" w:type="dxa"/>
+            </w:tcMar>
+            <w:vAlign w:val="center"/>
+            <w:hideMark/>
+          </w:tcPr>
+          <w:p>
+            <w:r>
+              <w:t>/api/events</w:t>
+            </w:r>
+          </w:p>
+        </w:tc>
+        <w:tc>
+          <w:tcPr>
+            <w:tcW w:w="0" w:type="auto"/>
+            <w:tcBorders>
+              <w:top w:val="single" w:sz="6" w:space="0" w:color="C4C7C5"/>
+              <w:left w:val="single" w:sz="6" w:space="0" w:color="C4C7C5"/>
+              <w:bottom w:val="single" w:sz="6" w:space="0" w:color="C4C7C5"/>
+              <w:right w:val="single" w:sz="6" w:space="0" w:color="C4C7C5"/>
+            </w:tcBorders>
+            <w:tcMar>
+              <w:top w:w="120" w:type="dxa"/>
+              <w:left w:w="180" w:type="dxa"/>
+              <w:bottom w:w="120" w:type="dxa"/>
+              <w:right w:w="180" w:type="dxa"/>
+            </w:tcMar>
+            <w:vAlign w:val="center"/>
+            <w:hideMark/>
+          </w:tcPr>
+          <w:p>
+            <w:r>
+              <w:t>Create a new race event</w:t>
+            </w:r>
+          </w:p>
+        </w:tc>
+        <w:tc>
+          <w:tcPr>
+            <w:tcW w:w="0" w:type="auto"/>
+            <w:tcBorders>
+              <w:top w:val="single" w:sz="6" w:space="0" w:color="C4C7C5"/>
+              <w:left w:val="single" w:sz="6" w:space="0" w:color="C4C7C5"/>
+              <w:bottom w:val="single" w:sz="6" w:space="0" w:color="C4C7C5"/>
+              <w:right w:val="single" w:sz="6" w:space="0" w:color="C4C7C5"/>
+            </w:tcBorders>
+            <w:tcMar>
+              <w:top w:w="120" w:type="dxa"/>
+              <w:left w:w="180" w:type="dxa"/>
+              <w:bottom w:w="120" w:type="dxa"/>
+              <w:right w:w="180" w:type="dxa"/>
+            </w:tcMar>
+            <w:vAlign w:val="center"/>
+            <w:hideMark/>
+          </w:tcPr>
+          <w:p>
+            <w:r>
+              <w:t>Organiser</w:t>
+            </w:r>
+          </w:p>
+        </w:tc>
+        <w:tc>
+          <w:tcPr>
+            <w:tcW w:w="0" w:type="auto"/>
+            <w:tcBorders>
+              <w:top w:val="single" w:sz="6" w:space="0" w:color="C4C7C5"/>
+              <w:left w:val="single" w:sz="6" w:space="0" w:color="C4C7C5"/>
+              <w:bottom w:val="single" w:sz="6" w:space="0" w:color="C4C7C5"/>
+              <w:right w:val="single" w:sz="6" w:space="0" w:color="C4C7C5"/>
+            </w:tcBorders>
+            <w:tcMar>
+              <w:top w:w="120" w:type="dxa"/>
+              <w:left w:w="180" w:type="dxa"/>
+              <w:bottom w:w="120" w:type="dxa"/>
+              <w:right w:w="180" w:type="dxa"/>
+            </w:tcMar>
+            <w:vAlign w:val="center"/>
+            <w:hideMark/>
+          </w:tcPr>
+          <w:p>
+            <w:r>
+              <w:t>{"title": "...", "eventType": "Running", "location": "...", "eventDate": "2026-10-15"}</w:t>
+            </w:r>
+          </w:p>
+        </w:tc>
+        <w:tc>
+          <w:tcPr>
+            <w:tcW w:w="0" w:type="auto"/>
+            <w:tcBorders>
+              <w:top w:val="single" w:sz="6" w:space="0" w:color="C4C7C5"/>
+              <w:left w:val="single" w:sz="6" w:space="0" w:color="C4C7C5"/>
+              <w:bottom w:val="single" w:sz="6" w:space="0" w:color="C4C7C5"/>
+              <w:right w:val="single" w:sz="6" w:space="0" w:color="C4C7C5"/>
+            </w:tcBorders>
+            <w:tcMar>
+              <w:top w:w="120" w:type="dxa"/>
+              <w:left w:w="180" w:type="dxa"/>
+              <w:bottom w:w="120" w:type="dxa"/>
+              <w:right w:w="180" w:type="dxa"/>
+            </w:tcMar>
+            <w:vAlign w:val="center"/>
+            <w:hideMark/>
+          </w:tcPr>
+          <w:p>
+            <w:r>
+              <w:t>201 Created - Created Event details; 403 Forbidden</w:t>
+            </w:r>
+          </w:p>
+        </w:tc>
+      </w:tr>
+      <w:tr>
+        <w:trPr>
+          <w:tblCellSpacing w:w="15" w:type="dxa"/>
+        </w:trPr>
+        <w:tc>
+          <w:tcPr>
+            <w:tcW w:w="0" w:type="auto"/>
+            <w:tcBorders>
+              <w:top w:val="single" w:sz="6" w:space="0" w:color="C4C7C5"/>
+              <w:left w:val="single" w:sz="6" w:space="0" w:color="C4C7C5"/>
+              <w:bottom w:val="single" w:sz="6" w:space="0" w:color="C4C7C5"/>
+              <w:right w:val="single" w:sz="6" w:space="0" w:color="C4C7C5"/>
+            </w:tcBorders>
+            <w:tcMar>
+              <w:top w:w="120" w:type="dxa"/>
+              <w:left w:w="180" w:type="dxa"/>
+              <w:bottom w:w="120" w:type="dxa"/>
+              <w:right w:w="180" w:type="dxa"/>
+            </w:tcMar>
+            <w:vAlign w:val="center"/>
+            <w:hideMark/>
+          </w:tcPr>
+          <w:p>
+            <w:r>
+              <w:rPr>
+                <w:b/>
+                <w:bCs/>
+              </w:rPr>
+              <w:t>GET</w:t>
+            </w:r>
+          </w:p>
+        </w:tc>
+        <w:tc>
+          <w:tcPr>
+            <w:tcW w:w="0" w:type="auto"/>
+            <w:tcBorders>
+              <w:top w:val="single" w:sz="6" w:space="0" w:color="C4C7C5"/>
+              <w:left w:val="single" w:sz="6" w:space="0" w:color="C4C7C5"/>
+              <w:bottom w:val="single" w:sz="6" w:space="0" w:color="C4C7C5"/>
+              <w:right w:val="single" w:sz="6" w:space="0" w:color="C4C7C5"/>
+            </w:tcBorders>
+            <w:tcMar>
+              <w:top w:w="120" w:type="dxa"/>
+              <w:left w:w="180" w:type="dxa"/>
+              <w:bottom w:w="120" w:type="dxa"/>
+              <w:right w:w="180" w:type="dxa"/>
+            </w:tcMar>
+            <w:vAlign w:val="center"/>
+            <w:hideMark/>
+          </w:tcPr>
+          <w:p>
+            <w:r>
+              <w:t>/</w:t>
+            </w:r>
+            <w:proofErr w:type="gramStart"/>
+            <w:r>
+              <w:t>api</w:t>
+            </w:r>
+            <w:proofErr w:type="gramEnd"/>
+            <w:r>
+              <w:t>/events/{id}</w:t>
+            </w:r>
+          </w:p>
+        </w:tc>
+        <w:tc>
+          <w:tcPr>
+            <w:tcW w:w="0" w:type="auto"/>
+            <w:tcBorders>
+              <w:top w:val="single" w:sz="6" w:space="0" w:color="C4C7C5"/>
+              <w:left w:val="single" w:sz="6" w:space="0" w:color="C4C7C5"/>
+              <w:bottom w:val="single" w:sz="6" w:space="0" w:color="C4C7C5"/>
+              <w:right w:val="single" w:sz="6" w:space="0" w:color="C4C7C5"/>
+            </w:tcBorders>
+            <w:tcMar>
+              <w:top w:w="120" w:type="dxa"/>
+              <w:left w:w="180" w:type="dxa"/>
+              <w:bottom w:w="120" w:type="dxa"/>
+              <w:right w:w="180" w:type="dxa"/>
+            </w:tcMar>
+            <w:vAlign w:val="center"/>
+            <w:hideMark/>
+          </w:tcPr>
+          <w:p>
+            <w:r>
+              <w:t>Get event details, weather, and categories</w:t>
+            </w:r>
+          </w:p>
+        </w:tc>
+        <w:tc>
+          <w:tcPr>
+            <w:tcW w:w="0" w:type="auto"/>
+            <w:tcBorders>
+              <w:top w:val="single" w:sz="6" w:space="0" w:color="C4C7C5"/>
+              <w:left w:val="single" w:sz="6" w:space="0" w:color="C4C7C5"/>
+              <w:bottom w:val="single" w:sz="6" w:space="0" w:color="C4C7C5"/>
+              <w:right w:val="single" w:sz="6" w:space="0" w:color="C4C7C5"/>
+            </w:tcBorders>
+            <w:tcMar>
+              <w:top w:w="120" w:type="dxa"/>
+              <w:left w:w="180" w:type="dxa"/>
+              <w:bottom w:w="120" w:type="dxa"/>
+              <w:right w:w="180" w:type="dxa"/>
+            </w:tcMar>
+            <w:vAlign w:val="center"/>
+            <w:hideMark/>
+          </w:tcPr>
+          <w:p>
+            <w:r>
+              <w:t>None (Public)</w:t>
+            </w:r>
+          </w:p>
+        </w:tc>
+        <w:tc>
+          <w:tcPr>
+            <w:tcW w:w="0" w:type="auto"/>
+            <w:tcBorders>
+              <w:top w:val="single" w:sz="6" w:space="0" w:color="C4C7C5"/>
+              <w:left w:val="single" w:sz="6" w:space="0" w:color="C4C7C5"/>
+              <w:bottom w:val="single" w:sz="6" w:space="0" w:color="C4C7C5"/>
+              <w:right w:val="single" w:sz="6" w:space="0" w:color="C4C7C5"/>
+            </w:tcBorders>
+            <w:tcMar>
+              <w:top w:w="120" w:type="dxa"/>
+              <w:left w:w="180" w:type="dxa"/>
+              <w:bottom w:w="120" w:type="dxa"/>
+              <w:right w:w="180" w:type="dxa"/>
+            </w:tcMar>
+            <w:vAlign w:val="center"/>
+            <w:hideMark/>
+          </w:tcPr>
+          <w:p>
+            <w:r>
+              <w:t>None</w:t>
+            </w:r>
+          </w:p>
+        </w:tc>
+        <w:tc>
+          <w:tcPr>
+            <w:tcW w:w="0" w:type="auto"/>
+            <w:tcBorders>
+              <w:top w:val="single" w:sz="6" w:space="0" w:color="C4C7C5"/>
+              <w:left w:val="single" w:sz="6" w:space="0" w:color="C4C7C5"/>
+              <w:bottom w:val="single" w:sz="6" w:space="0" w:color="C4C7C5"/>
+              <w:right w:val="single" w:sz="6" w:space="0" w:color="C4C7C5"/>
+            </w:tcBorders>
+            <w:tcMar>
+              <w:top w:w="120" w:type="dxa"/>
+              <w:left w:w="180" w:type="dxa"/>
+              <w:bottom w:w="120" w:type="dxa"/>
+              <w:right w:w="180" w:type="dxa"/>
+            </w:tcMar>
+            <w:vAlign w:val="center"/>
+            <w:hideMark/>
+          </w:tcPr>
+          <w:p>
+            <w:r>
+              <w:t>200 OK - Event object with nested categories</w:t>
+            </w:r>
+          </w:p>
+        </w:tc>
+      </w:tr>
+      <w:tr>
+        <w:trPr>
+          <w:tblCellSpacing w:w="15" w:type="dxa"/>
+        </w:trPr>
+        <w:tc>
+          <w:tcPr>
+            <w:tcW w:w="0" w:type="auto"/>
+            <w:tcBorders>
+              <w:top w:val="single" w:sz="6" w:space="0" w:color="C4C7C5"/>
+              <w:left w:val="single" w:sz="6" w:space="0" w:color="C4C7C5"/>
+              <w:bottom w:val="single" w:sz="6" w:space="0" w:color="C4C7C5"/>
+              <w:right w:val="single" w:sz="6" w:space="0" w:color="C4C7C5"/>
+            </w:tcBorders>
+            <w:tcMar>
+              <w:top w:w="120" w:type="dxa"/>
+              <w:left w:w="180" w:type="dxa"/>
+              <w:bottom w:w="120" w:type="dxa"/>
+              <w:right w:w="180" w:type="dxa"/>
+            </w:tcMar>
+            <w:vAlign w:val="center"/>
+            <w:hideMark/>
+          </w:tcPr>
+          <w:p>
+            <w:r>
+              <w:rPr>
+                <w:b/>
+                <w:bCs/>
+              </w:rPr>
+              <w:t>POST</w:t>
+            </w:r>
+          </w:p>
+        </w:tc>
+        <w:tc>
+          <w:tcPr>
+            <w:tcW w:w="0" w:type="auto"/>
+            <w:tcBorders>
+              <w:top w:val="single" w:sz="6" w:space="0" w:color="C4C7C5"/>
+              <w:left w:val="single" w:sz="6" w:space="0" w:color="C4C7C5"/>
+              <w:bottom w:val="single" w:sz="6" w:space="0" w:color="C4C7C5"/>
+              <w:right w:val="single" w:sz="6" w:space="0" w:color="C4C7C5"/>
+            </w:tcBorders>
+            <w:tcMar>
+              <w:top w:w="120" w:type="dxa"/>
+              <w:left w:w="180" w:type="dxa"/>
+              <w:bottom w:w="120" w:type="dxa"/>
+              <w:right w:w="180" w:type="dxa"/>
+            </w:tcMar>
+            <w:vAlign w:val="center"/>
+            <w:hideMark/>
+          </w:tcPr>
+          <w:p>
+            <w:r>
+              <w:t>/</w:t>
+            </w:r>
+            <w:proofErr w:type="gramStart"/>
+            <w:r>
+              <w:t>api</w:t>
+            </w:r>
+            <w:proofErr w:type="gramEnd"/>
+            <w:r>
+              <w:t>/events/{id}/categories</w:t>
+            </w:r>
+          </w:p>
+        </w:tc>
+        <w:tc>
+          <w:tcPr>
+            <w:tcW w:w="0" w:type="auto"/>
+            <w:tcBorders>
+              <w:top w:val="single" w:sz="6" w:space="0" w:color="C4C7C5"/>
+              <w:left w:val="single" w:sz="6" w:space="0" w:color="C4C7C5"/>
+              <w:bottom w:val="single" w:sz="6" w:space="0" w:color="C4C7C5"/>
+              <w:right w:val="single" w:sz="6" w:space="0" w:color="C4C7C5"/>
+            </w:tcBorders>
+            <w:tcMar>
+              <w:top w:w="120" w:type="dxa"/>
+              <w:left w:w="180" w:type="dxa"/>
+              <w:bottom w:w="120" w:type="dxa"/>
+              <w:right w:w="180" w:type="dxa"/>
+            </w:tcMar>
+            <w:vAlign w:val="center"/>
+            <w:hideMark/>
+          </w:tcPr>
+          <w:p>
+            <w:r>
+              <w:t>Add a distance category to an event</w:t>
+            </w:r>
+          </w:p>
+        </w:tc>
+        <w:tc>
+          <w:tcPr>
+            <w:tcW w:w="0" w:type="auto"/>
+            <w:tcBorders>
+              <w:top w:val="single" w:sz="6" w:space="0" w:color="C4C7C5"/>
+              <w:left w:val="single" w:sz="6" w:space="0" w:color="C4C7C5"/>
+              <w:bottom w:val="single" w:sz="6" w:space="0" w:color="C4C7C5"/>
+              <w:right w:val="single" w:sz="6" w:space="0" w:color="C4C7C5"/>
+            </w:tcBorders>
+            <w:tcMar>
+              <w:top w:w="120" w:type="dxa"/>
+              <w:left w:w="180" w:type="dxa"/>
+              <w:bottom w:w="120" w:type="dxa"/>
+              <w:right w:w="180" w:type="dxa"/>
+            </w:tcMar>
+            <w:vAlign w:val="center"/>
+            <w:hideMark/>
+          </w:tcPr>
+          <w:p>
+            <w:r>
+              <w:t>Organiser</w:t>
+            </w:r>
+          </w:p>
+        </w:tc>
+        <w:tc>
+          <w:tcPr>
+            <w:tcW w:w="0" w:type="auto"/>
+            <w:tcBorders>
+              <w:top w:val="single" w:sz="6" w:space="0" w:color="C4C7C5"/>
+              <w:left w:val="single" w:sz="6" w:space="0" w:color="C4C7C5"/>
+              <w:bottom w:val="single" w:sz="6" w:space="0" w:color="C4C7C5"/>
+              <w:right w:val="single" w:sz="6" w:space="0" w:color="C4C7C5"/>
+            </w:tcBorders>
+            <w:tcMar>
+              <w:top w:w="120" w:type="dxa"/>
+              <w:left w:w="180" w:type="dxa"/>
+              <w:bottom w:w="120" w:type="dxa"/>
+              <w:right w:w="180" w:type="dxa"/>
+            </w:tcMar>
+            <w:vAlign w:val="center"/>
+            <w:hideMark/>
+          </w:tcPr>
+          <w:p>
+            <w:r>
+              <w:t xml:space="preserve">{"categoryName": "21km Half", "distanceKm": 21.1, "entryFee": </w:t>
+            </w:r>
+            <w:r>
               <w:lastRenderedPageBreak/>
+              <w:t>250.00, "maxCapacity": 500}</w:t>
+            </w:r>
+          </w:p>
+        </w:tc>
+        <w:tc>
+          <w:tcPr>
+            <w:tcW w:w="0" w:type="auto"/>
+            <w:tcBorders>
+              <w:top w:val="single" w:sz="6" w:space="0" w:color="C4C7C5"/>
+              <w:left w:val="single" w:sz="6" w:space="0" w:color="C4C7C5"/>
+              <w:bottom w:val="single" w:sz="6" w:space="0" w:color="C4C7C5"/>
+              <w:right w:val="single" w:sz="6" w:space="0" w:color="C4C7C5"/>
+            </w:tcBorders>
+            <w:tcMar>
+              <w:top w:w="120" w:type="dxa"/>
+              <w:left w:w="180" w:type="dxa"/>
+              <w:bottom w:w="120" w:type="dxa"/>
+              <w:right w:w="180" w:type="dxa"/>
+            </w:tcMar>
+            <w:vAlign w:val="center"/>
+            <w:hideMark/>
+          </w:tcPr>
+          <w:p>
+            <w:r>
+              <w:lastRenderedPageBreak/>
+              <w:t>201 Created - Category object</w:t>
+            </w:r>
+          </w:p>
+        </w:tc>
+      </w:tr>
+      <w:tr>
+        <w:trPr>
+          <w:tblCellSpacing w:w="15" w:type="dxa"/>
+        </w:trPr>
+        <w:tc>
+          <w:tcPr>
+            <w:tcW w:w="0" w:type="auto"/>
+            <w:tcBorders>
+              <w:top w:val="single" w:sz="6" w:space="0" w:color="C4C7C5"/>
+              <w:left w:val="single" w:sz="6" w:space="0" w:color="C4C7C5"/>
+              <w:bottom w:val="single" w:sz="6" w:space="0" w:color="C4C7C5"/>
+              <w:right w:val="single" w:sz="6" w:space="0" w:color="C4C7C5"/>
+            </w:tcBorders>
+            <w:tcMar>
+              <w:top w:w="120" w:type="dxa"/>
+              <w:left w:w="180" w:type="dxa"/>
+              <w:bottom w:w="120" w:type="dxa"/>
+              <w:right w:w="180" w:type="dxa"/>
+            </w:tcMar>
+            <w:vAlign w:val="center"/>
+            <w:hideMark/>
+          </w:tcPr>
+          <w:p>
+            <w:r>
+              <w:rPr>
+                <w:b/>
+                <w:bCs/>
+              </w:rPr>
+              <w:t>GET</w:t>
+            </w:r>
+          </w:p>
+        </w:tc>
+        <w:tc>
+          <w:tcPr>
+            <w:tcW w:w="0" w:type="auto"/>
+            <w:tcBorders>
+              <w:top w:val="single" w:sz="6" w:space="0" w:color="C4C7C5"/>
+              <w:left w:val="single" w:sz="6" w:space="0" w:color="C4C7C5"/>
+              <w:bottom w:val="single" w:sz="6" w:space="0" w:color="C4C7C5"/>
+              <w:right w:val="single" w:sz="6" w:space="0" w:color="C4C7C5"/>
+            </w:tcBorders>
+            <w:tcMar>
+              <w:top w:w="120" w:type="dxa"/>
+              <w:left w:w="180" w:type="dxa"/>
+              <w:bottom w:w="120" w:type="dxa"/>
+              <w:right w:w="180" w:type="dxa"/>
+            </w:tcMar>
+            <w:vAlign w:val="center"/>
+            <w:hideMark/>
+          </w:tcPr>
+          <w:p>
+            <w:r>
+              <w:t>/</w:t>
+            </w:r>
+            <w:proofErr w:type="gramStart"/>
+            <w:r>
+              <w:t>api</w:t>
+            </w:r>
+            <w:proofErr w:type="gramEnd"/>
+            <w:r>
+              <w:t>/</w:t>
+            </w:r>
+            <w:proofErr w:type="gramStart"/>
+            <w:r>
+              <w:t>events/{id}/</w:t>
+            </w:r>
+            <w:proofErr w:type="gramEnd"/>
+            <w:r>
+              <w:t>categories</w:t>
+            </w:r>
+          </w:p>
+        </w:tc>
+        <w:tc>
+          <w:tcPr>
+            <w:tcW w:w="0" w:type="auto"/>
+            <w:tcBorders>
+              <w:top w:val="single" w:sz="6" w:space="0" w:color="C4C7C5"/>
+              <w:left w:val="single" w:sz="6" w:space="0" w:color="C4C7C5"/>
+              <w:bottom w:val="single" w:sz="6" w:space="0" w:color="C4C7C5"/>
+              <w:right w:val="single" w:sz="6" w:space="0" w:color="C4C7C5"/>
+            </w:tcBorders>
+            <w:tcMar>
+              <w:top w:w="120" w:type="dxa"/>
+              <w:left w:w="180" w:type="dxa"/>
+              <w:bottom w:w="120" w:type="dxa"/>
+              <w:right w:w="180" w:type="dxa"/>
+            </w:tcMar>
+            <w:vAlign w:val="center"/>
+            <w:hideMark/>
+          </w:tcPr>
+          <w:p>
+            <w:r>
+              <w:t>Get all categories for a specific event</w:t>
+            </w:r>
+          </w:p>
+        </w:tc>
+        <w:tc>
+          <w:tcPr>
+            <w:tcW w:w="0" w:type="auto"/>
+            <w:tcBorders>
+              <w:top w:val="single" w:sz="6" w:space="0" w:color="C4C7C5"/>
+              <w:left w:val="single" w:sz="6" w:space="0" w:color="C4C7C5"/>
+              <w:bottom w:val="single" w:sz="6" w:space="0" w:color="C4C7C5"/>
+              <w:right w:val="single" w:sz="6" w:space="0" w:color="C4C7C5"/>
+            </w:tcBorders>
+            <w:tcMar>
+              <w:top w:w="120" w:type="dxa"/>
+              <w:left w:w="180" w:type="dxa"/>
+              <w:bottom w:w="120" w:type="dxa"/>
+              <w:right w:w="180" w:type="dxa"/>
+            </w:tcMar>
+            <w:vAlign w:val="center"/>
+            <w:hideMark/>
+          </w:tcPr>
+          <w:p>
+            <w:r>
+              <w:t>None (Public)</w:t>
+            </w:r>
+          </w:p>
+        </w:tc>
+        <w:tc>
+          <w:tcPr>
+            <w:tcW w:w="0" w:type="auto"/>
+            <w:tcBorders>
+              <w:top w:val="single" w:sz="6" w:space="0" w:color="C4C7C5"/>
+              <w:left w:val="single" w:sz="6" w:space="0" w:color="C4C7C5"/>
+              <w:bottom w:val="single" w:sz="6" w:space="0" w:color="C4C7C5"/>
+              <w:right w:val="single" w:sz="6" w:space="0" w:color="C4C7C5"/>
+            </w:tcBorders>
+            <w:tcMar>
+              <w:top w:w="120" w:type="dxa"/>
+              <w:left w:w="180" w:type="dxa"/>
+              <w:bottom w:w="120" w:type="dxa"/>
+              <w:right w:w="180" w:type="dxa"/>
+            </w:tcMar>
+            <w:vAlign w:val="center"/>
+            <w:hideMark/>
+          </w:tcPr>
+          <w:p>
+            <w:r>
+              <w:t>None</w:t>
+            </w:r>
+          </w:p>
+        </w:tc>
+        <w:tc>
+          <w:tcPr>
+            <w:tcW w:w="0" w:type="auto"/>
+            <w:tcBorders>
+              <w:top w:val="single" w:sz="6" w:space="0" w:color="C4C7C5"/>
+              <w:left w:val="single" w:sz="6" w:space="0" w:color="C4C7C5"/>
+              <w:bottom w:val="single" w:sz="6" w:space="0" w:color="C4C7C5"/>
+              <w:right w:val="single" w:sz="6" w:space="0" w:color="C4C7C5"/>
+            </w:tcBorders>
+            <w:tcMar>
+              <w:top w:w="120" w:type="dxa"/>
+              <w:left w:w="180" w:type="dxa"/>
+              <w:bottom w:w="120" w:type="dxa"/>
+              <w:right w:w="180" w:type="dxa"/>
+            </w:tcMar>
+            <w:vAlign w:val="center"/>
+            <w:hideMark/>
+          </w:tcPr>
+          <w:p>
+            <w:r>
+              <w:t>200 OK - Array of Category objects</w:t>
+            </w:r>
+          </w:p>
+        </w:tc>
+      </w:tr>
+      <w:tr>
+        <w:trPr>
+          <w:tblCellSpacing w:w="15" w:type="dxa"/>
+        </w:trPr>
+        <w:tc>
+          <w:tcPr>
+            <w:tcW w:w="0" w:type="auto"/>
+            <w:tcBorders>
+              <w:top w:val="single" w:sz="6" w:space="0" w:color="C4C7C5"/>
+              <w:left w:val="single" w:sz="6" w:space="0" w:color="C4C7C5"/>
+              <w:bottom w:val="single" w:sz="6" w:space="0" w:color="C4C7C5"/>
+              <w:right w:val="single" w:sz="6" w:space="0" w:color="C4C7C5"/>
+            </w:tcBorders>
+            <w:tcMar>
+              <w:top w:w="120" w:type="dxa"/>
+              <w:left w:w="180" w:type="dxa"/>
+              <w:bottom w:w="120" w:type="dxa"/>
+              <w:right w:w="180" w:type="dxa"/>
+            </w:tcMar>
+            <w:vAlign w:val="center"/>
+            <w:hideMark/>
+          </w:tcPr>
+          <w:p>
+            <w:r>
+              <w:rPr>
+                <w:b/>
+                <w:bCs/>
+              </w:rPr>
               <w:t>POST</w:t>
             </w:r>
           </w:p>
@@ -1092,129 +1663,103 @@
           </w:tcPr>
           <w:p>
             <w:r>
-              <w:t>/</w:t>
-            </w:r>
-            <w:proofErr w:type="spellStart"/>
-            <w:r>
-              <w:t>api</w:t>
-            </w:r>
-            <w:proofErr w:type="spellEnd"/>
-            <w:r>
-              <w:t>/events</w:t>
-            </w:r>
-          </w:p>
-        </w:tc>
-        <w:tc>
-          <w:tcPr>
-            <w:tcW w:w="0" w:type="auto"/>
-            <w:tcBorders>
-              <w:top w:val="single" w:sz="6" w:space="0" w:color="C4C7C5"/>
-              <w:left w:val="single" w:sz="6" w:space="0" w:color="C4C7C5"/>
-              <w:bottom w:val="single" w:sz="6" w:space="0" w:color="C4C7C5"/>
-              <w:right w:val="single" w:sz="6" w:space="0" w:color="C4C7C5"/>
-            </w:tcBorders>
-            <w:tcMar>
-              <w:top w:w="120" w:type="dxa"/>
-              <w:left w:w="180" w:type="dxa"/>
-              <w:bottom w:w="120" w:type="dxa"/>
-              <w:right w:w="180" w:type="dxa"/>
-            </w:tcMar>
-            <w:vAlign w:val="center"/>
-            <w:hideMark/>
-          </w:tcPr>
-          <w:p>
-            <w:r>
-              <w:t>Create a new race event</w:t>
-            </w:r>
-          </w:p>
-        </w:tc>
-        <w:tc>
-          <w:tcPr>
-            <w:tcW w:w="0" w:type="auto"/>
-            <w:tcBorders>
-              <w:top w:val="single" w:sz="6" w:space="0" w:color="C4C7C5"/>
-              <w:left w:val="single" w:sz="6" w:space="0" w:color="C4C7C5"/>
-              <w:bottom w:val="single" w:sz="6" w:space="0" w:color="C4C7C5"/>
-              <w:right w:val="single" w:sz="6" w:space="0" w:color="C4C7C5"/>
-            </w:tcBorders>
-            <w:tcMar>
-              <w:top w:w="120" w:type="dxa"/>
-              <w:left w:w="180" w:type="dxa"/>
-              <w:bottom w:w="120" w:type="dxa"/>
-              <w:right w:w="180" w:type="dxa"/>
-            </w:tcMar>
-            <w:vAlign w:val="center"/>
-            <w:hideMark/>
-          </w:tcPr>
-          <w:p>
-            <w:proofErr w:type="spellStart"/>
-            <w:r>
-              <w:t>Organiser</w:t>
-            </w:r>
-            <w:proofErr w:type="spellEnd"/>
-          </w:p>
-        </w:tc>
-        <w:tc>
-          <w:tcPr>
-            <w:tcW w:w="0" w:type="auto"/>
-            <w:tcBorders>
-              <w:top w:val="single" w:sz="6" w:space="0" w:color="C4C7C5"/>
-              <w:left w:val="single" w:sz="6" w:space="0" w:color="C4C7C5"/>
-              <w:bottom w:val="single" w:sz="6" w:space="0" w:color="C4C7C5"/>
-              <w:right w:val="single" w:sz="6" w:space="0" w:color="C4C7C5"/>
-            </w:tcBorders>
-            <w:tcMar>
-              <w:top w:w="120" w:type="dxa"/>
-              <w:left w:w="180" w:type="dxa"/>
-              <w:bottom w:w="120" w:type="dxa"/>
-              <w:right w:w="180" w:type="dxa"/>
-            </w:tcMar>
-            <w:vAlign w:val="center"/>
-            <w:hideMark/>
-          </w:tcPr>
-          <w:p>
-            <w:r>
-              <w:t>{"title": "...", "</w:t>
-            </w:r>
-            <w:proofErr w:type="spellStart"/>
-            <w:r>
-              <w:t>eventType</w:t>
-            </w:r>
-            <w:proofErr w:type="spellEnd"/>
-            <w:r>
-              <w:t>": "Running", "location": "...", "</w:t>
-            </w:r>
-            <w:proofErr w:type="spellStart"/>
-            <w:r>
-              <w:t>eventDate</w:t>
-            </w:r>
-            <w:proofErr w:type="spellEnd"/>
-            <w:r>
-              <w:t>": "2026-10-15"}</w:t>
-            </w:r>
-          </w:p>
-        </w:tc>
-        <w:tc>
-          <w:tcPr>
-            <w:tcW w:w="0" w:type="auto"/>
-            <w:tcBorders>
-              <w:top w:val="single" w:sz="6" w:space="0" w:color="C4C7C5"/>
-              <w:left w:val="single" w:sz="6" w:space="0" w:color="C4C7C5"/>
-              <w:bottom w:val="single" w:sz="6" w:space="0" w:color="C4C7C5"/>
-              <w:right w:val="single" w:sz="6" w:space="0" w:color="C4C7C5"/>
-            </w:tcBorders>
-            <w:tcMar>
-              <w:top w:w="120" w:type="dxa"/>
-              <w:left w:w="180" w:type="dxa"/>
-              <w:bottom w:w="120" w:type="dxa"/>
-              <w:right w:w="180" w:type="dxa"/>
-            </w:tcMar>
-            <w:vAlign w:val="center"/>
-            <w:hideMark/>
-          </w:tcPr>
-          <w:p>
-            <w:r>
-              <w:t>201 Created - Created Event details; 403 Forbidden</w:t>
+              <w:t>/api/enrolments</w:t>
+            </w:r>
+          </w:p>
+        </w:tc>
+        <w:tc>
+          <w:tcPr>
+            <w:tcW w:w="0" w:type="auto"/>
+            <w:tcBorders>
+              <w:top w:val="single" w:sz="6" w:space="0" w:color="C4C7C5"/>
+              <w:left w:val="single" w:sz="6" w:space="0" w:color="C4C7C5"/>
+              <w:bottom w:val="single" w:sz="6" w:space="0" w:color="C4C7C5"/>
+              <w:right w:val="single" w:sz="6" w:space="0" w:color="C4C7C5"/>
+            </w:tcBorders>
+            <w:tcMar>
+              <w:top w:w="120" w:type="dxa"/>
+              <w:left w:w="180" w:type="dxa"/>
+              <w:bottom w:w="120" w:type="dxa"/>
+              <w:right w:w="180" w:type="dxa"/>
+            </w:tcMar>
+            <w:vAlign w:val="center"/>
+            <w:hideMark/>
+          </w:tcPr>
+          <w:p>
+            <w:r>
+              <w:t>Register a participant for a race category</w:t>
+            </w:r>
+          </w:p>
+        </w:tc>
+        <w:tc>
+          <w:tcPr>
+            <w:tcW w:w="0" w:type="auto"/>
+            <w:tcBorders>
+              <w:top w:val="single" w:sz="6" w:space="0" w:color="C4C7C5"/>
+              <w:left w:val="single" w:sz="6" w:space="0" w:color="C4C7C5"/>
+              <w:bottom w:val="single" w:sz="6" w:space="0" w:color="C4C7C5"/>
+              <w:right w:val="single" w:sz="6" w:space="0" w:color="C4C7C5"/>
+            </w:tcBorders>
+            <w:tcMar>
+              <w:top w:w="120" w:type="dxa"/>
+              <w:left w:w="180" w:type="dxa"/>
+              <w:bottom w:w="120" w:type="dxa"/>
+              <w:right w:w="180" w:type="dxa"/>
+            </w:tcMar>
+            <w:vAlign w:val="center"/>
+            <w:hideMark/>
+          </w:tcPr>
+          <w:p>
+            <w:r>
+              <w:t>Participant</w:t>
+            </w:r>
+          </w:p>
+        </w:tc>
+        <w:tc>
+          <w:tcPr>
+            <w:tcW w:w="0" w:type="auto"/>
+            <w:tcBorders>
+              <w:top w:val="single" w:sz="6" w:space="0" w:color="C4C7C5"/>
+              <w:left w:val="single" w:sz="6" w:space="0" w:color="C4C7C5"/>
+              <w:bottom w:val="single" w:sz="6" w:space="0" w:color="C4C7C5"/>
+              <w:right w:val="single" w:sz="6" w:space="0" w:color="C4C7C5"/>
+            </w:tcBorders>
+            <w:tcMar>
+              <w:top w:w="120" w:type="dxa"/>
+              <w:left w:w="180" w:type="dxa"/>
+              <w:bottom w:w="120" w:type="dxa"/>
+              <w:right w:w="180" w:type="dxa"/>
+            </w:tcMar>
+            <w:vAlign w:val="center"/>
+            <w:hideMark/>
+          </w:tcPr>
+          <w:p>
+            <w:r>
+              <w:t>{"eventID": 1, "categoryID": 2}</w:t>
+            </w:r>
+          </w:p>
+        </w:tc>
+        <w:tc>
+          <w:tcPr>
+            <w:tcW w:w="0" w:type="auto"/>
+            <w:tcBorders>
+              <w:top w:val="single" w:sz="6" w:space="0" w:color="C4C7C5"/>
+              <w:left w:val="single" w:sz="6" w:space="0" w:color="C4C7C5"/>
+              <w:bottom w:val="single" w:sz="6" w:space="0" w:color="C4C7C5"/>
+              <w:right w:val="single" w:sz="6" w:space="0" w:color="C4C7C5"/>
+            </w:tcBorders>
+            <w:tcMar>
+              <w:top w:w="120" w:type="dxa"/>
+              <w:left w:w="180" w:type="dxa"/>
+              <w:bottom w:w="120" w:type="dxa"/>
+              <w:right w:w="180" w:type="dxa"/>
+            </w:tcMar>
+            <w:vAlign w:val="center"/>
+            <w:hideMark/>
+          </w:tcPr>
+          <w:p>
+            <w:r>
+              <w:t>201 Created - Enrolment details with generated BibNumber; 409 Conflict (Already entered)</w:t>
             </w:r>
           </w:p>
         </w:tc>

</xml_diff>

<commit_message>
Add participant registration and enrolment routes
</commit_message>
<xml_diff>
--- a/doc/API Endpoint Plan.docx
+++ b/doc/API Endpoint Plan.docx
@@ -248,31 +248,44 @@
           </w:tcPr>
           <w:p>
             <w:r>
-              <w:t>/api/auth/register</w:t>
-            </w:r>
-          </w:p>
-        </w:tc>
-        <w:tc>
-          <w:tcPr>
-            <w:tcW w:w="0" w:type="auto"/>
-            <w:tcBorders>
-              <w:top w:val="single" w:sz="6" w:space="0" w:color="C4C7C5"/>
-              <w:left w:val="single" w:sz="6" w:space="0" w:color="C4C7C5"/>
-              <w:bottom w:val="single" w:sz="6" w:space="0" w:color="C4C7C5"/>
-              <w:right w:val="single" w:sz="6" w:space="0" w:color="C4C7C5"/>
-            </w:tcBorders>
-            <w:tcMar>
-              <w:top w:w="120" w:type="dxa"/>
-              <w:left w:w="180" w:type="dxa"/>
-              <w:bottom w:w="120" w:type="dxa"/>
-              <w:right w:w="180" w:type="dxa"/>
-            </w:tcMar>
-            <w:vAlign w:val="center"/>
-            <w:hideMark/>
-          </w:tcPr>
-          <w:p>
-            <w:r>
-              <w:t>Register a new user account</w:t>
+              <w:t>/</w:t>
+            </w:r>
+            <w:proofErr w:type="spellStart"/>
+            <w:r>
+              <w:t>api</w:t>
+            </w:r>
+            <w:proofErr w:type="spellEnd"/>
+            <w:r>
+              <w:t>/auth/register</w:t>
+            </w:r>
+          </w:p>
+        </w:tc>
+        <w:tc>
+          <w:tcPr>
+            <w:tcW w:w="0" w:type="auto"/>
+            <w:tcBorders>
+              <w:top w:val="single" w:sz="6" w:space="0" w:color="C4C7C5"/>
+              <w:left w:val="single" w:sz="6" w:space="0" w:color="C4C7C5"/>
+              <w:bottom w:val="single" w:sz="6" w:space="0" w:color="C4C7C5"/>
+              <w:right w:val="single" w:sz="6" w:space="0" w:color="C4C7C5"/>
+            </w:tcBorders>
+            <w:tcMar>
+              <w:top w:w="120" w:type="dxa"/>
+              <w:left w:w="180" w:type="dxa"/>
+              <w:bottom w:w="120" w:type="dxa"/>
+              <w:right w:w="180" w:type="dxa"/>
+            </w:tcMar>
+            <w:vAlign w:val="center"/>
+            <w:hideMark/>
+          </w:tcPr>
+          <w:p>
+            <w:proofErr w:type="gramStart"/>
+            <w:r>
+              <w:t>Register</w:t>
+            </w:r>
+            <w:proofErr w:type="gramEnd"/>
+            <w:r>
+              <w:t xml:space="preserve"> a new user account</w:t>
             </w:r>
           </w:p>
         </w:tc>
@@ -320,7 +333,23 @@
           </w:tcPr>
           <w:p>
             <w:r>
-              <w:t>{"fullName": "...", "email": "...", "password": "...", "idNumber": "...", "role": "Participant"}</w:t>
+              <w:t>{"</w:t>
+            </w:r>
+            <w:proofErr w:type="spellStart"/>
+            <w:r>
+              <w:t>fullName</w:t>
+            </w:r>
+            <w:proofErr w:type="spellEnd"/>
+            <w:r>
+              <w:t>": "...", "email": "...", "password": "...", "</w:t>
+            </w:r>
+            <w:proofErr w:type="spellStart"/>
+            <w:r>
+              <w:t>idNumber</w:t>
+            </w:r>
+            <w:proofErr w:type="spellEnd"/>
+            <w:r>
+              <w:t>": "...", "role": "Participant"}</w:t>
             </w:r>
           </w:p>
         </w:tc>
@@ -401,7 +430,15 @@
           </w:tcPr>
           <w:p>
             <w:r>
-              <w:t>/api/auth/login</w:t>
+              <w:t>/</w:t>
+            </w:r>
+            <w:proofErr w:type="spellStart"/>
+            <w:r>
+              <w:t>api</w:t>
+            </w:r>
+            <w:proofErr w:type="spellEnd"/>
+            <w:r>
+              <w:t>/auth/login</w:t>
             </w:r>
           </w:p>
         </w:tc>
@@ -554,7 +591,15 @@
           </w:tcPr>
           <w:p>
             <w:r>
-              <w:t>/api/users/profile</w:t>
+              <w:t>/</w:t>
+            </w:r>
+            <w:proofErr w:type="spellStart"/>
+            <w:r>
+              <w:t>api</w:t>
+            </w:r>
+            <w:proofErr w:type="spellEnd"/>
+            <w:r>
+              <w:t>/users/profile</w:t>
             </w:r>
           </w:p>
         </w:tc>
@@ -707,7 +752,15 @@
           </w:tcPr>
           <w:p>
             <w:r>
-              <w:t>/api/users/profile</w:t>
+              <w:t>/</w:t>
+            </w:r>
+            <w:proofErr w:type="spellStart"/>
+            <w:r>
+              <w:t>api</w:t>
+            </w:r>
+            <w:proofErr w:type="spellEnd"/>
+            <w:r>
+              <w:t>/users/profile</w:t>
             </w:r>
           </w:p>
         </w:tc>
@@ -779,7 +832,15 @@
           </w:tcPr>
           <w:p>
             <w:r>
-              <w:t>{"phone": "...", "emergencyContact": "..."}</w:t>
+              <w:t>{"phone": "...", "</w:t>
+            </w:r>
+            <w:proofErr w:type="spellStart"/>
+            <w:r>
+              <w:t>emergencyContact</w:t>
+            </w:r>
+            <w:proofErr w:type="spellEnd"/>
+            <w:r>
+              <w:t>": "..."}</w:t>
             </w:r>
           </w:p>
         </w:tc>
@@ -861,7 +922,15 @@
           </w:tcPr>
           <w:p>
             <w:r>
-              <w:t>/api/events</w:t>
+              <w:t>/</w:t>
+            </w:r>
+            <w:proofErr w:type="spellStart"/>
+            <w:r>
+              <w:t>api</w:t>
+            </w:r>
+            <w:proofErr w:type="spellEnd"/>
+            <w:r>
+              <w:t>/events</w:t>
             </w:r>
           </w:p>
         </w:tc>
@@ -1014,7 +1083,15 @@
           </w:tcPr>
           <w:p>
             <w:r>
-              <w:t>/api/events</w:t>
+              <w:t>/</w:t>
+            </w:r>
+            <w:proofErr w:type="spellStart"/>
+            <w:r>
+              <w:t>api</w:t>
+            </w:r>
+            <w:proofErr w:type="spellEnd"/>
+            <w:r>
+              <w:t>/events</w:t>
             </w:r>
           </w:p>
         </w:tc>
@@ -1061,32 +1138,50 @@
             <w:hideMark/>
           </w:tcPr>
           <w:p>
+            <w:proofErr w:type="spellStart"/>
             <w:r>
               <w:t>Organiser</w:t>
             </w:r>
-          </w:p>
-        </w:tc>
-        <w:tc>
-          <w:tcPr>
-            <w:tcW w:w="0" w:type="auto"/>
-            <w:tcBorders>
-              <w:top w:val="single" w:sz="6" w:space="0" w:color="C4C7C5"/>
-              <w:left w:val="single" w:sz="6" w:space="0" w:color="C4C7C5"/>
-              <w:bottom w:val="single" w:sz="6" w:space="0" w:color="C4C7C5"/>
-              <w:right w:val="single" w:sz="6" w:space="0" w:color="C4C7C5"/>
-            </w:tcBorders>
-            <w:tcMar>
-              <w:top w:w="120" w:type="dxa"/>
-              <w:left w:w="180" w:type="dxa"/>
-              <w:bottom w:w="120" w:type="dxa"/>
-              <w:right w:w="180" w:type="dxa"/>
-            </w:tcMar>
-            <w:vAlign w:val="center"/>
-            <w:hideMark/>
-          </w:tcPr>
-          <w:p>
-            <w:r>
-              <w:t>{"title": "...", "eventType": "Running", "location": "...", "eventDate": "2026-10-15"}</w:t>
+            <w:proofErr w:type="spellEnd"/>
+          </w:p>
+        </w:tc>
+        <w:tc>
+          <w:tcPr>
+            <w:tcW w:w="0" w:type="auto"/>
+            <w:tcBorders>
+              <w:top w:val="single" w:sz="6" w:space="0" w:color="C4C7C5"/>
+              <w:left w:val="single" w:sz="6" w:space="0" w:color="C4C7C5"/>
+              <w:bottom w:val="single" w:sz="6" w:space="0" w:color="C4C7C5"/>
+              <w:right w:val="single" w:sz="6" w:space="0" w:color="C4C7C5"/>
+            </w:tcBorders>
+            <w:tcMar>
+              <w:top w:w="120" w:type="dxa"/>
+              <w:left w:w="180" w:type="dxa"/>
+              <w:bottom w:w="120" w:type="dxa"/>
+              <w:right w:w="180" w:type="dxa"/>
+            </w:tcMar>
+            <w:vAlign w:val="center"/>
+            <w:hideMark/>
+          </w:tcPr>
+          <w:p>
+            <w:r>
+              <w:t>{"title": "...", "</w:t>
+            </w:r>
+            <w:proofErr w:type="spellStart"/>
+            <w:r>
+              <w:t>eventType</w:t>
+            </w:r>
+            <w:proofErr w:type="spellEnd"/>
+            <w:r>
+              <w:t>": "Running", "location": "...", "</w:t>
+            </w:r>
+            <w:proofErr w:type="spellStart"/>
+            <w:r>
+              <w:t>eventDate</w:t>
+            </w:r>
+            <w:proofErr w:type="spellEnd"/>
+            <w:r>
+              <w:t>": "2026-10-15"}</w:t>
             </w:r>
           </w:p>
         </w:tc>
@@ -1169,13 +1264,23 @@
             <w:r>
               <w:t>/</w:t>
             </w:r>
+            <w:proofErr w:type="spellStart"/>
             <w:proofErr w:type="gramStart"/>
             <w:r>
               <w:t>api</w:t>
             </w:r>
+            <w:proofErr w:type="spellEnd"/>
             <w:proofErr w:type="gramEnd"/>
             <w:r>
-              <w:t>/events/{id}</w:t>
+              <w:t>/</w:t>
+            </w:r>
+            <w:proofErr w:type="gramStart"/>
+            <w:r>
+              <w:t>events/{</w:t>
+            </w:r>
+            <w:proofErr w:type="gramEnd"/>
+            <w:r>
+              <w:t>id}</w:t>
             </w:r>
           </w:p>
         </w:tc>
@@ -1330,13 +1435,23 @@
             <w:r>
               <w:t>/</w:t>
             </w:r>
+            <w:proofErr w:type="spellStart"/>
             <w:proofErr w:type="gramStart"/>
             <w:r>
               <w:t>api</w:t>
             </w:r>
+            <w:proofErr w:type="spellEnd"/>
             <w:proofErr w:type="gramEnd"/>
             <w:r>
-              <w:t>/events/{id}/categories</w:t>
+              <w:t>/</w:t>
+            </w:r>
+            <w:proofErr w:type="gramStart"/>
+            <w:r>
+              <w:t>events/{id}/</w:t>
+            </w:r>
+            <w:proofErr w:type="gramEnd"/>
+            <w:r>
+              <w:t>categories</w:t>
             </w:r>
           </w:p>
         </w:tc>
@@ -1383,36 +1498,70 @@
             <w:hideMark/>
           </w:tcPr>
           <w:p>
+            <w:proofErr w:type="spellStart"/>
             <w:r>
               <w:t>Organiser</w:t>
             </w:r>
-          </w:p>
-        </w:tc>
-        <w:tc>
-          <w:tcPr>
-            <w:tcW w:w="0" w:type="auto"/>
-            <w:tcBorders>
-              <w:top w:val="single" w:sz="6" w:space="0" w:color="C4C7C5"/>
-              <w:left w:val="single" w:sz="6" w:space="0" w:color="C4C7C5"/>
-              <w:bottom w:val="single" w:sz="6" w:space="0" w:color="C4C7C5"/>
-              <w:right w:val="single" w:sz="6" w:space="0" w:color="C4C7C5"/>
-            </w:tcBorders>
-            <w:tcMar>
-              <w:top w:w="120" w:type="dxa"/>
-              <w:left w:w="180" w:type="dxa"/>
-              <w:bottom w:w="120" w:type="dxa"/>
-              <w:right w:w="180" w:type="dxa"/>
-            </w:tcMar>
-            <w:vAlign w:val="center"/>
-            <w:hideMark/>
-          </w:tcPr>
-          <w:p>
-            <w:r>
-              <w:t xml:space="preserve">{"categoryName": "21km Half", "distanceKm": 21.1, "entryFee": </w:t>
+            <w:proofErr w:type="spellEnd"/>
+          </w:p>
+        </w:tc>
+        <w:tc>
+          <w:tcPr>
+            <w:tcW w:w="0" w:type="auto"/>
+            <w:tcBorders>
+              <w:top w:val="single" w:sz="6" w:space="0" w:color="C4C7C5"/>
+              <w:left w:val="single" w:sz="6" w:space="0" w:color="C4C7C5"/>
+              <w:bottom w:val="single" w:sz="6" w:space="0" w:color="C4C7C5"/>
+              <w:right w:val="single" w:sz="6" w:space="0" w:color="C4C7C5"/>
+            </w:tcBorders>
+            <w:tcMar>
+              <w:top w:w="120" w:type="dxa"/>
+              <w:left w:w="180" w:type="dxa"/>
+              <w:bottom w:w="120" w:type="dxa"/>
+              <w:right w:w="180" w:type="dxa"/>
+            </w:tcMar>
+            <w:vAlign w:val="center"/>
+            <w:hideMark/>
+          </w:tcPr>
+          <w:p>
+            <w:r>
+              <w:t>{"</w:t>
+            </w:r>
+            <w:proofErr w:type="spellStart"/>
+            <w:r>
+              <w:t>categoryName</w:t>
+            </w:r>
+            <w:proofErr w:type="spellEnd"/>
+            <w:r>
+              <w:t>": "21km Half", "</w:t>
+            </w:r>
+            <w:proofErr w:type="spellStart"/>
+            <w:r>
+              <w:t>distanceKm</w:t>
+            </w:r>
+            <w:proofErr w:type="spellEnd"/>
+            <w:r>
+              <w:t>": 21.1, "</w:t>
+            </w:r>
+            <w:proofErr w:type="spellStart"/>
+            <w:r>
+              <w:t>entryFee</w:t>
+            </w:r>
+            <w:proofErr w:type="spellEnd"/>
+            <w:r>
+              <w:t xml:space="preserve">": </w:t>
             </w:r>
             <w:r>
               <w:lastRenderedPageBreak/>
-              <w:t>250.00, "maxCapacity": 500}</w:t>
+              <w:t>250.00, "</w:t>
+            </w:r>
+            <w:proofErr w:type="spellStart"/>
+            <w:r>
+              <w:t>maxCapacity</w:t>
+            </w:r>
+            <w:proofErr w:type="spellEnd"/>
+            <w:r>
+              <w:t>": 500}</w:t>
             </w:r>
           </w:p>
         </w:tc>
@@ -1496,10 +1645,12 @@
             <w:r>
               <w:t>/</w:t>
             </w:r>
+            <w:proofErr w:type="spellStart"/>
             <w:proofErr w:type="gramStart"/>
             <w:r>
               <w:t>api</w:t>
             </w:r>
+            <w:proofErr w:type="spellEnd"/>
             <w:proofErr w:type="gramEnd"/>
             <w:r>
               <w:t>/</w:t>
@@ -1663,7 +1814,15 @@
           </w:tcPr>
           <w:p>
             <w:r>
-              <w:t>/api/enrolments</w:t>
+              <w:t>/</w:t>
+            </w:r>
+            <w:proofErr w:type="spellStart"/>
+            <w:r>
+              <w:t>api</w:t>
+            </w:r>
+            <w:proofErr w:type="spellEnd"/>
+            <w:r>
+              <w:t>/enrolments</w:t>
             </w:r>
           </w:p>
         </w:tc>
@@ -1735,31 +1894,225 @@
           </w:tcPr>
           <w:p>
             <w:r>
-              <w:t>{"eventID": 1, "categoryID": 2}</w:t>
-            </w:r>
-          </w:p>
-        </w:tc>
-        <w:tc>
-          <w:tcPr>
-            <w:tcW w:w="0" w:type="auto"/>
-            <w:tcBorders>
-              <w:top w:val="single" w:sz="6" w:space="0" w:color="C4C7C5"/>
-              <w:left w:val="single" w:sz="6" w:space="0" w:color="C4C7C5"/>
-              <w:bottom w:val="single" w:sz="6" w:space="0" w:color="C4C7C5"/>
-              <w:right w:val="single" w:sz="6" w:space="0" w:color="C4C7C5"/>
-            </w:tcBorders>
-            <w:tcMar>
-              <w:top w:w="120" w:type="dxa"/>
-              <w:left w:w="180" w:type="dxa"/>
-              <w:bottom w:w="120" w:type="dxa"/>
-              <w:right w:w="180" w:type="dxa"/>
-            </w:tcMar>
-            <w:vAlign w:val="center"/>
-            <w:hideMark/>
-          </w:tcPr>
-          <w:p>
-            <w:r>
-              <w:t>201 Created - Enrolment details with generated BibNumber; 409 Conflict (Already entered)</w:t>
+              <w:t>{"</w:t>
+            </w:r>
+            <w:proofErr w:type="spellStart"/>
+            <w:r>
+              <w:t>eventID</w:t>
+            </w:r>
+            <w:proofErr w:type="spellEnd"/>
+            <w:r>
+              <w:t>": 1, "</w:t>
+            </w:r>
+            <w:proofErr w:type="spellStart"/>
+            <w:r>
+              <w:t>categoryID</w:t>
+            </w:r>
+            <w:proofErr w:type="spellEnd"/>
+            <w:r>
+              <w:t>": 2}</w:t>
+            </w:r>
+          </w:p>
+        </w:tc>
+        <w:tc>
+          <w:tcPr>
+            <w:tcW w:w="0" w:type="auto"/>
+            <w:tcBorders>
+              <w:top w:val="single" w:sz="6" w:space="0" w:color="C4C7C5"/>
+              <w:left w:val="single" w:sz="6" w:space="0" w:color="C4C7C5"/>
+              <w:bottom w:val="single" w:sz="6" w:space="0" w:color="C4C7C5"/>
+              <w:right w:val="single" w:sz="6" w:space="0" w:color="C4C7C5"/>
+            </w:tcBorders>
+            <w:tcMar>
+              <w:top w:w="120" w:type="dxa"/>
+              <w:left w:w="180" w:type="dxa"/>
+              <w:bottom w:w="120" w:type="dxa"/>
+              <w:right w:w="180" w:type="dxa"/>
+            </w:tcMar>
+            <w:vAlign w:val="center"/>
+            <w:hideMark/>
+          </w:tcPr>
+          <w:p>
+            <w:r>
+              <w:t xml:space="preserve">201 Created - Enrolment details with generated </w:t>
+            </w:r>
+            <w:proofErr w:type="spellStart"/>
+            <w:r>
+              <w:t>BibNumber</w:t>
+            </w:r>
+            <w:proofErr w:type="spellEnd"/>
+            <w:r>
+              <w:t>; 409 Conflict (Already entered)</w:t>
+            </w:r>
+          </w:p>
+        </w:tc>
+      </w:tr>
+      <w:tr>
+        <w:trPr>
+          <w:tblCellSpacing w:w="15" w:type="dxa"/>
+        </w:trPr>
+        <w:tc>
+          <w:tcPr>
+            <w:tcW w:w="0" w:type="auto"/>
+            <w:tcBorders>
+              <w:top w:val="single" w:sz="6" w:space="0" w:color="C4C7C5"/>
+              <w:left w:val="single" w:sz="6" w:space="0" w:color="C4C7C5"/>
+              <w:bottom w:val="single" w:sz="6" w:space="0" w:color="C4C7C5"/>
+              <w:right w:val="single" w:sz="6" w:space="0" w:color="C4C7C5"/>
+            </w:tcBorders>
+            <w:tcMar>
+              <w:top w:w="120" w:type="dxa"/>
+              <w:left w:w="180" w:type="dxa"/>
+              <w:bottom w:w="120" w:type="dxa"/>
+              <w:right w:w="180" w:type="dxa"/>
+            </w:tcMar>
+            <w:vAlign w:val="center"/>
+            <w:hideMark/>
+          </w:tcPr>
+          <w:p>
+            <w:r>
+              <w:rPr>
+                <w:b/>
+                <w:bCs/>
+              </w:rPr>
+              <w:t>GET</w:t>
+            </w:r>
+          </w:p>
+        </w:tc>
+        <w:tc>
+          <w:tcPr>
+            <w:tcW w:w="0" w:type="auto"/>
+            <w:tcBorders>
+              <w:top w:val="single" w:sz="6" w:space="0" w:color="C4C7C5"/>
+              <w:left w:val="single" w:sz="6" w:space="0" w:color="C4C7C5"/>
+              <w:bottom w:val="single" w:sz="6" w:space="0" w:color="C4C7C5"/>
+              <w:right w:val="single" w:sz="6" w:space="0" w:color="C4C7C5"/>
+            </w:tcBorders>
+            <w:tcMar>
+              <w:top w:w="120" w:type="dxa"/>
+              <w:left w:w="180" w:type="dxa"/>
+              <w:bottom w:w="120" w:type="dxa"/>
+              <w:right w:w="180" w:type="dxa"/>
+            </w:tcMar>
+            <w:vAlign w:val="center"/>
+            <w:hideMark/>
+          </w:tcPr>
+          <w:p>
+            <w:r>
+              <w:t>/</w:t>
+            </w:r>
+            <w:proofErr w:type="spellStart"/>
+            <w:r>
+              <w:t>api</w:t>
+            </w:r>
+            <w:proofErr w:type="spellEnd"/>
+            <w:r>
+              <w:t>/enrolments/my-entries</w:t>
+            </w:r>
+          </w:p>
+        </w:tc>
+        <w:tc>
+          <w:tcPr>
+            <w:tcW w:w="0" w:type="auto"/>
+            <w:tcBorders>
+              <w:top w:val="single" w:sz="6" w:space="0" w:color="C4C7C5"/>
+              <w:left w:val="single" w:sz="6" w:space="0" w:color="C4C7C5"/>
+              <w:bottom w:val="single" w:sz="6" w:space="0" w:color="C4C7C5"/>
+              <w:right w:val="single" w:sz="6" w:space="0" w:color="C4C7C5"/>
+            </w:tcBorders>
+            <w:tcMar>
+              <w:top w:w="120" w:type="dxa"/>
+              <w:left w:w="180" w:type="dxa"/>
+              <w:bottom w:w="120" w:type="dxa"/>
+              <w:right w:w="180" w:type="dxa"/>
+            </w:tcMar>
+            <w:vAlign w:val="center"/>
+            <w:hideMark/>
+          </w:tcPr>
+          <w:p>
+            <w:r>
+              <w:t xml:space="preserve">View logged-in user's race </w:t>
+            </w:r>
+            <w:r>
+              <w:lastRenderedPageBreak/>
+              <w:t>registrations</w:t>
+            </w:r>
+          </w:p>
+        </w:tc>
+        <w:tc>
+          <w:tcPr>
+            <w:tcW w:w="0" w:type="auto"/>
+            <w:tcBorders>
+              <w:top w:val="single" w:sz="6" w:space="0" w:color="C4C7C5"/>
+              <w:left w:val="single" w:sz="6" w:space="0" w:color="C4C7C5"/>
+              <w:bottom w:val="single" w:sz="6" w:space="0" w:color="C4C7C5"/>
+              <w:right w:val="single" w:sz="6" w:space="0" w:color="C4C7C5"/>
+            </w:tcBorders>
+            <w:tcMar>
+              <w:top w:w="120" w:type="dxa"/>
+              <w:left w:w="180" w:type="dxa"/>
+              <w:bottom w:w="120" w:type="dxa"/>
+              <w:right w:w="180" w:type="dxa"/>
+            </w:tcMar>
+            <w:vAlign w:val="center"/>
+            <w:hideMark/>
+          </w:tcPr>
+          <w:p>
+            <w:r>
+              <w:lastRenderedPageBreak/>
+              <w:t>Participant</w:t>
+            </w:r>
+          </w:p>
+        </w:tc>
+        <w:tc>
+          <w:tcPr>
+            <w:tcW w:w="0" w:type="auto"/>
+            <w:tcBorders>
+              <w:top w:val="single" w:sz="6" w:space="0" w:color="C4C7C5"/>
+              <w:left w:val="single" w:sz="6" w:space="0" w:color="C4C7C5"/>
+              <w:bottom w:val="single" w:sz="6" w:space="0" w:color="C4C7C5"/>
+              <w:right w:val="single" w:sz="6" w:space="0" w:color="C4C7C5"/>
+            </w:tcBorders>
+            <w:tcMar>
+              <w:top w:w="120" w:type="dxa"/>
+              <w:left w:w="180" w:type="dxa"/>
+              <w:bottom w:w="120" w:type="dxa"/>
+              <w:right w:w="180" w:type="dxa"/>
+            </w:tcMar>
+            <w:vAlign w:val="center"/>
+            <w:hideMark/>
+          </w:tcPr>
+          <w:p>
+            <w:r>
+              <w:t>None</w:t>
+            </w:r>
+          </w:p>
+        </w:tc>
+        <w:tc>
+          <w:tcPr>
+            <w:tcW w:w="0" w:type="auto"/>
+            <w:tcBorders>
+              <w:top w:val="single" w:sz="6" w:space="0" w:color="C4C7C5"/>
+              <w:left w:val="single" w:sz="6" w:space="0" w:color="C4C7C5"/>
+              <w:bottom w:val="single" w:sz="6" w:space="0" w:color="C4C7C5"/>
+              <w:right w:val="single" w:sz="6" w:space="0" w:color="C4C7C5"/>
+            </w:tcBorders>
+            <w:tcMar>
+              <w:top w:w="120" w:type="dxa"/>
+              <w:left w:w="180" w:type="dxa"/>
+              <w:bottom w:w="120" w:type="dxa"/>
+              <w:right w:w="180" w:type="dxa"/>
+            </w:tcMar>
+            <w:vAlign w:val="center"/>
+            <w:hideMark/>
+          </w:tcPr>
+          <w:p>
+            <w:r>
+              <w:t xml:space="preserve">200 OK - Array of active participant </w:t>
+            </w:r>
+            <w:r>
+              <w:lastRenderedPageBreak/>
+              <w:t>enrolments</w:t>
             </w:r>
           </w:p>
         </w:tc>

</xml_diff>

<commit_message>
finalize API endpoint plan with race results and leaderboard specs
</commit_message>
<xml_diff>
--- a/doc/API Endpoint Plan.docx
+++ b/doc/API Endpoint Plan.docx
@@ -6,6 +6,7 @@
       <w:tblPr>
         <w:tblW w:w="0" w:type="auto"/>
         <w:tblCellSpacing w:w="15" w:type="dxa"/>
+        <w:tblInd w:w="-1178" w:type="dxa"/>
         <w:tblCellMar>
           <w:top w:w="15" w:type="dxa"/>
           <w:left w:w="15" w:type="dxa"/>
@@ -15,12 +16,12 @@
         <w:tblLook w:val="04A0" w:firstRow="1" w:lastRow="0" w:firstColumn="1" w:lastColumn="0" w:noHBand="0" w:noVBand="1"/>
       </w:tblPr>
       <w:tblGrid>
-        <w:gridCol w:w="998"/>
-        <w:gridCol w:w="2239"/>
-        <w:gridCol w:w="1399"/>
-        <w:gridCol w:w="1409"/>
-        <w:gridCol w:w="1920"/>
-        <w:gridCol w:w="1379"/>
+        <w:gridCol w:w="1084"/>
+        <w:gridCol w:w="2599"/>
+        <w:gridCol w:w="1595"/>
+        <w:gridCol w:w="1563"/>
+        <w:gridCol w:w="2154"/>
+        <w:gridCol w:w="1527"/>
       </w:tblGrid>
       <w:tr>
         <w:trPr>
@@ -29,7 +30,7 @@
         </w:trPr>
         <w:tc>
           <w:tcPr>
-            <w:tcW w:w="0" w:type="auto"/>
+            <w:tcW w:w="2122" w:type="dxa"/>
             <w:tcBorders>
               <w:top w:val="single" w:sz="6" w:space="0" w:color="C4C7C5"/>
               <w:left w:val="single" w:sz="6" w:space="0" w:color="C4C7C5"/>
@@ -202,7 +203,7 @@
         </w:trPr>
         <w:tc>
           <w:tcPr>
-            <w:tcW w:w="0" w:type="auto"/>
+            <w:tcW w:w="2122" w:type="dxa"/>
             <w:tcBorders>
               <w:top w:val="single" w:sz="6" w:space="0" w:color="C4C7C5"/>
               <w:left w:val="single" w:sz="6" w:space="0" w:color="C4C7C5"/>
@@ -384,7 +385,7 @@
         </w:trPr>
         <w:tc>
           <w:tcPr>
-            <w:tcW w:w="0" w:type="auto"/>
+            <w:tcW w:w="2122" w:type="dxa"/>
             <w:tcBorders>
               <w:top w:val="single" w:sz="6" w:space="0" w:color="C4C7C5"/>
               <w:left w:val="single" w:sz="6" w:space="0" w:color="C4C7C5"/>
@@ -545,7 +546,7 @@
         </w:trPr>
         <w:tc>
           <w:tcPr>
-            <w:tcW w:w="0" w:type="auto"/>
+            <w:tcW w:w="2122" w:type="dxa"/>
             <w:tcBorders>
               <w:top w:val="single" w:sz="6" w:space="0" w:color="C4C7C5"/>
               <w:left w:val="single" w:sz="6" w:space="0" w:color="C4C7C5"/>
@@ -706,7 +707,7 @@
         </w:trPr>
         <w:tc>
           <w:tcPr>
-            <w:tcW w:w="0" w:type="auto"/>
+            <w:tcW w:w="2122" w:type="dxa"/>
             <w:tcBorders>
               <w:top w:val="single" w:sz="6" w:space="0" w:color="C4C7C5"/>
               <w:left w:val="single" w:sz="6" w:space="0" w:color="C4C7C5"/>
@@ -875,7 +876,177 @@
         </w:trPr>
         <w:tc>
           <w:tcPr>
-            <w:tcW w:w="0" w:type="auto"/>
+            <w:tcW w:w="2122" w:type="dxa"/>
+            <w:tcBorders>
+              <w:top w:val="single" w:sz="6" w:space="0" w:color="C4C7C5"/>
+              <w:left w:val="single" w:sz="6" w:space="0" w:color="C4C7C5"/>
+              <w:bottom w:val="single" w:sz="6" w:space="0" w:color="C4C7C5"/>
+              <w:right w:val="single" w:sz="6" w:space="0" w:color="C4C7C5"/>
+            </w:tcBorders>
+            <w:tcMar>
+              <w:top w:w="120" w:type="dxa"/>
+              <w:left w:w="180" w:type="dxa"/>
+              <w:bottom w:w="120" w:type="dxa"/>
+              <w:right w:w="180" w:type="dxa"/>
+            </w:tcMar>
+            <w:vAlign w:val="center"/>
+            <w:hideMark/>
+          </w:tcPr>
+          <w:p>
+            <w:r>
+              <w:rPr>
+                <w:b/>
+                <w:bCs/>
+              </w:rPr>
+              <w:t>GET</w:t>
+            </w:r>
+          </w:p>
+        </w:tc>
+        <w:tc>
+          <w:tcPr>
+            <w:tcW w:w="0" w:type="auto"/>
+            <w:tcBorders>
+              <w:top w:val="single" w:sz="6" w:space="0" w:color="C4C7C5"/>
+              <w:left w:val="single" w:sz="6" w:space="0" w:color="C4C7C5"/>
+              <w:bottom w:val="single" w:sz="6" w:space="0" w:color="C4C7C5"/>
+              <w:right w:val="single" w:sz="6" w:space="0" w:color="C4C7C5"/>
+            </w:tcBorders>
+            <w:tcMar>
+              <w:top w:w="120" w:type="dxa"/>
+              <w:left w:w="180" w:type="dxa"/>
+              <w:bottom w:w="120" w:type="dxa"/>
+              <w:right w:w="180" w:type="dxa"/>
+            </w:tcMar>
+            <w:vAlign w:val="center"/>
+            <w:hideMark/>
+          </w:tcPr>
+          <w:p>
+            <w:r>
+              <w:t>/</w:t>
+            </w:r>
+            <w:proofErr w:type="spellStart"/>
+            <w:r>
+              <w:t>api</w:t>
+            </w:r>
+            <w:proofErr w:type="spellEnd"/>
+            <w:r>
+              <w:t>/events</w:t>
+            </w:r>
+          </w:p>
+        </w:tc>
+        <w:tc>
+          <w:tcPr>
+            <w:tcW w:w="0" w:type="auto"/>
+            <w:tcBorders>
+              <w:top w:val="single" w:sz="6" w:space="0" w:color="C4C7C5"/>
+              <w:left w:val="single" w:sz="6" w:space="0" w:color="C4C7C5"/>
+              <w:bottom w:val="single" w:sz="6" w:space="0" w:color="C4C7C5"/>
+              <w:right w:val="single" w:sz="6" w:space="0" w:color="C4C7C5"/>
+            </w:tcBorders>
+            <w:tcMar>
+              <w:top w:w="120" w:type="dxa"/>
+              <w:left w:w="180" w:type="dxa"/>
+              <w:bottom w:w="120" w:type="dxa"/>
+              <w:right w:w="180" w:type="dxa"/>
+            </w:tcMar>
+            <w:vAlign w:val="center"/>
+            <w:hideMark/>
+          </w:tcPr>
+          <w:p>
+            <w:r>
+              <w:t xml:space="preserve">List all upcoming events with </w:t>
+            </w:r>
+            <w:r>
+              <w:lastRenderedPageBreak/>
+              <w:t>filter options</w:t>
+            </w:r>
+          </w:p>
+        </w:tc>
+        <w:tc>
+          <w:tcPr>
+            <w:tcW w:w="0" w:type="auto"/>
+            <w:tcBorders>
+              <w:top w:val="single" w:sz="6" w:space="0" w:color="C4C7C5"/>
+              <w:left w:val="single" w:sz="6" w:space="0" w:color="C4C7C5"/>
+              <w:bottom w:val="single" w:sz="6" w:space="0" w:color="C4C7C5"/>
+              <w:right w:val="single" w:sz="6" w:space="0" w:color="C4C7C5"/>
+            </w:tcBorders>
+            <w:tcMar>
+              <w:top w:w="120" w:type="dxa"/>
+              <w:left w:w="180" w:type="dxa"/>
+              <w:bottom w:w="120" w:type="dxa"/>
+              <w:right w:w="180" w:type="dxa"/>
+            </w:tcMar>
+            <w:vAlign w:val="center"/>
+            <w:hideMark/>
+          </w:tcPr>
+          <w:p>
+            <w:r>
+              <w:lastRenderedPageBreak/>
+              <w:t>None (Public)</w:t>
+            </w:r>
+          </w:p>
+        </w:tc>
+        <w:tc>
+          <w:tcPr>
+            <w:tcW w:w="0" w:type="auto"/>
+            <w:tcBorders>
+              <w:top w:val="single" w:sz="6" w:space="0" w:color="C4C7C5"/>
+              <w:left w:val="single" w:sz="6" w:space="0" w:color="C4C7C5"/>
+              <w:bottom w:val="single" w:sz="6" w:space="0" w:color="C4C7C5"/>
+              <w:right w:val="single" w:sz="6" w:space="0" w:color="C4C7C5"/>
+            </w:tcBorders>
+            <w:tcMar>
+              <w:top w:w="120" w:type="dxa"/>
+              <w:left w:w="180" w:type="dxa"/>
+              <w:bottom w:w="120" w:type="dxa"/>
+              <w:right w:w="180" w:type="dxa"/>
+            </w:tcMar>
+            <w:vAlign w:val="center"/>
+            <w:hideMark/>
+          </w:tcPr>
+          <w:p>
+            <w:r>
+              <w:t>None</w:t>
+            </w:r>
+          </w:p>
+        </w:tc>
+        <w:tc>
+          <w:tcPr>
+            <w:tcW w:w="0" w:type="auto"/>
+            <w:tcBorders>
+              <w:top w:val="single" w:sz="6" w:space="0" w:color="C4C7C5"/>
+              <w:left w:val="single" w:sz="6" w:space="0" w:color="C4C7C5"/>
+              <w:bottom w:val="single" w:sz="6" w:space="0" w:color="C4C7C5"/>
+              <w:right w:val="single" w:sz="6" w:space="0" w:color="C4C7C5"/>
+            </w:tcBorders>
+            <w:tcMar>
+              <w:top w:w="120" w:type="dxa"/>
+              <w:left w:w="180" w:type="dxa"/>
+              <w:bottom w:w="120" w:type="dxa"/>
+              <w:right w:w="180" w:type="dxa"/>
+            </w:tcMar>
+            <w:vAlign w:val="center"/>
+            <w:hideMark/>
+          </w:tcPr>
+          <w:p>
+            <w:r>
+              <w:t xml:space="preserve">200 OK - Array of active </w:t>
+            </w:r>
+            <w:r>
+              <w:lastRenderedPageBreak/>
+              <w:t>Event objects</w:t>
+            </w:r>
+          </w:p>
+        </w:tc>
+      </w:tr>
+      <w:tr>
+        <w:trPr>
+          <w:tblCellSpacing w:w="15" w:type="dxa"/>
+        </w:trPr>
+        <w:tc>
+          <w:tcPr>
+            <w:tcW w:w="2122" w:type="dxa"/>
             <w:tcBorders>
               <w:top w:val="single" w:sz="6" w:space="0" w:color="C4C7C5"/>
               <w:left w:val="single" w:sz="6" w:space="0" w:color="C4C7C5"/>
@@ -898,7 +1069,7 @@
                 <w:bCs/>
               </w:rPr>
               <w:lastRenderedPageBreak/>
-              <w:t>GET</w:t>
+              <w:t>POST</w:t>
             </w:r>
           </w:p>
         </w:tc>
@@ -954,79 +1125,97 @@
           </w:tcPr>
           <w:p>
             <w:r>
-              <w:t>List all upcoming events with filter options</w:t>
-            </w:r>
-          </w:p>
-        </w:tc>
-        <w:tc>
-          <w:tcPr>
-            <w:tcW w:w="0" w:type="auto"/>
-            <w:tcBorders>
-              <w:top w:val="single" w:sz="6" w:space="0" w:color="C4C7C5"/>
-              <w:left w:val="single" w:sz="6" w:space="0" w:color="C4C7C5"/>
-              <w:bottom w:val="single" w:sz="6" w:space="0" w:color="C4C7C5"/>
-              <w:right w:val="single" w:sz="6" w:space="0" w:color="C4C7C5"/>
-            </w:tcBorders>
-            <w:tcMar>
-              <w:top w:w="120" w:type="dxa"/>
-              <w:left w:w="180" w:type="dxa"/>
-              <w:bottom w:w="120" w:type="dxa"/>
-              <w:right w:w="180" w:type="dxa"/>
-            </w:tcMar>
-            <w:vAlign w:val="center"/>
-            <w:hideMark/>
-          </w:tcPr>
-          <w:p>
-            <w:r>
-              <w:t>None (Public)</w:t>
-            </w:r>
-          </w:p>
-        </w:tc>
-        <w:tc>
-          <w:tcPr>
-            <w:tcW w:w="0" w:type="auto"/>
-            <w:tcBorders>
-              <w:top w:val="single" w:sz="6" w:space="0" w:color="C4C7C5"/>
-              <w:left w:val="single" w:sz="6" w:space="0" w:color="C4C7C5"/>
-              <w:bottom w:val="single" w:sz="6" w:space="0" w:color="C4C7C5"/>
-              <w:right w:val="single" w:sz="6" w:space="0" w:color="C4C7C5"/>
-            </w:tcBorders>
-            <w:tcMar>
-              <w:top w:w="120" w:type="dxa"/>
-              <w:left w:w="180" w:type="dxa"/>
-              <w:bottom w:w="120" w:type="dxa"/>
-              <w:right w:w="180" w:type="dxa"/>
-            </w:tcMar>
-            <w:vAlign w:val="center"/>
-            <w:hideMark/>
-          </w:tcPr>
-          <w:p>
-            <w:r>
-              <w:t>None</w:t>
-            </w:r>
-          </w:p>
-        </w:tc>
-        <w:tc>
-          <w:tcPr>
-            <w:tcW w:w="0" w:type="auto"/>
-            <w:tcBorders>
-              <w:top w:val="single" w:sz="6" w:space="0" w:color="C4C7C5"/>
-              <w:left w:val="single" w:sz="6" w:space="0" w:color="C4C7C5"/>
-              <w:bottom w:val="single" w:sz="6" w:space="0" w:color="C4C7C5"/>
-              <w:right w:val="single" w:sz="6" w:space="0" w:color="C4C7C5"/>
-            </w:tcBorders>
-            <w:tcMar>
-              <w:top w:w="120" w:type="dxa"/>
-              <w:left w:w="180" w:type="dxa"/>
-              <w:bottom w:w="120" w:type="dxa"/>
-              <w:right w:w="180" w:type="dxa"/>
-            </w:tcMar>
-            <w:vAlign w:val="center"/>
-            <w:hideMark/>
-          </w:tcPr>
-          <w:p>
-            <w:r>
-              <w:t>200 OK - Array of active Event objects</w:t>
+              <w:t>Create a new race event</w:t>
+            </w:r>
+          </w:p>
+        </w:tc>
+        <w:tc>
+          <w:tcPr>
+            <w:tcW w:w="0" w:type="auto"/>
+            <w:tcBorders>
+              <w:top w:val="single" w:sz="6" w:space="0" w:color="C4C7C5"/>
+              <w:left w:val="single" w:sz="6" w:space="0" w:color="C4C7C5"/>
+              <w:bottom w:val="single" w:sz="6" w:space="0" w:color="C4C7C5"/>
+              <w:right w:val="single" w:sz="6" w:space="0" w:color="C4C7C5"/>
+            </w:tcBorders>
+            <w:tcMar>
+              <w:top w:w="120" w:type="dxa"/>
+              <w:left w:w="180" w:type="dxa"/>
+              <w:bottom w:w="120" w:type="dxa"/>
+              <w:right w:w="180" w:type="dxa"/>
+            </w:tcMar>
+            <w:vAlign w:val="center"/>
+            <w:hideMark/>
+          </w:tcPr>
+          <w:p>
+            <w:proofErr w:type="spellStart"/>
+            <w:r>
+              <w:t>Organiser</w:t>
+            </w:r>
+            <w:proofErr w:type="spellEnd"/>
+          </w:p>
+        </w:tc>
+        <w:tc>
+          <w:tcPr>
+            <w:tcW w:w="0" w:type="auto"/>
+            <w:tcBorders>
+              <w:top w:val="single" w:sz="6" w:space="0" w:color="C4C7C5"/>
+              <w:left w:val="single" w:sz="6" w:space="0" w:color="C4C7C5"/>
+              <w:bottom w:val="single" w:sz="6" w:space="0" w:color="C4C7C5"/>
+              <w:right w:val="single" w:sz="6" w:space="0" w:color="C4C7C5"/>
+            </w:tcBorders>
+            <w:tcMar>
+              <w:top w:w="120" w:type="dxa"/>
+              <w:left w:w="180" w:type="dxa"/>
+              <w:bottom w:w="120" w:type="dxa"/>
+              <w:right w:w="180" w:type="dxa"/>
+            </w:tcMar>
+            <w:vAlign w:val="center"/>
+            <w:hideMark/>
+          </w:tcPr>
+          <w:p>
+            <w:r>
+              <w:t>{"title": "...", "</w:t>
+            </w:r>
+            <w:proofErr w:type="spellStart"/>
+            <w:r>
+              <w:t>eventType</w:t>
+            </w:r>
+            <w:proofErr w:type="spellEnd"/>
+            <w:r>
+              <w:t>": "Running", "location": "...", "</w:t>
+            </w:r>
+            <w:proofErr w:type="spellStart"/>
+            <w:r>
+              <w:t>eventDate</w:t>
+            </w:r>
+            <w:proofErr w:type="spellEnd"/>
+            <w:r>
+              <w:t>": "2026-10-15"}</w:t>
+            </w:r>
+          </w:p>
+        </w:tc>
+        <w:tc>
+          <w:tcPr>
+            <w:tcW w:w="0" w:type="auto"/>
+            <w:tcBorders>
+              <w:top w:val="single" w:sz="6" w:space="0" w:color="C4C7C5"/>
+              <w:left w:val="single" w:sz="6" w:space="0" w:color="C4C7C5"/>
+              <w:bottom w:val="single" w:sz="6" w:space="0" w:color="C4C7C5"/>
+              <w:right w:val="single" w:sz="6" w:space="0" w:color="C4C7C5"/>
+            </w:tcBorders>
+            <w:tcMar>
+              <w:top w:w="120" w:type="dxa"/>
+              <w:left w:w="180" w:type="dxa"/>
+              <w:bottom w:w="120" w:type="dxa"/>
+              <w:right w:w="180" w:type="dxa"/>
+            </w:tcMar>
+            <w:vAlign w:val="center"/>
+            <w:hideMark/>
+          </w:tcPr>
+          <w:p>
+            <w:r>
+              <w:t>201 Created - Created Event details; 403 Forbidden</w:t>
             </w:r>
           </w:p>
         </w:tc>
@@ -1037,7 +1226,178 @@
         </w:trPr>
         <w:tc>
           <w:tcPr>
-            <w:tcW w:w="0" w:type="auto"/>
+            <w:tcW w:w="2122" w:type="dxa"/>
+            <w:tcBorders>
+              <w:top w:val="single" w:sz="6" w:space="0" w:color="C4C7C5"/>
+              <w:left w:val="single" w:sz="6" w:space="0" w:color="C4C7C5"/>
+              <w:bottom w:val="single" w:sz="6" w:space="0" w:color="C4C7C5"/>
+              <w:right w:val="single" w:sz="6" w:space="0" w:color="C4C7C5"/>
+            </w:tcBorders>
+            <w:tcMar>
+              <w:top w:w="120" w:type="dxa"/>
+              <w:left w:w="180" w:type="dxa"/>
+              <w:bottom w:w="120" w:type="dxa"/>
+              <w:right w:w="180" w:type="dxa"/>
+            </w:tcMar>
+            <w:vAlign w:val="center"/>
+            <w:hideMark/>
+          </w:tcPr>
+          <w:p>
+            <w:r>
+              <w:rPr>
+                <w:b/>
+                <w:bCs/>
+              </w:rPr>
+              <w:t>GET</w:t>
+            </w:r>
+          </w:p>
+        </w:tc>
+        <w:tc>
+          <w:tcPr>
+            <w:tcW w:w="0" w:type="auto"/>
+            <w:tcBorders>
+              <w:top w:val="single" w:sz="6" w:space="0" w:color="C4C7C5"/>
+              <w:left w:val="single" w:sz="6" w:space="0" w:color="C4C7C5"/>
+              <w:bottom w:val="single" w:sz="6" w:space="0" w:color="C4C7C5"/>
+              <w:right w:val="single" w:sz="6" w:space="0" w:color="C4C7C5"/>
+            </w:tcBorders>
+            <w:tcMar>
+              <w:top w:w="120" w:type="dxa"/>
+              <w:left w:w="180" w:type="dxa"/>
+              <w:bottom w:w="120" w:type="dxa"/>
+              <w:right w:w="180" w:type="dxa"/>
+            </w:tcMar>
+            <w:vAlign w:val="center"/>
+            <w:hideMark/>
+          </w:tcPr>
+          <w:p>
+            <w:r>
+              <w:t>/</w:t>
+            </w:r>
+            <w:proofErr w:type="spellStart"/>
+            <w:proofErr w:type="gramStart"/>
+            <w:r>
+              <w:t>api</w:t>
+            </w:r>
+            <w:proofErr w:type="spellEnd"/>
+            <w:proofErr w:type="gramEnd"/>
+            <w:r>
+              <w:t>/</w:t>
+            </w:r>
+            <w:proofErr w:type="gramStart"/>
+            <w:r>
+              <w:t>events/{</w:t>
+            </w:r>
+            <w:proofErr w:type="gramEnd"/>
+            <w:r>
+              <w:t>id}</w:t>
+            </w:r>
+          </w:p>
+        </w:tc>
+        <w:tc>
+          <w:tcPr>
+            <w:tcW w:w="0" w:type="auto"/>
+            <w:tcBorders>
+              <w:top w:val="single" w:sz="6" w:space="0" w:color="C4C7C5"/>
+              <w:left w:val="single" w:sz="6" w:space="0" w:color="C4C7C5"/>
+              <w:bottom w:val="single" w:sz="6" w:space="0" w:color="C4C7C5"/>
+              <w:right w:val="single" w:sz="6" w:space="0" w:color="C4C7C5"/>
+            </w:tcBorders>
+            <w:tcMar>
+              <w:top w:w="120" w:type="dxa"/>
+              <w:left w:w="180" w:type="dxa"/>
+              <w:bottom w:w="120" w:type="dxa"/>
+              <w:right w:w="180" w:type="dxa"/>
+            </w:tcMar>
+            <w:vAlign w:val="center"/>
+            <w:hideMark/>
+          </w:tcPr>
+          <w:p>
+            <w:r>
+              <w:t>Get event details, weather, and categories</w:t>
+            </w:r>
+          </w:p>
+        </w:tc>
+        <w:tc>
+          <w:tcPr>
+            <w:tcW w:w="0" w:type="auto"/>
+            <w:tcBorders>
+              <w:top w:val="single" w:sz="6" w:space="0" w:color="C4C7C5"/>
+              <w:left w:val="single" w:sz="6" w:space="0" w:color="C4C7C5"/>
+              <w:bottom w:val="single" w:sz="6" w:space="0" w:color="C4C7C5"/>
+              <w:right w:val="single" w:sz="6" w:space="0" w:color="C4C7C5"/>
+            </w:tcBorders>
+            <w:tcMar>
+              <w:top w:w="120" w:type="dxa"/>
+              <w:left w:w="180" w:type="dxa"/>
+              <w:bottom w:w="120" w:type="dxa"/>
+              <w:right w:w="180" w:type="dxa"/>
+            </w:tcMar>
+            <w:vAlign w:val="center"/>
+            <w:hideMark/>
+          </w:tcPr>
+          <w:p>
+            <w:r>
+              <w:t>None (Public)</w:t>
+            </w:r>
+          </w:p>
+        </w:tc>
+        <w:tc>
+          <w:tcPr>
+            <w:tcW w:w="0" w:type="auto"/>
+            <w:tcBorders>
+              <w:top w:val="single" w:sz="6" w:space="0" w:color="C4C7C5"/>
+              <w:left w:val="single" w:sz="6" w:space="0" w:color="C4C7C5"/>
+              <w:bottom w:val="single" w:sz="6" w:space="0" w:color="C4C7C5"/>
+              <w:right w:val="single" w:sz="6" w:space="0" w:color="C4C7C5"/>
+            </w:tcBorders>
+            <w:tcMar>
+              <w:top w:w="120" w:type="dxa"/>
+              <w:left w:w="180" w:type="dxa"/>
+              <w:bottom w:w="120" w:type="dxa"/>
+              <w:right w:w="180" w:type="dxa"/>
+            </w:tcMar>
+            <w:vAlign w:val="center"/>
+            <w:hideMark/>
+          </w:tcPr>
+          <w:p>
+            <w:r>
+              <w:t>None</w:t>
+            </w:r>
+          </w:p>
+        </w:tc>
+        <w:tc>
+          <w:tcPr>
+            <w:tcW w:w="0" w:type="auto"/>
+            <w:tcBorders>
+              <w:top w:val="single" w:sz="6" w:space="0" w:color="C4C7C5"/>
+              <w:left w:val="single" w:sz="6" w:space="0" w:color="C4C7C5"/>
+              <w:bottom w:val="single" w:sz="6" w:space="0" w:color="C4C7C5"/>
+              <w:right w:val="single" w:sz="6" w:space="0" w:color="C4C7C5"/>
+            </w:tcBorders>
+            <w:tcMar>
+              <w:top w:w="120" w:type="dxa"/>
+              <w:left w:w="180" w:type="dxa"/>
+              <w:bottom w:w="120" w:type="dxa"/>
+              <w:right w:w="180" w:type="dxa"/>
+            </w:tcMar>
+            <w:vAlign w:val="center"/>
+            <w:hideMark/>
+          </w:tcPr>
+          <w:p>
+            <w:r>
+              <w:t>200 OK - Event object with nested categories</w:t>
+            </w:r>
+          </w:p>
+        </w:tc>
+      </w:tr>
+      <w:tr>
+        <w:trPr>
+          <w:tblCellSpacing w:w="15" w:type="dxa"/>
+        </w:trPr>
+        <w:tc>
+          <w:tcPr>
+            <w:tcW w:w="2122" w:type="dxa"/>
             <w:tcBorders>
               <w:top w:val="single" w:sz="6" w:space="0" w:color="C4C7C5"/>
               <w:left w:val="single" w:sz="6" w:space="0" w:color="C4C7C5"/>
@@ -1086,36 +1446,46 @@
               <w:t>/</w:t>
             </w:r>
             <w:proofErr w:type="spellStart"/>
+            <w:proofErr w:type="gramStart"/>
             <w:r>
               <w:t>api</w:t>
             </w:r>
             <w:proofErr w:type="spellEnd"/>
-            <w:r>
-              <w:t>/events</w:t>
-            </w:r>
-          </w:p>
-        </w:tc>
-        <w:tc>
-          <w:tcPr>
-            <w:tcW w:w="0" w:type="auto"/>
-            <w:tcBorders>
-              <w:top w:val="single" w:sz="6" w:space="0" w:color="C4C7C5"/>
-              <w:left w:val="single" w:sz="6" w:space="0" w:color="C4C7C5"/>
-              <w:bottom w:val="single" w:sz="6" w:space="0" w:color="C4C7C5"/>
-              <w:right w:val="single" w:sz="6" w:space="0" w:color="C4C7C5"/>
-            </w:tcBorders>
-            <w:tcMar>
-              <w:top w:w="120" w:type="dxa"/>
-              <w:left w:w="180" w:type="dxa"/>
-              <w:bottom w:w="120" w:type="dxa"/>
-              <w:right w:w="180" w:type="dxa"/>
-            </w:tcMar>
-            <w:vAlign w:val="center"/>
-            <w:hideMark/>
-          </w:tcPr>
-          <w:p>
-            <w:r>
-              <w:t>Create a new race event</w:t>
+            <w:proofErr w:type="gramEnd"/>
+            <w:r>
+              <w:t>/</w:t>
+            </w:r>
+            <w:proofErr w:type="gramStart"/>
+            <w:r>
+              <w:t>events/{id}/</w:t>
+            </w:r>
+            <w:proofErr w:type="gramEnd"/>
+            <w:r>
+              <w:t>categories</w:t>
+            </w:r>
+          </w:p>
+        </w:tc>
+        <w:tc>
+          <w:tcPr>
+            <w:tcW w:w="0" w:type="auto"/>
+            <w:tcBorders>
+              <w:top w:val="single" w:sz="6" w:space="0" w:color="C4C7C5"/>
+              <w:left w:val="single" w:sz="6" w:space="0" w:color="C4C7C5"/>
+              <w:bottom w:val="single" w:sz="6" w:space="0" w:color="C4C7C5"/>
+              <w:right w:val="single" w:sz="6" w:space="0" w:color="C4C7C5"/>
+            </w:tcBorders>
+            <w:tcMar>
+              <w:top w:w="120" w:type="dxa"/>
+              <w:left w:w="180" w:type="dxa"/>
+              <w:bottom w:w="120" w:type="dxa"/>
+              <w:right w:w="180" w:type="dxa"/>
+            </w:tcMar>
+            <w:vAlign w:val="center"/>
+            <w:hideMark/>
+          </w:tcPr>
+          <w:p>
+            <w:r>
+              <w:t>Add a distance category to an event</w:t>
             </w:r>
           </w:p>
         </w:tc>
@@ -1165,47 +1535,63 @@
           </w:tcPr>
           <w:p>
             <w:r>
-              <w:t>{"title": "...", "</w:t>
+              <w:t>{"</w:t>
             </w:r>
             <w:proofErr w:type="spellStart"/>
             <w:r>
-              <w:t>eventType</w:t>
+              <w:t>categoryName</w:t>
             </w:r>
             <w:proofErr w:type="spellEnd"/>
             <w:r>
-              <w:t>": "Running", "location": "...", "</w:t>
+              <w:t>": "21km Half", "</w:t>
             </w:r>
             <w:proofErr w:type="spellStart"/>
             <w:r>
-              <w:t>eventDate</w:t>
+              <w:t>distanceKm</w:t>
             </w:r>
             <w:proofErr w:type="spellEnd"/>
             <w:r>
-              <w:t>": "2026-10-15"}</w:t>
-            </w:r>
-          </w:p>
-        </w:tc>
-        <w:tc>
-          <w:tcPr>
-            <w:tcW w:w="0" w:type="auto"/>
-            <w:tcBorders>
-              <w:top w:val="single" w:sz="6" w:space="0" w:color="C4C7C5"/>
-              <w:left w:val="single" w:sz="6" w:space="0" w:color="C4C7C5"/>
-              <w:bottom w:val="single" w:sz="6" w:space="0" w:color="C4C7C5"/>
-              <w:right w:val="single" w:sz="6" w:space="0" w:color="C4C7C5"/>
-            </w:tcBorders>
-            <w:tcMar>
-              <w:top w:w="120" w:type="dxa"/>
-              <w:left w:w="180" w:type="dxa"/>
-              <w:bottom w:w="120" w:type="dxa"/>
-              <w:right w:w="180" w:type="dxa"/>
-            </w:tcMar>
-            <w:vAlign w:val="center"/>
-            <w:hideMark/>
-          </w:tcPr>
-          <w:p>
-            <w:r>
-              <w:t>201 Created - Created Event details; 403 Forbidden</w:t>
+              <w:t>": 21.1, "</w:t>
+            </w:r>
+            <w:proofErr w:type="spellStart"/>
+            <w:r>
+              <w:t>entryFee</w:t>
+            </w:r>
+            <w:proofErr w:type="spellEnd"/>
+            <w:r>
+              <w:t>": 250.00, "</w:t>
+            </w:r>
+            <w:proofErr w:type="spellStart"/>
+            <w:r>
+              <w:t>maxCapacity</w:t>
+            </w:r>
+            <w:proofErr w:type="spellEnd"/>
+            <w:r>
+              <w:t>": 500}</w:t>
+            </w:r>
+          </w:p>
+        </w:tc>
+        <w:tc>
+          <w:tcPr>
+            <w:tcW w:w="0" w:type="auto"/>
+            <w:tcBorders>
+              <w:top w:val="single" w:sz="6" w:space="0" w:color="C4C7C5"/>
+              <w:left w:val="single" w:sz="6" w:space="0" w:color="C4C7C5"/>
+              <w:bottom w:val="single" w:sz="6" w:space="0" w:color="C4C7C5"/>
+              <w:right w:val="single" w:sz="6" w:space="0" w:color="C4C7C5"/>
+            </w:tcBorders>
+            <w:tcMar>
+              <w:top w:w="120" w:type="dxa"/>
+              <w:left w:w="180" w:type="dxa"/>
+              <w:bottom w:w="120" w:type="dxa"/>
+              <w:right w:w="180" w:type="dxa"/>
+            </w:tcMar>
+            <w:vAlign w:val="center"/>
+            <w:hideMark/>
+          </w:tcPr>
+          <w:p>
+            <w:r>
+              <w:t>201 Created - Category object</w:t>
             </w:r>
           </w:p>
         </w:tc>
@@ -1216,7 +1602,7 @@
         </w:trPr>
         <w:tc>
           <w:tcPr>
-            <w:tcW w:w="0" w:type="auto"/>
+            <w:tcW w:w="2122" w:type="dxa"/>
             <w:tcBorders>
               <w:top w:val="single" w:sz="6" w:space="0" w:color="C4C7C5"/>
               <w:left w:val="single" w:sz="6" w:space="0" w:color="C4C7C5"/>
@@ -1276,35 +1662,35 @@
             </w:r>
             <w:proofErr w:type="gramStart"/>
             <w:r>
-              <w:t>events/{</w:t>
+              <w:t>events/{id}/</w:t>
             </w:r>
             <w:proofErr w:type="gramEnd"/>
             <w:r>
-              <w:t>id}</w:t>
-            </w:r>
-          </w:p>
-        </w:tc>
-        <w:tc>
-          <w:tcPr>
-            <w:tcW w:w="0" w:type="auto"/>
-            <w:tcBorders>
-              <w:top w:val="single" w:sz="6" w:space="0" w:color="C4C7C5"/>
-              <w:left w:val="single" w:sz="6" w:space="0" w:color="C4C7C5"/>
-              <w:bottom w:val="single" w:sz="6" w:space="0" w:color="C4C7C5"/>
-              <w:right w:val="single" w:sz="6" w:space="0" w:color="C4C7C5"/>
-            </w:tcBorders>
-            <w:tcMar>
-              <w:top w:w="120" w:type="dxa"/>
-              <w:left w:w="180" w:type="dxa"/>
-              <w:bottom w:w="120" w:type="dxa"/>
-              <w:right w:w="180" w:type="dxa"/>
-            </w:tcMar>
-            <w:vAlign w:val="center"/>
-            <w:hideMark/>
-          </w:tcPr>
-          <w:p>
-            <w:r>
-              <w:t>Get event details, weather, and categories</w:t>
+              <w:t>categories</w:t>
+            </w:r>
+          </w:p>
+        </w:tc>
+        <w:tc>
+          <w:tcPr>
+            <w:tcW w:w="0" w:type="auto"/>
+            <w:tcBorders>
+              <w:top w:val="single" w:sz="6" w:space="0" w:color="C4C7C5"/>
+              <w:left w:val="single" w:sz="6" w:space="0" w:color="C4C7C5"/>
+              <w:bottom w:val="single" w:sz="6" w:space="0" w:color="C4C7C5"/>
+              <w:right w:val="single" w:sz="6" w:space="0" w:color="C4C7C5"/>
+            </w:tcBorders>
+            <w:tcMar>
+              <w:top w:w="120" w:type="dxa"/>
+              <w:left w:w="180" w:type="dxa"/>
+              <w:bottom w:w="120" w:type="dxa"/>
+              <w:right w:w="180" w:type="dxa"/>
+            </w:tcMar>
+            <w:vAlign w:val="center"/>
+            <w:hideMark/>
+          </w:tcPr>
+          <w:p>
+            <w:r>
+              <w:t>Get all categories for a specific event</w:t>
             </w:r>
           </w:p>
         </w:tc>
@@ -1376,7 +1762,7 @@
           </w:tcPr>
           <w:p>
             <w:r>
-              <w:t>200 OK - Event object with nested categories</w:t>
+              <w:t>200 OK - Array of Category objects</w:t>
             </w:r>
           </w:p>
         </w:tc>
@@ -1387,7 +1773,354 @@
         </w:trPr>
         <w:tc>
           <w:tcPr>
-            <w:tcW w:w="0" w:type="auto"/>
+            <w:tcW w:w="2122" w:type="dxa"/>
+            <w:tcBorders>
+              <w:top w:val="single" w:sz="6" w:space="0" w:color="C4C7C5"/>
+              <w:left w:val="single" w:sz="6" w:space="0" w:color="C4C7C5"/>
+              <w:bottom w:val="single" w:sz="6" w:space="0" w:color="C4C7C5"/>
+              <w:right w:val="single" w:sz="6" w:space="0" w:color="C4C7C5"/>
+            </w:tcBorders>
+            <w:tcMar>
+              <w:top w:w="120" w:type="dxa"/>
+              <w:left w:w="180" w:type="dxa"/>
+              <w:bottom w:w="120" w:type="dxa"/>
+              <w:right w:w="180" w:type="dxa"/>
+            </w:tcMar>
+            <w:vAlign w:val="center"/>
+            <w:hideMark/>
+          </w:tcPr>
+          <w:p>
+            <w:r>
+              <w:rPr>
+                <w:b/>
+                <w:bCs/>
+              </w:rPr>
+              <w:lastRenderedPageBreak/>
+              <w:t>POST</w:t>
+            </w:r>
+          </w:p>
+        </w:tc>
+        <w:tc>
+          <w:tcPr>
+            <w:tcW w:w="0" w:type="auto"/>
+            <w:tcBorders>
+              <w:top w:val="single" w:sz="6" w:space="0" w:color="C4C7C5"/>
+              <w:left w:val="single" w:sz="6" w:space="0" w:color="C4C7C5"/>
+              <w:bottom w:val="single" w:sz="6" w:space="0" w:color="C4C7C5"/>
+              <w:right w:val="single" w:sz="6" w:space="0" w:color="C4C7C5"/>
+            </w:tcBorders>
+            <w:tcMar>
+              <w:top w:w="120" w:type="dxa"/>
+              <w:left w:w="180" w:type="dxa"/>
+              <w:bottom w:w="120" w:type="dxa"/>
+              <w:right w:w="180" w:type="dxa"/>
+            </w:tcMar>
+            <w:vAlign w:val="center"/>
+            <w:hideMark/>
+          </w:tcPr>
+          <w:p>
+            <w:r>
+              <w:t>/</w:t>
+            </w:r>
+            <w:proofErr w:type="spellStart"/>
+            <w:r>
+              <w:t>api</w:t>
+            </w:r>
+            <w:proofErr w:type="spellEnd"/>
+            <w:r>
+              <w:t>/enrolments</w:t>
+            </w:r>
+          </w:p>
+        </w:tc>
+        <w:tc>
+          <w:tcPr>
+            <w:tcW w:w="0" w:type="auto"/>
+            <w:tcBorders>
+              <w:top w:val="single" w:sz="6" w:space="0" w:color="C4C7C5"/>
+              <w:left w:val="single" w:sz="6" w:space="0" w:color="C4C7C5"/>
+              <w:bottom w:val="single" w:sz="6" w:space="0" w:color="C4C7C5"/>
+              <w:right w:val="single" w:sz="6" w:space="0" w:color="C4C7C5"/>
+            </w:tcBorders>
+            <w:tcMar>
+              <w:top w:w="120" w:type="dxa"/>
+              <w:left w:w="180" w:type="dxa"/>
+              <w:bottom w:w="120" w:type="dxa"/>
+              <w:right w:w="180" w:type="dxa"/>
+            </w:tcMar>
+            <w:vAlign w:val="center"/>
+            <w:hideMark/>
+          </w:tcPr>
+          <w:p>
+            <w:r>
+              <w:t>Register a participant for a race category</w:t>
+            </w:r>
+          </w:p>
+        </w:tc>
+        <w:tc>
+          <w:tcPr>
+            <w:tcW w:w="0" w:type="auto"/>
+            <w:tcBorders>
+              <w:top w:val="single" w:sz="6" w:space="0" w:color="C4C7C5"/>
+              <w:left w:val="single" w:sz="6" w:space="0" w:color="C4C7C5"/>
+              <w:bottom w:val="single" w:sz="6" w:space="0" w:color="C4C7C5"/>
+              <w:right w:val="single" w:sz="6" w:space="0" w:color="C4C7C5"/>
+            </w:tcBorders>
+            <w:tcMar>
+              <w:top w:w="120" w:type="dxa"/>
+              <w:left w:w="180" w:type="dxa"/>
+              <w:bottom w:w="120" w:type="dxa"/>
+              <w:right w:w="180" w:type="dxa"/>
+            </w:tcMar>
+            <w:vAlign w:val="center"/>
+            <w:hideMark/>
+          </w:tcPr>
+          <w:p>
+            <w:r>
+              <w:t>Participant</w:t>
+            </w:r>
+          </w:p>
+        </w:tc>
+        <w:tc>
+          <w:tcPr>
+            <w:tcW w:w="0" w:type="auto"/>
+            <w:tcBorders>
+              <w:top w:val="single" w:sz="6" w:space="0" w:color="C4C7C5"/>
+              <w:left w:val="single" w:sz="6" w:space="0" w:color="C4C7C5"/>
+              <w:bottom w:val="single" w:sz="6" w:space="0" w:color="C4C7C5"/>
+              <w:right w:val="single" w:sz="6" w:space="0" w:color="C4C7C5"/>
+            </w:tcBorders>
+            <w:tcMar>
+              <w:top w:w="120" w:type="dxa"/>
+              <w:left w:w="180" w:type="dxa"/>
+              <w:bottom w:w="120" w:type="dxa"/>
+              <w:right w:w="180" w:type="dxa"/>
+            </w:tcMar>
+            <w:vAlign w:val="center"/>
+            <w:hideMark/>
+          </w:tcPr>
+          <w:p>
+            <w:r>
+              <w:t>{"</w:t>
+            </w:r>
+            <w:proofErr w:type="spellStart"/>
+            <w:r>
+              <w:t>eventID</w:t>
+            </w:r>
+            <w:proofErr w:type="spellEnd"/>
+            <w:r>
+              <w:t>": 1, "</w:t>
+            </w:r>
+            <w:proofErr w:type="spellStart"/>
+            <w:r>
+              <w:t>categoryID</w:t>
+            </w:r>
+            <w:proofErr w:type="spellEnd"/>
+            <w:r>
+              <w:t>": 2}</w:t>
+            </w:r>
+          </w:p>
+        </w:tc>
+        <w:tc>
+          <w:tcPr>
+            <w:tcW w:w="0" w:type="auto"/>
+            <w:tcBorders>
+              <w:top w:val="single" w:sz="6" w:space="0" w:color="C4C7C5"/>
+              <w:left w:val="single" w:sz="6" w:space="0" w:color="C4C7C5"/>
+              <w:bottom w:val="single" w:sz="6" w:space="0" w:color="C4C7C5"/>
+              <w:right w:val="single" w:sz="6" w:space="0" w:color="C4C7C5"/>
+            </w:tcBorders>
+            <w:tcMar>
+              <w:top w:w="120" w:type="dxa"/>
+              <w:left w:w="180" w:type="dxa"/>
+              <w:bottom w:w="120" w:type="dxa"/>
+              <w:right w:w="180" w:type="dxa"/>
+            </w:tcMar>
+            <w:vAlign w:val="center"/>
+            <w:hideMark/>
+          </w:tcPr>
+          <w:p>
+            <w:r>
+              <w:t xml:space="preserve">201 Created - Enrolment details with generated </w:t>
+            </w:r>
+            <w:proofErr w:type="spellStart"/>
+            <w:r>
+              <w:t>BibNumber</w:t>
+            </w:r>
+            <w:proofErr w:type="spellEnd"/>
+            <w:r>
+              <w:t>; 409 Conflict (Already entered)</w:t>
+            </w:r>
+          </w:p>
+        </w:tc>
+      </w:tr>
+      <w:tr>
+        <w:trPr>
+          <w:tblCellSpacing w:w="15" w:type="dxa"/>
+        </w:trPr>
+        <w:tc>
+          <w:tcPr>
+            <w:tcW w:w="2122" w:type="dxa"/>
+            <w:tcBorders>
+              <w:top w:val="single" w:sz="6" w:space="0" w:color="C4C7C5"/>
+              <w:left w:val="single" w:sz="6" w:space="0" w:color="C4C7C5"/>
+              <w:bottom w:val="single" w:sz="6" w:space="0" w:color="C4C7C5"/>
+              <w:right w:val="single" w:sz="6" w:space="0" w:color="C4C7C5"/>
+            </w:tcBorders>
+            <w:tcMar>
+              <w:top w:w="120" w:type="dxa"/>
+              <w:left w:w="180" w:type="dxa"/>
+              <w:bottom w:w="120" w:type="dxa"/>
+              <w:right w:w="180" w:type="dxa"/>
+            </w:tcMar>
+            <w:vAlign w:val="center"/>
+            <w:hideMark/>
+          </w:tcPr>
+          <w:p>
+            <w:r>
+              <w:rPr>
+                <w:b/>
+                <w:bCs/>
+              </w:rPr>
+              <w:t>GET</w:t>
+            </w:r>
+          </w:p>
+        </w:tc>
+        <w:tc>
+          <w:tcPr>
+            <w:tcW w:w="0" w:type="auto"/>
+            <w:tcBorders>
+              <w:top w:val="single" w:sz="6" w:space="0" w:color="C4C7C5"/>
+              <w:left w:val="single" w:sz="6" w:space="0" w:color="C4C7C5"/>
+              <w:bottom w:val="single" w:sz="6" w:space="0" w:color="C4C7C5"/>
+              <w:right w:val="single" w:sz="6" w:space="0" w:color="C4C7C5"/>
+            </w:tcBorders>
+            <w:tcMar>
+              <w:top w:w="120" w:type="dxa"/>
+              <w:left w:w="180" w:type="dxa"/>
+              <w:bottom w:w="120" w:type="dxa"/>
+              <w:right w:w="180" w:type="dxa"/>
+            </w:tcMar>
+            <w:vAlign w:val="center"/>
+            <w:hideMark/>
+          </w:tcPr>
+          <w:p>
+            <w:r>
+              <w:t>/</w:t>
+            </w:r>
+            <w:proofErr w:type="spellStart"/>
+            <w:r>
+              <w:t>api</w:t>
+            </w:r>
+            <w:proofErr w:type="spellEnd"/>
+            <w:r>
+              <w:t>/enrolments/my-entries</w:t>
+            </w:r>
+          </w:p>
+        </w:tc>
+        <w:tc>
+          <w:tcPr>
+            <w:tcW w:w="0" w:type="auto"/>
+            <w:tcBorders>
+              <w:top w:val="single" w:sz="6" w:space="0" w:color="C4C7C5"/>
+              <w:left w:val="single" w:sz="6" w:space="0" w:color="C4C7C5"/>
+              <w:bottom w:val="single" w:sz="6" w:space="0" w:color="C4C7C5"/>
+              <w:right w:val="single" w:sz="6" w:space="0" w:color="C4C7C5"/>
+            </w:tcBorders>
+            <w:tcMar>
+              <w:top w:w="120" w:type="dxa"/>
+              <w:left w:w="180" w:type="dxa"/>
+              <w:bottom w:w="120" w:type="dxa"/>
+              <w:right w:w="180" w:type="dxa"/>
+            </w:tcMar>
+            <w:vAlign w:val="center"/>
+            <w:hideMark/>
+          </w:tcPr>
+          <w:p>
+            <w:r>
+              <w:t>View logged-in user's race registrations</w:t>
+            </w:r>
+          </w:p>
+        </w:tc>
+        <w:tc>
+          <w:tcPr>
+            <w:tcW w:w="0" w:type="auto"/>
+            <w:tcBorders>
+              <w:top w:val="single" w:sz="6" w:space="0" w:color="C4C7C5"/>
+              <w:left w:val="single" w:sz="6" w:space="0" w:color="C4C7C5"/>
+              <w:bottom w:val="single" w:sz="6" w:space="0" w:color="C4C7C5"/>
+              <w:right w:val="single" w:sz="6" w:space="0" w:color="C4C7C5"/>
+            </w:tcBorders>
+            <w:tcMar>
+              <w:top w:w="120" w:type="dxa"/>
+              <w:left w:w="180" w:type="dxa"/>
+              <w:bottom w:w="120" w:type="dxa"/>
+              <w:right w:w="180" w:type="dxa"/>
+            </w:tcMar>
+            <w:vAlign w:val="center"/>
+            <w:hideMark/>
+          </w:tcPr>
+          <w:p>
+            <w:r>
+              <w:t>Participant</w:t>
+            </w:r>
+          </w:p>
+        </w:tc>
+        <w:tc>
+          <w:tcPr>
+            <w:tcW w:w="0" w:type="auto"/>
+            <w:tcBorders>
+              <w:top w:val="single" w:sz="6" w:space="0" w:color="C4C7C5"/>
+              <w:left w:val="single" w:sz="6" w:space="0" w:color="C4C7C5"/>
+              <w:bottom w:val="single" w:sz="6" w:space="0" w:color="C4C7C5"/>
+              <w:right w:val="single" w:sz="6" w:space="0" w:color="C4C7C5"/>
+            </w:tcBorders>
+            <w:tcMar>
+              <w:top w:w="120" w:type="dxa"/>
+              <w:left w:w="180" w:type="dxa"/>
+              <w:bottom w:w="120" w:type="dxa"/>
+              <w:right w:w="180" w:type="dxa"/>
+            </w:tcMar>
+            <w:vAlign w:val="center"/>
+            <w:hideMark/>
+          </w:tcPr>
+          <w:p>
+            <w:r>
+              <w:t>None</w:t>
+            </w:r>
+          </w:p>
+        </w:tc>
+        <w:tc>
+          <w:tcPr>
+            <w:tcW w:w="0" w:type="auto"/>
+            <w:tcBorders>
+              <w:top w:val="single" w:sz="6" w:space="0" w:color="C4C7C5"/>
+              <w:left w:val="single" w:sz="6" w:space="0" w:color="C4C7C5"/>
+              <w:bottom w:val="single" w:sz="6" w:space="0" w:color="C4C7C5"/>
+              <w:right w:val="single" w:sz="6" w:space="0" w:color="C4C7C5"/>
+            </w:tcBorders>
+            <w:tcMar>
+              <w:top w:w="120" w:type="dxa"/>
+              <w:left w:w="180" w:type="dxa"/>
+              <w:bottom w:w="120" w:type="dxa"/>
+              <w:right w:w="180" w:type="dxa"/>
+            </w:tcMar>
+            <w:vAlign w:val="center"/>
+            <w:hideMark/>
+          </w:tcPr>
+          <w:p>
+            <w:r>
+              <w:t>200 OK - Array of active participant enrolments</w:t>
+            </w:r>
+          </w:p>
+        </w:tc>
+      </w:tr>
+      <w:tr>
+        <w:trPr>
+          <w:tblCellSpacing w:w="15" w:type="dxa"/>
+        </w:trPr>
+        <w:tc>
+          <w:tcPr>
+            <w:tcW w:w="2122" w:type="dxa"/>
             <w:tcBorders>
               <w:top w:val="single" w:sz="6" w:space="0" w:color="C4C7C5"/>
               <w:left w:val="single" w:sz="6" w:space="0" w:color="C4C7C5"/>
@@ -1436,46 +2169,36 @@
               <w:t>/</w:t>
             </w:r>
             <w:proofErr w:type="spellStart"/>
-            <w:proofErr w:type="gramStart"/>
             <w:r>
               <w:t>api</w:t>
             </w:r>
             <w:proofErr w:type="spellEnd"/>
-            <w:proofErr w:type="gramEnd"/>
-            <w:r>
-              <w:t>/</w:t>
-            </w:r>
-            <w:proofErr w:type="gramStart"/>
-            <w:r>
-              <w:t>events/{id}/</w:t>
-            </w:r>
-            <w:proofErr w:type="gramEnd"/>
-            <w:r>
-              <w:t>categories</w:t>
-            </w:r>
-          </w:p>
-        </w:tc>
-        <w:tc>
-          <w:tcPr>
-            <w:tcW w:w="0" w:type="auto"/>
-            <w:tcBorders>
-              <w:top w:val="single" w:sz="6" w:space="0" w:color="C4C7C5"/>
-              <w:left w:val="single" w:sz="6" w:space="0" w:color="C4C7C5"/>
-              <w:bottom w:val="single" w:sz="6" w:space="0" w:color="C4C7C5"/>
-              <w:right w:val="single" w:sz="6" w:space="0" w:color="C4C7C5"/>
-            </w:tcBorders>
-            <w:tcMar>
-              <w:top w:w="120" w:type="dxa"/>
-              <w:left w:w="180" w:type="dxa"/>
-              <w:bottom w:w="120" w:type="dxa"/>
-              <w:right w:w="180" w:type="dxa"/>
-            </w:tcMar>
-            <w:vAlign w:val="center"/>
-            <w:hideMark/>
-          </w:tcPr>
-          <w:p>
-            <w:r>
-              <w:t>Add a distance category to an event</w:t>
+            <w:r>
+              <w:t>/results</w:t>
+            </w:r>
+          </w:p>
+        </w:tc>
+        <w:tc>
+          <w:tcPr>
+            <w:tcW w:w="0" w:type="auto"/>
+            <w:tcBorders>
+              <w:top w:val="single" w:sz="6" w:space="0" w:color="C4C7C5"/>
+              <w:left w:val="single" w:sz="6" w:space="0" w:color="C4C7C5"/>
+              <w:bottom w:val="single" w:sz="6" w:space="0" w:color="C4C7C5"/>
+              <w:right w:val="single" w:sz="6" w:space="0" w:color="C4C7C5"/>
+            </w:tcBorders>
+            <w:tcMar>
+              <w:top w:w="120" w:type="dxa"/>
+              <w:left w:w="180" w:type="dxa"/>
+              <w:bottom w:w="120" w:type="dxa"/>
+              <w:right w:w="180" w:type="dxa"/>
+            </w:tcMar>
+            <w:vAlign w:val="center"/>
+            <w:hideMark/>
+          </w:tcPr>
+          <w:p>
+            <w:r>
+              <w:t>Upload/record an official participant result</w:t>
             </w:r>
           </w:p>
         </w:tc>
@@ -1529,64 +2252,51 @@
             </w:r>
             <w:proofErr w:type="spellStart"/>
             <w:r>
-              <w:t>categoryName</w:t>
+              <w:t>enrolmentID</w:t>
             </w:r>
             <w:proofErr w:type="spellEnd"/>
             <w:r>
-              <w:t>": "21km Half", "</w:t>
+              <w:t>": 1, "</w:t>
             </w:r>
             <w:proofErr w:type="spellStart"/>
             <w:r>
-              <w:t>distanceKm</w:t>
+              <w:t>finishTime</w:t>
             </w:r>
             <w:proofErr w:type="spellEnd"/>
             <w:r>
-              <w:t>": 21.1, "</w:t>
+              <w:t>": "01:45:22", "</w:t>
             </w:r>
             <w:proofErr w:type="spellStart"/>
             <w:r>
-              <w:t>entryFee</w:t>
+              <w:t>overallPosition</w:t>
             </w:r>
             <w:proofErr w:type="spellEnd"/>
             <w:r>
-              <w:t xml:space="preserve">": </w:t>
-            </w:r>
-            <w:r>
-              <w:lastRenderedPageBreak/>
-              <w:t>250.00, "</w:t>
-            </w:r>
-            <w:proofErr w:type="spellStart"/>
-            <w:r>
-              <w:t>maxCapacity</w:t>
-            </w:r>
-            <w:proofErr w:type="spellEnd"/>
-            <w:r>
-              <w:t>": 500}</w:t>
-            </w:r>
-          </w:p>
-        </w:tc>
-        <w:tc>
-          <w:tcPr>
-            <w:tcW w:w="0" w:type="auto"/>
-            <w:tcBorders>
-              <w:top w:val="single" w:sz="6" w:space="0" w:color="C4C7C5"/>
-              <w:left w:val="single" w:sz="6" w:space="0" w:color="C4C7C5"/>
-              <w:bottom w:val="single" w:sz="6" w:space="0" w:color="C4C7C5"/>
-              <w:right w:val="single" w:sz="6" w:space="0" w:color="C4C7C5"/>
-            </w:tcBorders>
-            <w:tcMar>
-              <w:top w:w="120" w:type="dxa"/>
-              <w:left w:w="180" w:type="dxa"/>
-              <w:bottom w:w="120" w:type="dxa"/>
-              <w:right w:w="180" w:type="dxa"/>
-            </w:tcMar>
-            <w:vAlign w:val="center"/>
-            <w:hideMark/>
-          </w:tcPr>
-          <w:p>
-            <w:r>
-              <w:lastRenderedPageBreak/>
-              <w:t>201 Created - Category object</w:t>
+              <w:t>": 14, "status": "Finished"}</w:t>
+            </w:r>
+          </w:p>
+        </w:tc>
+        <w:tc>
+          <w:tcPr>
+            <w:tcW w:w="0" w:type="auto"/>
+            <w:tcBorders>
+              <w:top w:val="single" w:sz="6" w:space="0" w:color="C4C7C5"/>
+              <w:left w:val="single" w:sz="6" w:space="0" w:color="C4C7C5"/>
+              <w:bottom w:val="single" w:sz="6" w:space="0" w:color="C4C7C5"/>
+              <w:right w:val="single" w:sz="6" w:space="0" w:color="C4C7C5"/>
+            </w:tcBorders>
+            <w:tcMar>
+              <w:top w:w="120" w:type="dxa"/>
+              <w:left w:w="180" w:type="dxa"/>
+              <w:bottom w:w="120" w:type="dxa"/>
+              <w:right w:w="180" w:type="dxa"/>
+            </w:tcMar>
+            <w:vAlign w:val="center"/>
+            <w:hideMark/>
+          </w:tcPr>
+          <w:p>
+            <w:r>
+              <w:t>201 Created - Result object; 400 Bad Request</w:t>
             </w:r>
           </w:p>
         </w:tc>
@@ -1597,7 +2307,7 @@
         </w:trPr>
         <w:tc>
           <w:tcPr>
-            <w:tcW w:w="0" w:type="auto"/>
+            <w:tcW w:w="2122" w:type="dxa"/>
             <w:tcBorders>
               <w:top w:val="single" w:sz="6" w:space="0" w:color="C4C7C5"/>
               <w:left w:val="single" w:sz="6" w:space="0" w:color="C4C7C5"/>
@@ -1646,69 +2356,77 @@
               <w:t>/</w:t>
             </w:r>
             <w:proofErr w:type="spellStart"/>
+            <w:r>
+              <w:t>api</w:t>
+            </w:r>
+            <w:proofErr w:type="spellEnd"/>
+            <w:r>
+              <w:t>/results/</w:t>
+            </w:r>
             <w:proofErr w:type="gramStart"/>
             <w:r>
-              <w:t>api</w:t>
+              <w:t>event/{</w:t>
+            </w:r>
+            <w:proofErr w:type="spellStart"/>
+            <w:proofErr w:type="gramEnd"/>
+            <w:r>
+              <w:t>eventId</w:t>
             </w:r>
             <w:proofErr w:type="spellEnd"/>
-            <w:proofErr w:type="gramEnd"/>
-            <w:r>
-              <w:t>/</w:t>
-            </w:r>
-            <w:proofErr w:type="gramStart"/>
-            <w:r>
-              <w:t>events/{id}/</w:t>
-            </w:r>
-            <w:proofErr w:type="gramEnd"/>
-            <w:r>
-              <w:t>categories</w:t>
-            </w:r>
-          </w:p>
-        </w:tc>
-        <w:tc>
-          <w:tcPr>
-            <w:tcW w:w="0" w:type="auto"/>
-            <w:tcBorders>
-              <w:top w:val="single" w:sz="6" w:space="0" w:color="C4C7C5"/>
-              <w:left w:val="single" w:sz="6" w:space="0" w:color="C4C7C5"/>
-              <w:bottom w:val="single" w:sz="6" w:space="0" w:color="C4C7C5"/>
-              <w:right w:val="single" w:sz="6" w:space="0" w:color="C4C7C5"/>
-            </w:tcBorders>
-            <w:tcMar>
-              <w:top w:w="120" w:type="dxa"/>
-              <w:left w:w="180" w:type="dxa"/>
-              <w:bottom w:w="120" w:type="dxa"/>
-              <w:right w:w="180" w:type="dxa"/>
-            </w:tcMar>
-            <w:vAlign w:val="center"/>
-            <w:hideMark/>
-          </w:tcPr>
-          <w:p>
-            <w:r>
-              <w:t>Get all categories for a specific event</w:t>
-            </w:r>
-          </w:p>
-        </w:tc>
-        <w:tc>
-          <w:tcPr>
-            <w:tcW w:w="0" w:type="auto"/>
-            <w:tcBorders>
-              <w:top w:val="single" w:sz="6" w:space="0" w:color="C4C7C5"/>
-              <w:left w:val="single" w:sz="6" w:space="0" w:color="C4C7C5"/>
-              <w:bottom w:val="single" w:sz="6" w:space="0" w:color="C4C7C5"/>
-              <w:right w:val="single" w:sz="6" w:space="0" w:color="C4C7C5"/>
-            </w:tcBorders>
-            <w:tcMar>
-              <w:top w:w="120" w:type="dxa"/>
-              <w:left w:w="180" w:type="dxa"/>
-              <w:bottom w:w="120" w:type="dxa"/>
-              <w:right w:w="180" w:type="dxa"/>
-            </w:tcMar>
-            <w:vAlign w:val="center"/>
-            <w:hideMark/>
-          </w:tcPr>
-          <w:p>
-            <w:r>
+            <w:r>
+              <w:t>}</w:t>
+            </w:r>
+          </w:p>
+        </w:tc>
+        <w:tc>
+          <w:tcPr>
+            <w:tcW w:w="0" w:type="auto"/>
+            <w:tcBorders>
+              <w:top w:val="single" w:sz="6" w:space="0" w:color="C4C7C5"/>
+              <w:left w:val="single" w:sz="6" w:space="0" w:color="C4C7C5"/>
+              <w:bottom w:val="single" w:sz="6" w:space="0" w:color="C4C7C5"/>
+              <w:right w:val="single" w:sz="6" w:space="0" w:color="C4C7C5"/>
+            </w:tcBorders>
+            <w:tcMar>
+              <w:top w:w="120" w:type="dxa"/>
+              <w:left w:w="180" w:type="dxa"/>
+              <w:bottom w:w="120" w:type="dxa"/>
+              <w:right w:w="180" w:type="dxa"/>
+            </w:tcMar>
+            <w:vAlign w:val="center"/>
+            <w:hideMark/>
+          </w:tcPr>
+          <w:p>
+            <w:r>
+              <w:t xml:space="preserve">View public race results and </w:t>
+            </w:r>
+            <w:r>
+              <w:lastRenderedPageBreak/>
+              <w:t>leaderboard</w:t>
+            </w:r>
+          </w:p>
+        </w:tc>
+        <w:tc>
+          <w:tcPr>
+            <w:tcW w:w="0" w:type="auto"/>
+            <w:tcBorders>
+              <w:top w:val="single" w:sz="6" w:space="0" w:color="C4C7C5"/>
+              <w:left w:val="single" w:sz="6" w:space="0" w:color="C4C7C5"/>
+              <w:bottom w:val="single" w:sz="6" w:space="0" w:color="C4C7C5"/>
+              <w:right w:val="single" w:sz="6" w:space="0" w:color="C4C7C5"/>
+            </w:tcBorders>
+            <w:tcMar>
+              <w:top w:w="120" w:type="dxa"/>
+              <w:left w:w="180" w:type="dxa"/>
+              <w:bottom w:w="120" w:type="dxa"/>
+              <w:right w:w="180" w:type="dxa"/>
+            </w:tcMar>
+            <w:vAlign w:val="center"/>
+            <w:hideMark/>
+          </w:tcPr>
+          <w:p>
+            <w:r>
+              <w:lastRenderedPageBreak/>
               <w:t>None (Public)</w:t>
             </w:r>
           </w:p>
@@ -1757,7 +2475,7 @@
           </w:tcPr>
           <w:p>
             <w:r>
-              <w:t>200 OK - Array of Category objects</w:t>
+              <w:t>200 OK - Sorted leaderboard array</w:t>
             </w:r>
           </w:p>
         </w:tc>
@@ -1768,192 +2486,7 @@
         </w:trPr>
         <w:tc>
           <w:tcPr>
-            <w:tcW w:w="0" w:type="auto"/>
-            <w:tcBorders>
-              <w:top w:val="single" w:sz="6" w:space="0" w:color="C4C7C5"/>
-              <w:left w:val="single" w:sz="6" w:space="0" w:color="C4C7C5"/>
-              <w:bottom w:val="single" w:sz="6" w:space="0" w:color="C4C7C5"/>
-              <w:right w:val="single" w:sz="6" w:space="0" w:color="C4C7C5"/>
-            </w:tcBorders>
-            <w:tcMar>
-              <w:top w:w="120" w:type="dxa"/>
-              <w:left w:w="180" w:type="dxa"/>
-              <w:bottom w:w="120" w:type="dxa"/>
-              <w:right w:w="180" w:type="dxa"/>
-            </w:tcMar>
-            <w:vAlign w:val="center"/>
-            <w:hideMark/>
-          </w:tcPr>
-          <w:p>
-            <w:r>
-              <w:rPr>
-                <w:b/>
-                <w:bCs/>
-              </w:rPr>
-              <w:t>POST</w:t>
-            </w:r>
-          </w:p>
-        </w:tc>
-        <w:tc>
-          <w:tcPr>
-            <w:tcW w:w="0" w:type="auto"/>
-            <w:tcBorders>
-              <w:top w:val="single" w:sz="6" w:space="0" w:color="C4C7C5"/>
-              <w:left w:val="single" w:sz="6" w:space="0" w:color="C4C7C5"/>
-              <w:bottom w:val="single" w:sz="6" w:space="0" w:color="C4C7C5"/>
-              <w:right w:val="single" w:sz="6" w:space="0" w:color="C4C7C5"/>
-            </w:tcBorders>
-            <w:tcMar>
-              <w:top w:w="120" w:type="dxa"/>
-              <w:left w:w="180" w:type="dxa"/>
-              <w:bottom w:w="120" w:type="dxa"/>
-              <w:right w:w="180" w:type="dxa"/>
-            </w:tcMar>
-            <w:vAlign w:val="center"/>
-            <w:hideMark/>
-          </w:tcPr>
-          <w:p>
-            <w:r>
-              <w:t>/</w:t>
-            </w:r>
-            <w:proofErr w:type="spellStart"/>
-            <w:r>
-              <w:t>api</w:t>
-            </w:r>
-            <w:proofErr w:type="spellEnd"/>
-            <w:r>
-              <w:t>/enrolments</w:t>
-            </w:r>
-          </w:p>
-        </w:tc>
-        <w:tc>
-          <w:tcPr>
-            <w:tcW w:w="0" w:type="auto"/>
-            <w:tcBorders>
-              <w:top w:val="single" w:sz="6" w:space="0" w:color="C4C7C5"/>
-              <w:left w:val="single" w:sz="6" w:space="0" w:color="C4C7C5"/>
-              <w:bottom w:val="single" w:sz="6" w:space="0" w:color="C4C7C5"/>
-              <w:right w:val="single" w:sz="6" w:space="0" w:color="C4C7C5"/>
-            </w:tcBorders>
-            <w:tcMar>
-              <w:top w:w="120" w:type="dxa"/>
-              <w:left w:w="180" w:type="dxa"/>
-              <w:bottom w:w="120" w:type="dxa"/>
-              <w:right w:w="180" w:type="dxa"/>
-            </w:tcMar>
-            <w:vAlign w:val="center"/>
-            <w:hideMark/>
-          </w:tcPr>
-          <w:p>
-            <w:r>
-              <w:t>Register a participant for a race category</w:t>
-            </w:r>
-          </w:p>
-        </w:tc>
-        <w:tc>
-          <w:tcPr>
-            <w:tcW w:w="0" w:type="auto"/>
-            <w:tcBorders>
-              <w:top w:val="single" w:sz="6" w:space="0" w:color="C4C7C5"/>
-              <w:left w:val="single" w:sz="6" w:space="0" w:color="C4C7C5"/>
-              <w:bottom w:val="single" w:sz="6" w:space="0" w:color="C4C7C5"/>
-              <w:right w:val="single" w:sz="6" w:space="0" w:color="C4C7C5"/>
-            </w:tcBorders>
-            <w:tcMar>
-              <w:top w:w="120" w:type="dxa"/>
-              <w:left w:w="180" w:type="dxa"/>
-              <w:bottom w:w="120" w:type="dxa"/>
-              <w:right w:w="180" w:type="dxa"/>
-            </w:tcMar>
-            <w:vAlign w:val="center"/>
-            <w:hideMark/>
-          </w:tcPr>
-          <w:p>
-            <w:r>
-              <w:t>Participant</w:t>
-            </w:r>
-          </w:p>
-        </w:tc>
-        <w:tc>
-          <w:tcPr>
-            <w:tcW w:w="0" w:type="auto"/>
-            <w:tcBorders>
-              <w:top w:val="single" w:sz="6" w:space="0" w:color="C4C7C5"/>
-              <w:left w:val="single" w:sz="6" w:space="0" w:color="C4C7C5"/>
-              <w:bottom w:val="single" w:sz="6" w:space="0" w:color="C4C7C5"/>
-              <w:right w:val="single" w:sz="6" w:space="0" w:color="C4C7C5"/>
-            </w:tcBorders>
-            <w:tcMar>
-              <w:top w:w="120" w:type="dxa"/>
-              <w:left w:w="180" w:type="dxa"/>
-              <w:bottom w:w="120" w:type="dxa"/>
-              <w:right w:w="180" w:type="dxa"/>
-            </w:tcMar>
-            <w:vAlign w:val="center"/>
-            <w:hideMark/>
-          </w:tcPr>
-          <w:p>
-            <w:r>
-              <w:t>{"</w:t>
-            </w:r>
-            <w:proofErr w:type="spellStart"/>
-            <w:r>
-              <w:t>eventID</w:t>
-            </w:r>
-            <w:proofErr w:type="spellEnd"/>
-            <w:r>
-              <w:t>": 1, "</w:t>
-            </w:r>
-            <w:proofErr w:type="spellStart"/>
-            <w:r>
-              <w:t>categoryID</w:t>
-            </w:r>
-            <w:proofErr w:type="spellEnd"/>
-            <w:r>
-              <w:t>": 2}</w:t>
-            </w:r>
-          </w:p>
-        </w:tc>
-        <w:tc>
-          <w:tcPr>
-            <w:tcW w:w="0" w:type="auto"/>
-            <w:tcBorders>
-              <w:top w:val="single" w:sz="6" w:space="0" w:color="C4C7C5"/>
-              <w:left w:val="single" w:sz="6" w:space="0" w:color="C4C7C5"/>
-              <w:bottom w:val="single" w:sz="6" w:space="0" w:color="C4C7C5"/>
-              <w:right w:val="single" w:sz="6" w:space="0" w:color="C4C7C5"/>
-            </w:tcBorders>
-            <w:tcMar>
-              <w:top w:w="120" w:type="dxa"/>
-              <w:left w:w="180" w:type="dxa"/>
-              <w:bottom w:w="120" w:type="dxa"/>
-              <w:right w:w="180" w:type="dxa"/>
-            </w:tcMar>
-            <w:vAlign w:val="center"/>
-            <w:hideMark/>
-          </w:tcPr>
-          <w:p>
-            <w:r>
-              <w:t xml:space="preserve">201 Created - Enrolment details with generated </w:t>
-            </w:r>
-            <w:proofErr w:type="spellStart"/>
-            <w:r>
-              <w:t>BibNumber</w:t>
-            </w:r>
-            <w:proofErr w:type="spellEnd"/>
-            <w:r>
-              <w:t>; 409 Conflict (Already entered)</w:t>
-            </w:r>
-          </w:p>
-        </w:tc>
-      </w:tr>
-      <w:tr>
-        <w:trPr>
-          <w:tblCellSpacing w:w="15" w:type="dxa"/>
-        </w:trPr>
-        <w:tc>
-          <w:tcPr>
-            <w:tcW w:w="0" w:type="auto"/>
+            <w:tcW w:w="2122" w:type="dxa"/>
             <w:tcBorders>
               <w:top w:val="single" w:sz="6" w:space="0" w:color="C4C7C5"/>
               <w:left w:val="single" w:sz="6" w:space="0" w:color="C4C7C5"/>
@@ -2007,59 +2540,59 @@
             </w:r>
             <w:proofErr w:type="spellEnd"/>
             <w:r>
-              <w:t>/enrolments/my-entries</w:t>
-            </w:r>
-          </w:p>
-        </w:tc>
-        <w:tc>
-          <w:tcPr>
-            <w:tcW w:w="0" w:type="auto"/>
-            <w:tcBorders>
-              <w:top w:val="single" w:sz="6" w:space="0" w:color="C4C7C5"/>
-              <w:left w:val="single" w:sz="6" w:space="0" w:color="C4C7C5"/>
-              <w:bottom w:val="single" w:sz="6" w:space="0" w:color="C4C7C5"/>
-              <w:right w:val="single" w:sz="6" w:space="0" w:color="C4C7C5"/>
-            </w:tcBorders>
-            <w:tcMar>
-              <w:top w:w="120" w:type="dxa"/>
-              <w:left w:w="180" w:type="dxa"/>
-              <w:bottom w:w="120" w:type="dxa"/>
-              <w:right w:w="180" w:type="dxa"/>
-            </w:tcMar>
-            <w:vAlign w:val="center"/>
-            <w:hideMark/>
-          </w:tcPr>
-          <w:p>
-            <w:r>
-              <w:t xml:space="preserve">View logged-in user's race </w:t>
-            </w:r>
-            <w:r>
-              <w:lastRenderedPageBreak/>
-              <w:t>registrations</w:t>
-            </w:r>
-          </w:p>
-        </w:tc>
-        <w:tc>
-          <w:tcPr>
-            <w:tcW w:w="0" w:type="auto"/>
-            <w:tcBorders>
-              <w:top w:val="single" w:sz="6" w:space="0" w:color="C4C7C5"/>
-              <w:left w:val="single" w:sz="6" w:space="0" w:color="C4C7C5"/>
-              <w:bottom w:val="single" w:sz="6" w:space="0" w:color="C4C7C5"/>
-              <w:right w:val="single" w:sz="6" w:space="0" w:color="C4C7C5"/>
-            </w:tcBorders>
-            <w:tcMar>
-              <w:top w:w="120" w:type="dxa"/>
-              <w:left w:w="180" w:type="dxa"/>
-              <w:bottom w:w="120" w:type="dxa"/>
-              <w:right w:w="180" w:type="dxa"/>
-            </w:tcMar>
-            <w:vAlign w:val="center"/>
-            <w:hideMark/>
-          </w:tcPr>
-          <w:p>
-            <w:r>
-              <w:lastRenderedPageBreak/>
+              <w:t>/results/my-history</w:t>
+            </w:r>
+          </w:p>
+        </w:tc>
+        <w:tc>
+          <w:tcPr>
+            <w:tcW w:w="0" w:type="auto"/>
+            <w:tcBorders>
+              <w:top w:val="single" w:sz="6" w:space="0" w:color="C4C7C5"/>
+              <w:left w:val="single" w:sz="6" w:space="0" w:color="C4C7C5"/>
+              <w:bottom w:val="single" w:sz="6" w:space="0" w:color="C4C7C5"/>
+              <w:right w:val="single" w:sz="6" w:space="0" w:color="C4C7C5"/>
+            </w:tcBorders>
+            <w:tcMar>
+              <w:top w:w="120" w:type="dxa"/>
+              <w:left w:w="180" w:type="dxa"/>
+              <w:bottom w:w="120" w:type="dxa"/>
+              <w:right w:w="180" w:type="dxa"/>
+            </w:tcMar>
+            <w:vAlign w:val="center"/>
+            <w:hideMark/>
+          </w:tcPr>
+          <w:p>
+            <w:proofErr w:type="gramStart"/>
+            <w:r>
+              <w:t>View</w:t>
+            </w:r>
+            <w:proofErr w:type="gramEnd"/>
+            <w:r>
+              <w:t xml:space="preserve"> personal finish times &amp; achievements</w:t>
+            </w:r>
+          </w:p>
+        </w:tc>
+        <w:tc>
+          <w:tcPr>
+            <w:tcW w:w="0" w:type="auto"/>
+            <w:tcBorders>
+              <w:top w:val="single" w:sz="6" w:space="0" w:color="C4C7C5"/>
+              <w:left w:val="single" w:sz="6" w:space="0" w:color="C4C7C5"/>
+              <w:bottom w:val="single" w:sz="6" w:space="0" w:color="C4C7C5"/>
+              <w:right w:val="single" w:sz="6" w:space="0" w:color="C4C7C5"/>
+            </w:tcBorders>
+            <w:tcMar>
+              <w:top w:w="120" w:type="dxa"/>
+              <w:left w:w="180" w:type="dxa"/>
+              <w:bottom w:w="120" w:type="dxa"/>
+              <w:right w:w="180" w:type="dxa"/>
+            </w:tcMar>
+            <w:vAlign w:val="center"/>
+            <w:hideMark/>
+          </w:tcPr>
+          <w:p>
+            <w:r>
               <w:t>Participant</w:t>
             </w:r>
           </w:p>
@@ -2108,11 +2641,10 @@
           </w:tcPr>
           <w:p>
             <w:r>
-              <w:t xml:space="preserve">200 OK - Array of active participant </w:t>
-            </w:r>
-            <w:r>
-              <w:lastRenderedPageBreak/>
-              <w:t>enrolments</w:t>
+              <w:t>200 OK - Historic result records for logged-in runne</w:t>
+            </w:r>
+            <w:r>
+              <w:t>r</w:t>
             </w:r>
           </w:p>
         </w:tc>
@@ -3374,4 +3906,16 @@
     </a:ext>
   </a:extLst>
 </a:theme>
+</file>
+
+<file path=customXml/item1.xml><?xml version="1.0" encoding="utf-8"?>
+<b:Sources xmlns:b="http://schemas.openxmlformats.org/officeDocument/2006/bibliography" xmlns="http://schemas.openxmlformats.org/officeDocument/2006/bibliography" SelectedStyle="\APASixthEditionOfficeOnline.xsl" StyleName="APA" Version="6"/>
+</file>
+
+<file path=customXml/itemProps1.xml><?xml version="1.0" encoding="utf-8"?>
+<ds:datastoreItem xmlns:ds="http://schemas.openxmlformats.org/officeDocument/2006/customXml" ds:itemID="{DDA21E80-CED4-4B98-A51C-FAD331C8C02B}">
+  <ds:schemaRefs>
+    <ds:schemaRef ds:uri="http://schemas.openxmlformats.org/officeDocument/2006/bibliography"/>
+  </ds:schemaRefs>
+</ds:datastoreItem>
 </file>
</xml_diff>